<commit_message>
Adiciona ferramentas para análise de reposição e consulta de pedidos atrasados no serviço de IA
</commit_message>
<xml_diff>
--- a/DOCUMENTOS/PROXIMOS PASSOS.docx
+++ b/DOCUMENTOS/PROXIMOS PASSOS.docx
@@ -3,944 +3,379 @@
 <w:document xmlns:wpc="http://schemas.microsoft.com/office/word/2010/wordprocessingCanvas" xmlns:cx="http://schemas.microsoft.com/office/drawing/2014/chartex" xmlns:cx1="http://schemas.microsoft.com/office/drawing/2015/9/8/chartex" xmlns:cx2="http://schemas.microsoft.com/office/drawing/2015/10/21/chartex" xmlns:cx3="http://schemas.microsoft.com/office/drawing/2016/5/9/chartex" xmlns:cx4="http://schemas.microsoft.com/office/drawing/2016/5/10/chartex" xmlns:cx5="http://schemas.microsoft.com/office/drawing/2016/5/11/chartex" xmlns:cx6="http://schemas.microsoft.com/office/drawing/2016/5/12/chartex" xmlns:cx7="http://schemas.microsoft.com/office/drawing/2016/5/13/chartex" xmlns:cx8="http://schemas.microsoft.com/office/drawing/2016/5/14/chartex" xmlns:mc="http://schemas.openxmlformats.org/markup-compatibility/2006" xmlns:aink="http://schemas.microsoft.com/office/drawing/2016/ink" xmlns:am3d="http://schemas.microsoft.com/office/drawing/2017/model3d" xmlns:o="urn:schemas-microsoft-com:office:office" xmlns:oel="http://schemas.microsoft.com/office/2019/extlst" xmlns:r="http://schemas.openxmlformats.org/officeDocument/2006/relationships" xmlns:m="http://schemas.openxmlformats.org/officeDocument/2006/math" xmlns:v="urn:schemas-microsoft-com:vml" xmlns:wp14="http://schemas.microsoft.com/office/word/2010/wordprocessingDrawing" xmlns:wp="http://schemas.openxmlformats.org/drawingml/2006/wordprocessingDrawing" xmlns:w10="urn:schemas-microsoft-com:office:word" xmlns:w="http://schemas.openxmlformats.org/wordprocessingml/2006/main" xmlns:w14="http://schemas.microsoft.com/office/word/2010/wordml" xmlns:w15="http://schemas.microsoft.com/office/word/2012/wordml" xmlns:w16cex="http://schemas.microsoft.com/office/word/2018/wordml/cex" xmlns:w16cid="http://schemas.microsoft.com/office/word/2016/wordml/cid" xmlns:w16="http://schemas.microsoft.com/office/word/2018/wordml" xmlns:w16du="http://schemas.microsoft.com/office/word/2023/wordml/word16du" xmlns:w16sdtdh="http://schemas.microsoft.com/office/word/2020/wordml/sdtdatahash" xmlns:w16sdtfl="http://schemas.microsoft.com/office/word/2024/wordml/sdtformatlock" xmlns:w16se="http://schemas.microsoft.com/office/word/2015/wordml/symex" xmlns:wpg="http://schemas.microsoft.com/office/word/2010/wordprocessingGroup" xmlns:wpi="http://schemas.microsoft.com/office/word/2010/wordprocessingInk" xmlns:wne="http://schemas.microsoft.com/office/word/2006/wordml" xmlns:wps="http://schemas.microsoft.com/office/word/2010/wordprocessingShape" mc:Ignorable="w14 w15 w16se w16cid w16 w16cex w16sdtdh w16sdtfl w16du wp14">
   <w:body>
     <w:p>
-      <w:pPr>
-        <w:numPr>
-          <w:ilvl w:val="0"/>
-          <w:numId w:val="1"/>
-        </w:numPr>
-      </w:pPr>
-      <w:r>
-        <w:rPr>
-          <w:b/>
-          <w:bCs/>
-        </w:rPr>
-        <w:t>Manter o modelo de previsão de demanda que já construímos e parar, por enquanto, de criar modelos de ML aleatoriamente.</w:t>
-      </w:r>
-      <w:r>
-        <w:t xml:space="preserve"> Nosso primeiro modelo já tem uma função empresarial clara: prever demanda. O ml_service.py usa histórico, preço e categoria para prever a demanda e depois cruza isso com estoque e custo. Não precisamos criar “um ML para cada pergunta”. Primeiro vamos classificar quais perguntas exigem cálculo simples, </w:t>
+      <w:r>
+        <w:t xml:space="preserve">Etapa 1 — Criar a camada de IA e provar a interpretação da intenção. Vamos começar com uma única ferramenta, justamente aquela que já funciona: </w:t>
       </w:r>
       <w:proofErr w:type="spellStart"/>
       <w:r>
-        <w:t>quais</w:t>
+        <w:t>analisar_</w:t>
+      </w:r>
+      <w:proofErr w:type="gramStart"/>
+      <w:r>
+        <w:t>reposicao</w:t>
       </w:r>
       <w:proofErr w:type="spellEnd"/>
       <w:r>
-        <w:t xml:space="preserve"> exigem consulta, </w:t>
+        <w:t>(</w:t>
+      </w:r>
+      <w:proofErr w:type="gramEnd"/>
+      <w:r>
+        <w:t>). A IA terá que entender frases diferentes como “Quanto compro do PROD017?”, “Preciso repor o PROD017?”, “Meu estoque do PROD017 é suficiente?” e “Qual a situação do produto PROD017?”. Todas poderão acabar chamando a mesma função.</w:t>
+      </w:r>
+    </w:p>
+    <w:p>
+      <w:r>
+        <w:t xml:space="preserve">Etapa 2 — Retirar do </w:t>
       </w:r>
       <w:proofErr w:type="spellStart"/>
       <w:r>
-        <w:t>quais</w:t>
+        <w:t>JavaScript</w:t>
       </w:r>
       <w:proofErr w:type="spellEnd"/>
       <w:r>
-        <w:t xml:space="preserve"> exigem análise e quais realmente justificam Machine Learning. </w:t>
-      </w:r>
-    </w:p>
-    <w:p>
-      <w:pPr>
-        <w:numPr>
-          <w:ilvl w:val="0"/>
-          <w:numId w:val="1"/>
-        </w:numPr>
-      </w:pPr>
-      <w:r>
-        <w:rPr>
-          <w:b/>
-          <w:bCs/>
-        </w:rPr>
-        <w:t xml:space="preserve">Criar uma camada de funções de negócio no </w:t>
+        <w:t xml:space="preserve"> a responsabilidade de interpretar português. Hoje o main.js procura PROD\</w:t>
+      </w:r>
+      <w:proofErr w:type="gramStart"/>
+      <w:r>
+        <w:t>d{</w:t>
+      </w:r>
+      <w:proofErr w:type="gramEnd"/>
+      <w:r>
+        <w:t>3}. Isso será substituído por algo muito mais simples: ele apenas envia a mensagem para /api/chat e recebe uma resposta.</w:t>
+      </w:r>
+    </w:p>
+    <w:p>
+      <w:r>
+        <w:t xml:space="preserve">Etapa 3 — Criar as funções determinísticas </w:t>
+      </w:r>
+      <w:proofErr w:type="gramStart"/>
+      <w:r>
+        <w:t>de Logística</w:t>
+      </w:r>
+      <w:proofErr w:type="gramEnd"/>
+      <w:r>
+        <w:t xml:space="preserve">. </w:t>
       </w:r>
       <w:proofErr w:type="spellStart"/>
       <w:r>
-        <w:rPr>
-          <w:b/>
-          <w:bCs/>
-        </w:rPr>
+        <w:t>listar_produtos_</w:t>
+      </w:r>
+      <w:proofErr w:type="gramStart"/>
+      <w:r>
+        <w:t>reposicao</w:t>
+      </w:r>
+      <w:proofErr w:type="spellEnd"/>
+      <w:r>
+        <w:t>(</w:t>
+      </w:r>
+      <w:proofErr w:type="gramEnd"/>
+      <w:r>
+        <w:t xml:space="preserve">), </w:t>
+      </w:r>
+      <w:proofErr w:type="spellStart"/>
+      <w:r>
+        <w:t>consultar_pedidos_</w:t>
+      </w:r>
+      <w:proofErr w:type="gramStart"/>
+      <w:r>
+        <w:t>atrasados</w:t>
+      </w:r>
+      <w:proofErr w:type="spellEnd"/>
+      <w:r>
+        <w:t>(</w:t>
+      </w:r>
+      <w:proofErr w:type="gramEnd"/>
+      <w:r>
+        <w:t xml:space="preserve">), </w:t>
+      </w:r>
+      <w:proofErr w:type="spellStart"/>
+      <w:r>
+        <w:t>produto_maior_</w:t>
+      </w:r>
+      <w:proofErr w:type="gramStart"/>
+      <w:r>
+        <w:t>risco</w:t>
+      </w:r>
+      <w:proofErr w:type="spellEnd"/>
+      <w:r>
+        <w:t>(</w:t>
+      </w:r>
+      <w:proofErr w:type="gramEnd"/>
+      <w:r>
+        <w:t xml:space="preserve">), </w:t>
+      </w:r>
+      <w:proofErr w:type="spellStart"/>
+      <w:r>
+        <w:t>produtos_baixo_</w:t>
+      </w:r>
+      <w:proofErr w:type="gramStart"/>
+      <w:r>
+        <w:t>giro</w:t>
+      </w:r>
+      <w:proofErr w:type="spellEnd"/>
+      <w:r>
+        <w:t>(</w:t>
+      </w:r>
+      <w:proofErr w:type="gramEnd"/>
+      <w:r>
+        <w:t xml:space="preserve">) e </w:t>
+      </w:r>
+      <w:proofErr w:type="spellStart"/>
+      <w:r>
+        <w:t>fornecedor_com_mais_</w:t>
+      </w:r>
+      <w:proofErr w:type="gramStart"/>
+      <w:r>
+        <w:t>atrasos</w:t>
+      </w:r>
+      <w:proofErr w:type="spellEnd"/>
+      <w:r>
+        <w:t>(</w:t>
+      </w:r>
+      <w:proofErr w:type="gramEnd"/>
+      <w:r>
+        <w:t>). Nenhuma exige novo ML.</w:t>
+      </w:r>
+    </w:p>
+    <w:p>
+      <w:r>
+        <w:t>Etapa 4 — Criar as funções financeiras. Faturamento, custos, lucro, contas a pagar, contas a receber e fluxo de caixa realizado.</w:t>
+      </w:r>
+    </w:p>
+    <w:p>
+      <w:r>
+        <w:t>Etapa 5 — Implementar “Por que o lucro caiu?”. Primeiro fazemos Python calcular as causas; depois a IA explica o resultado.</w:t>
+      </w:r>
+    </w:p>
+    <w:p>
+      <w:r>
+        <w:t>Etapa 6 — Só então treinar o segundo ML. Minha candidata continua sendo previsão de fluxo de caixa do próximo mês, porque essa pergunta realmente exige previsão futura.</w:t>
+      </w:r>
+    </w:p>
+    <w:p>
+      <w:r>
+        <w:t>Etapa 7 — Simulador. “E se a demanda aumentar 30%?”, “E se o fornecedor atrasar 10 dias?”, etc.</w:t>
+      </w:r>
+    </w:p>
+    <w:p>
+      <w:r>
+        <w:t xml:space="preserve">Etapa 8 — </w:t>
+      </w:r>
+      <w:proofErr w:type="spellStart"/>
+      <w:r>
+        <w:t>Deploy</w:t>
+      </w:r>
+      <w:proofErr w:type="spellEnd"/>
+      <w:r>
+        <w:t xml:space="preserve">. Como seu </w:t>
+      </w:r>
+      <w:proofErr w:type="spellStart"/>
+      <w:r>
+        <w:t>frontend</w:t>
+      </w:r>
+      <w:proofErr w:type="spellEnd"/>
+      <w:r>
+        <w:t xml:space="preserve"> e </w:t>
+      </w:r>
+      <w:proofErr w:type="spellStart"/>
+      <w:r>
         <w:t>backend</w:t>
       </w:r>
       <w:proofErr w:type="spellEnd"/>
       <w:r>
-        <w:rPr>
-          <w:b/>
-          <w:bCs/>
-        </w:rPr>
-        <w:t>.</w:t>
-      </w:r>
-      <w:r>
-        <w:t xml:space="preserve"> Pense no DUAXIS como uma caixa de ferramentas. Em vez de o chat conhecer CSV, Pandas, Random Forest etc., ele terá funções como </w:t>
+        <w:t xml:space="preserve"> são web, podemos publicar </w:t>
       </w:r>
       <w:proofErr w:type="spellStart"/>
       <w:r>
-        <w:t>analisar_reposicao</w:t>
+        <w:t>FastAPI</w:t>
       </w:r>
       <w:proofErr w:type="spellEnd"/>
       <w:r>
+        <w:t xml:space="preserve"> e </w:t>
+      </w:r>
+      <w:proofErr w:type="spellStart"/>
+      <w:r>
+        <w:t>frontend</w:t>
+      </w:r>
+      <w:proofErr w:type="spellEnd"/>
+      <w:r>
+        <w:t xml:space="preserve"> em serviços com camada gratuita ou de baixo custo. Não precisamos decidir o provedor agora, porque isso muda com frequência. O mais importante é manter chaves de API em variáveis de ambiente e não no código.</w:t>
+      </w:r>
+    </w:p>
+    <w:p/>
+    <w:p/>
+    <w:p/>
+    <w:p/>
+    <w:p/>
+    <w:p/>
+    <w:p/>
+    <w:p/>
+    <w:p/>
+    <w:p/>
+    <w:p/>
+    <w:p/>
+    <w:p/>
+    <w:p>
+      <w:r>
+        <w:lastRenderedPageBreak/>
+        <w:t>USUÁRIO</w:t>
+      </w:r>
+    </w:p>
+    <w:p>
+      <w:r>
+        <w:t>"Estou com pouco estoque da jaqueta preta.</w:t>
+      </w:r>
+    </w:p>
+    <w:p>
+      <w:r>
+        <w:t>Quanto devo comprar?"</w:t>
+      </w:r>
+    </w:p>
+    <w:p>
+      <w:r>
+        <w:t xml:space="preserve">        ↓</w:t>
+      </w:r>
+    </w:p>
+    <w:p>
+      <w:r>
+        <w:t>LLM / IA</w:t>
+      </w:r>
+    </w:p>
+    <w:p>
+      <w:r>
+        <w:t>entende:</w:t>
+      </w:r>
+    </w:p>
+    <w:p>
+      <w:r>
+        <w:t xml:space="preserve">- </w:t>
+      </w:r>
+      <w:proofErr w:type="gramStart"/>
+      <w:r>
+        <w:t>intenção</w:t>
+      </w:r>
+      <w:proofErr w:type="gramEnd"/>
+      <w:r>
+        <w:t xml:space="preserve"> = analisar reposição</w:t>
+      </w:r>
+    </w:p>
+    <w:p>
+      <w:r>
+        <w:t xml:space="preserve">- </w:t>
+      </w:r>
+      <w:proofErr w:type="gramStart"/>
+      <w:r>
+        <w:t>produto</w:t>
+      </w:r>
+      <w:proofErr w:type="gramEnd"/>
+      <w:r>
+        <w:t xml:space="preserve"> = jaqueta preta</w:t>
+      </w:r>
+    </w:p>
+    <w:p>
+      <w:r>
+        <w:t xml:space="preserve">        ↓</w:t>
+      </w:r>
+    </w:p>
+    <w:p>
+      <w:r>
+        <w:t>BACKEND</w:t>
+      </w:r>
+    </w:p>
+    <w:p>
+      <w:r>
+        <w:t>localiza o produto</w:t>
+      </w:r>
+    </w:p>
+    <w:p>
+      <w:r>
+        <w:t xml:space="preserve">chama </w:t>
+      </w:r>
+      <w:proofErr w:type="spellStart"/>
+      <w:r>
+        <w:t>analisar_</w:t>
+      </w:r>
+      <w:proofErr w:type="gramStart"/>
+      <w:r>
+        <w:t>reposicao</w:t>
+      </w:r>
+      <w:proofErr w:type="spellEnd"/>
+      <w:r>
         <w:t>(</w:t>
       </w:r>
-      <w:proofErr w:type="spellStart"/>
-      <w:r>
-        <w:t>produto_id</w:t>
-      </w:r>
-      <w:proofErr w:type="spellEnd"/>
-      <w:r>
-        <w:t xml:space="preserve">), </w:t>
-      </w:r>
-      <w:proofErr w:type="spellStart"/>
-      <w:r>
-        <w:t>listar_produtos_reposicao</w:t>
-      </w:r>
-      <w:proofErr w:type="spellEnd"/>
-      <w:r>
-        <w:t xml:space="preserve">(), </w:t>
-      </w:r>
-      <w:proofErr w:type="spellStart"/>
-      <w:r>
-        <w:t>calcular_lucro</w:t>
-      </w:r>
-      <w:proofErr w:type="spellEnd"/>
-      <w:r>
-        <w:t>(</w:t>
-      </w:r>
-      <w:proofErr w:type="spellStart"/>
-      <w:r>
-        <w:t>periodo</w:t>
-      </w:r>
-      <w:proofErr w:type="spellEnd"/>
-      <w:r>
-        <w:t xml:space="preserve">), </w:t>
-      </w:r>
-      <w:proofErr w:type="spellStart"/>
-      <w:r>
-        <w:t>analisar_variacao_lucro</w:t>
-      </w:r>
-      <w:proofErr w:type="spellEnd"/>
-      <w:r>
-        <w:t>(</w:t>
-      </w:r>
-      <w:proofErr w:type="spellStart"/>
-      <w:r>
-        <w:t>periodo</w:t>
-      </w:r>
-      <w:proofErr w:type="spellEnd"/>
-      <w:r>
-        <w:t xml:space="preserve">), </w:t>
-      </w:r>
-      <w:proofErr w:type="spellStart"/>
-      <w:r>
-        <w:t>consultar_pedidos_atrasados</w:t>
-      </w:r>
-      <w:proofErr w:type="spellEnd"/>
-      <w:r>
-        <w:t xml:space="preserve">(), </w:t>
-      </w:r>
-      <w:proofErr w:type="spellStart"/>
-      <w:r>
-        <w:t>prever_fluxo_caixa</w:t>
-      </w:r>
-      <w:proofErr w:type="spellEnd"/>
-      <w:r>
-        <w:t xml:space="preserve">() e outras. A IA, futuramente, escolherá qual ferramenta chamar. </w:t>
-      </w:r>
-    </w:p>
-    <w:p>
-      <w:pPr>
-        <w:numPr>
-          <w:ilvl w:val="0"/>
-          <w:numId w:val="1"/>
-        </w:numPr>
-      </w:pPr>
-      <w:r>
-        <w:rPr>
-          <w:b/>
-          <w:bCs/>
-        </w:rPr>
-        <w:t>Separar as perguntas por tipo.</w:t>
-      </w:r>
-      <w:r>
-        <w:t xml:space="preserve"> Isso evita treinar ML onde não é necessário. Para os seus exemplos, eu faria assim:</w:t>
-      </w:r>
-    </w:p>
-    <w:tbl>
-      <w:tblPr>
-        <w:tblW w:w="0" w:type="auto"/>
-        <w:tblCellSpacing w:w="15" w:type="dxa"/>
-        <w:tblBorders>
-          <w:top w:val="single" w:sz="4" w:space="0" w:color="auto"/>
-          <w:left w:val="single" w:sz="4" w:space="0" w:color="auto"/>
-          <w:bottom w:val="single" w:sz="4" w:space="0" w:color="auto"/>
-          <w:right w:val="single" w:sz="4" w:space="0" w:color="auto"/>
-          <w:insideH w:val="single" w:sz="4" w:space="0" w:color="auto"/>
-          <w:insideV w:val="single" w:sz="4" w:space="0" w:color="auto"/>
-        </w:tblBorders>
-        <w:tblCellMar>
-          <w:top w:w="15" w:type="dxa"/>
-          <w:left w:w="15" w:type="dxa"/>
-          <w:bottom w:w="15" w:type="dxa"/>
-          <w:right w:w="15" w:type="dxa"/>
-        </w:tblCellMar>
-        <w:tblLook w:val="04A0" w:firstRow="1" w:lastRow="0" w:firstColumn="1" w:lastColumn="0" w:noHBand="0" w:noVBand="1"/>
-      </w:tblPr>
-      <w:tblGrid>
-        <w:gridCol w:w="2601"/>
-        <w:gridCol w:w="4158"/>
-        <w:gridCol w:w="1735"/>
-      </w:tblGrid>
-      <w:tr>
-        <w:trPr>
-          <w:tblHeader/>
-          <w:tblCellSpacing w:w="15" w:type="dxa"/>
-        </w:trPr>
-        <w:tc>
-          <w:tcPr>
-            <w:tcW w:w="0" w:type="auto"/>
-            <w:vAlign w:val="center"/>
-            <w:hideMark/>
-          </w:tcPr>
-          <w:p>
-            <w:pPr>
-              <w:rPr>
-                <w:b/>
-                <w:bCs/>
-              </w:rPr>
-            </w:pPr>
-            <w:r>
-              <w:rPr>
-                <w:b/>
-                <w:bCs/>
-              </w:rPr>
-              <w:t>Pergunta</w:t>
-            </w:r>
-          </w:p>
-        </w:tc>
-        <w:tc>
-          <w:tcPr>
-            <w:tcW w:w="0" w:type="auto"/>
-            <w:vAlign w:val="center"/>
-            <w:hideMark/>
-          </w:tcPr>
-          <w:p>
-            <w:pPr>
-              <w:rPr>
-                <w:b/>
-                <w:bCs/>
-              </w:rPr>
-            </w:pPr>
-            <w:r>
-              <w:rPr>
-                <w:b/>
-                <w:bCs/>
-              </w:rPr>
-              <w:t>Como responder</w:t>
-            </w:r>
-          </w:p>
-        </w:tc>
-        <w:tc>
-          <w:tcPr>
-            <w:tcW w:w="0" w:type="auto"/>
-            <w:vAlign w:val="center"/>
-            <w:hideMark/>
-          </w:tcPr>
-          <w:p>
-            <w:pPr>
-              <w:rPr>
-                <w:b/>
-                <w:bCs/>
-              </w:rPr>
-            </w:pPr>
-            <w:r>
-              <w:rPr>
-                <w:b/>
-                <w:bCs/>
-              </w:rPr>
-              <w:t>Novo ML?</w:t>
-            </w:r>
-          </w:p>
-        </w:tc>
-      </w:tr>
-      <w:tr>
-        <w:trPr>
-          <w:tblCellSpacing w:w="15" w:type="dxa"/>
-        </w:trPr>
-        <w:tc>
-          <w:tcPr>
-            <w:tcW w:w="0" w:type="auto"/>
-            <w:vAlign w:val="center"/>
-            <w:hideMark/>
-          </w:tcPr>
-          <w:p>
-            <w:r>
-              <w:t>“Quanto devo comprar do PROD017?”</w:t>
-            </w:r>
-          </w:p>
-        </w:tc>
-        <w:tc>
-          <w:tcPr>
-            <w:tcW w:w="0" w:type="auto"/>
-            <w:vAlign w:val="center"/>
-            <w:hideMark/>
-          </w:tcPr>
-          <w:p>
-            <w:r>
-              <w:t>Previsão de demanda + regra de estoque + custo</w:t>
-            </w:r>
-          </w:p>
-        </w:tc>
-        <w:tc>
-          <w:tcPr>
-            <w:tcW w:w="0" w:type="auto"/>
-            <w:vAlign w:val="center"/>
-            <w:hideMark/>
-          </w:tcPr>
-          <w:p>
-            <w:r>
-              <w:rPr>
-                <w:b/>
-                <w:bCs/>
-              </w:rPr>
-              <w:t>Já temos</w:t>
-            </w:r>
-          </w:p>
-        </w:tc>
-      </w:tr>
-      <w:tr>
-        <w:trPr>
-          <w:tblCellSpacing w:w="15" w:type="dxa"/>
-        </w:trPr>
-        <w:tc>
-          <w:tcPr>
-            <w:tcW w:w="0" w:type="auto"/>
-            <w:vAlign w:val="center"/>
-            <w:hideMark/>
-          </w:tcPr>
-          <w:p>
-            <w:r>
-              <w:t>“Quais produtos precisam de reposição?”</w:t>
-            </w:r>
-          </w:p>
-        </w:tc>
-        <w:tc>
-          <w:tcPr>
-            <w:tcW w:w="0" w:type="auto"/>
-            <w:vAlign w:val="center"/>
-            <w:hideMark/>
-          </w:tcPr>
-          <w:p>
-            <w:r>
-              <w:t>Aplicar nosso modelo aos 80 produtos + regra de estoque</w:t>
-            </w:r>
-          </w:p>
-        </w:tc>
-        <w:tc>
-          <w:tcPr>
-            <w:tcW w:w="0" w:type="auto"/>
-            <w:vAlign w:val="center"/>
-            <w:hideMark/>
-          </w:tcPr>
-          <w:p>
-            <w:r>
-              <w:rPr>
-                <w:b/>
-                <w:bCs/>
-              </w:rPr>
-              <w:t>Não</w:t>
-            </w:r>
-          </w:p>
-        </w:tc>
-      </w:tr>
-      <w:tr>
-        <w:trPr>
-          <w:tblCellSpacing w:w="15" w:type="dxa"/>
-        </w:trPr>
-        <w:tc>
-          <w:tcPr>
-            <w:tcW w:w="0" w:type="auto"/>
-            <w:vAlign w:val="center"/>
-            <w:hideMark/>
-          </w:tcPr>
-          <w:p>
-            <w:r>
-              <w:t>“Quais pedidos estão atrasados?”</w:t>
-            </w:r>
-          </w:p>
-        </w:tc>
-        <w:tc>
-          <w:tcPr>
-            <w:tcW w:w="0" w:type="auto"/>
-            <w:vAlign w:val="center"/>
-            <w:hideMark/>
-          </w:tcPr>
-          <w:p>
-            <w:r>
-              <w:t>Consultar compra/pedido cuja entrega prevista passou e ainda não foi concluída</w:t>
-            </w:r>
-          </w:p>
-        </w:tc>
-        <w:tc>
-          <w:tcPr>
-            <w:tcW w:w="0" w:type="auto"/>
-            <w:vAlign w:val="center"/>
-            <w:hideMark/>
-          </w:tcPr>
-          <w:p>
-            <w:r>
-              <w:rPr>
-                <w:b/>
-                <w:bCs/>
-              </w:rPr>
-              <w:t>Não</w:t>
-            </w:r>
-          </w:p>
-        </w:tc>
-      </w:tr>
-      <w:tr>
-        <w:trPr>
-          <w:tblCellSpacing w:w="15" w:type="dxa"/>
-        </w:trPr>
-        <w:tc>
-          <w:tcPr>
-            <w:tcW w:w="0" w:type="auto"/>
-            <w:vAlign w:val="center"/>
-            <w:hideMark/>
-          </w:tcPr>
-          <w:p>
-            <w:r>
-              <w:t>“Qual fornecedor mais atrasou?”</w:t>
-            </w:r>
-          </w:p>
-        </w:tc>
-        <w:tc>
-          <w:tcPr>
-            <w:tcW w:w="0" w:type="auto"/>
-            <w:vAlign w:val="center"/>
-            <w:hideMark/>
-          </w:tcPr>
-          <w:p>
-            <w:r>
-              <w:t>Agrupar atrasos por fornecedor</w:t>
-            </w:r>
-          </w:p>
-        </w:tc>
-        <w:tc>
-          <w:tcPr>
-            <w:tcW w:w="0" w:type="auto"/>
-            <w:vAlign w:val="center"/>
-            <w:hideMark/>
-          </w:tcPr>
-          <w:p>
-            <w:r>
-              <w:rPr>
-                <w:b/>
-                <w:bCs/>
-              </w:rPr>
-              <w:t>Não</w:t>
-            </w:r>
-          </w:p>
-        </w:tc>
-      </w:tr>
-      <w:tr>
-        <w:trPr>
-          <w:tblCellSpacing w:w="15" w:type="dxa"/>
-        </w:trPr>
-        <w:tc>
-          <w:tcPr>
-            <w:tcW w:w="0" w:type="auto"/>
-            <w:vAlign w:val="center"/>
-            <w:hideMark/>
-          </w:tcPr>
-          <w:p>
-            <w:r>
-              <w:t>“Quanto vendemos este mês?”</w:t>
-            </w:r>
-          </w:p>
-        </w:tc>
-        <w:tc>
-          <w:tcPr>
-            <w:tcW w:w="0" w:type="auto"/>
-            <w:vAlign w:val="center"/>
-            <w:hideMark/>
-          </w:tcPr>
-          <w:p>
-            <w:r>
-              <w:t>Consulta/agregação dos dados</w:t>
-            </w:r>
-          </w:p>
-        </w:tc>
-        <w:tc>
-          <w:tcPr>
-            <w:tcW w:w="0" w:type="auto"/>
-            <w:vAlign w:val="center"/>
-            <w:hideMark/>
-          </w:tcPr>
-          <w:p>
-            <w:r>
-              <w:rPr>
-                <w:b/>
-                <w:bCs/>
-              </w:rPr>
-              <w:t>Não</w:t>
-            </w:r>
-          </w:p>
-        </w:tc>
-      </w:tr>
-      <w:tr>
-        <w:trPr>
-          <w:tblCellSpacing w:w="15" w:type="dxa"/>
-        </w:trPr>
-        <w:tc>
-          <w:tcPr>
-            <w:tcW w:w="0" w:type="auto"/>
-            <w:vAlign w:val="center"/>
-            <w:hideMark/>
-          </w:tcPr>
-          <w:p>
-            <w:r>
-              <w:t>“Qual produto vendeu mais?”</w:t>
-            </w:r>
-          </w:p>
-        </w:tc>
-        <w:tc>
-          <w:tcPr>
-            <w:tcW w:w="0" w:type="auto"/>
-            <w:vAlign w:val="center"/>
-            <w:hideMark/>
-          </w:tcPr>
-          <w:p>
-            <w:r>
-              <w:t>Consulta/agregação</w:t>
-            </w:r>
-          </w:p>
-        </w:tc>
-        <w:tc>
-          <w:tcPr>
-            <w:tcW w:w="0" w:type="auto"/>
-            <w:vAlign w:val="center"/>
-            <w:hideMark/>
-          </w:tcPr>
-          <w:p>
-            <w:r>
-              <w:rPr>
-                <w:b/>
-                <w:bCs/>
-              </w:rPr>
-              <w:t>Não</w:t>
-            </w:r>
-          </w:p>
-        </w:tc>
-      </w:tr>
-      <w:tr>
-        <w:trPr>
-          <w:tblCellSpacing w:w="15" w:type="dxa"/>
-        </w:trPr>
-        <w:tc>
-          <w:tcPr>
-            <w:tcW w:w="0" w:type="auto"/>
-            <w:vAlign w:val="center"/>
-            <w:hideMark/>
-          </w:tcPr>
-          <w:p>
-            <w:r>
-              <w:t>“Por que o lucro caiu?”</w:t>
-            </w:r>
-          </w:p>
-        </w:tc>
-        <w:tc>
-          <w:tcPr>
-            <w:tcW w:w="0" w:type="auto"/>
-            <w:vAlign w:val="center"/>
-            <w:hideMark/>
-          </w:tcPr>
-          <w:p>
-            <w:r>
-              <w:t>Decomposição de receita, custos, volume, margem, fornecedores etc.</w:t>
-            </w:r>
-          </w:p>
-        </w:tc>
-        <w:tc>
-          <w:tcPr>
-            <w:tcW w:w="0" w:type="auto"/>
-            <w:vAlign w:val="center"/>
-            <w:hideMark/>
-          </w:tcPr>
-          <w:p>
-            <w:r>
-              <w:rPr>
-                <w:b/>
-                <w:bCs/>
-              </w:rPr>
-              <w:t>Inicialmente não</w:t>
-            </w:r>
-          </w:p>
-        </w:tc>
-      </w:tr>
-      <w:tr>
-        <w:trPr>
-          <w:tblCellSpacing w:w="15" w:type="dxa"/>
-        </w:trPr>
-        <w:tc>
-          <w:tcPr>
-            <w:tcW w:w="0" w:type="auto"/>
-            <w:vAlign w:val="center"/>
-            <w:hideMark/>
-          </w:tcPr>
-          <w:p>
-            <w:r>
-              <w:t>“Qual o fluxo de caixa previsto para o próximo mês?”</w:t>
-            </w:r>
-          </w:p>
-        </w:tc>
-        <w:tc>
-          <w:tcPr>
-            <w:tcW w:w="0" w:type="auto"/>
-            <w:vAlign w:val="center"/>
-            <w:hideMark/>
-          </w:tcPr>
-          <w:p>
-            <w:r>
-              <w:t>Previsão temporal de entradas e saídas</w:t>
-            </w:r>
-          </w:p>
-        </w:tc>
-        <w:tc>
-          <w:tcPr>
-            <w:tcW w:w="0" w:type="auto"/>
-            <w:vAlign w:val="center"/>
-            <w:hideMark/>
-          </w:tcPr>
-          <w:p>
-            <w:r>
-              <w:rPr>
-                <w:b/>
-                <w:bCs/>
-              </w:rPr>
-              <w:t>Provavelmente sim</w:t>
-            </w:r>
-          </w:p>
-        </w:tc>
-      </w:tr>
-      <w:tr>
-        <w:trPr>
-          <w:tblCellSpacing w:w="15" w:type="dxa"/>
-        </w:trPr>
-        <w:tc>
-          <w:tcPr>
-            <w:tcW w:w="0" w:type="auto"/>
-            <w:vAlign w:val="center"/>
-            <w:hideMark/>
-          </w:tcPr>
-          <w:p>
-            <w:r>
-              <w:t>“Qual produto tem maior risco de ruptura?”</w:t>
-            </w:r>
-          </w:p>
-        </w:tc>
-        <w:tc>
-          <w:tcPr>
-            <w:tcW w:w="0" w:type="auto"/>
-            <w:vAlign w:val="center"/>
-            <w:hideMark/>
-          </w:tcPr>
-          <w:p>
-            <w:r>
-              <w:t>Previsão de demanda + estoque + lead time</w:t>
-            </w:r>
-          </w:p>
-        </w:tc>
-        <w:tc>
-          <w:tcPr>
-            <w:tcW w:w="0" w:type="auto"/>
-            <w:vAlign w:val="center"/>
-            <w:hideMark/>
-          </w:tcPr>
-          <w:p>
-            <w:r>
-              <w:rPr>
-                <w:b/>
-                <w:bCs/>
-              </w:rPr>
-              <w:t>Não</w:t>
-            </w:r>
-          </w:p>
-        </w:tc>
-      </w:tr>
-      <w:tr>
-        <w:trPr>
-          <w:tblCellSpacing w:w="15" w:type="dxa"/>
-        </w:trPr>
-        <w:tc>
-          <w:tcPr>
-            <w:tcW w:w="0" w:type="auto"/>
-            <w:vAlign w:val="center"/>
-            <w:hideMark/>
-          </w:tcPr>
-          <w:p>
-            <w:r>
-              <w:lastRenderedPageBreak/>
-              <w:t>“Quanto vai custar a reposição necessária?”</w:t>
-            </w:r>
-          </w:p>
-        </w:tc>
-        <w:tc>
-          <w:tcPr>
-            <w:tcW w:w="0" w:type="auto"/>
-            <w:vAlign w:val="center"/>
-            <w:hideMark/>
-          </w:tcPr>
-          <w:p>
-            <w:r>
-              <w:t>Quantidade recomendada × custo</w:t>
-            </w:r>
-          </w:p>
-        </w:tc>
-        <w:tc>
-          <w:tcPr>
-            <w:tcW w:w="0" w:type="auto"/>
-            <w:vAlign w:val="center"/>
-            <w:hideMark/>
-          </w:tcPr>
-          <w:p>
-            <w:r>
-              <w:rPr>
-                <w:b/>
-                <w:bCs/>
-              </w:rPr>
-              <w:t>Não</w:t>
-            </w:r>
-          </w:p>
-        </w:tc>
-      </w:tr>
-      <w:tr>
-        <w:trPr>
-          <w:tblCellSpacing w:w="15" w:type="dxa"/>
-        </w:trPr>
-        <w:tc>
-          <w:tcPr>
-            <w:tcW w:w="0" w:type="auto"/>
-            <w:vAlign w:val="center"/>
-            <w:hideMark/>
-          </w:tcPr>
-          <w:p>
-            <w:r>
-              <w:t>“Quais produtos estão parados?”</w:t>
-            </w:r>
-          </w:p>
-        </w:tc>
-        <w:tc>
-          <w:tcPr>
-            <w:tcW w:w="0" w:type="auto"/>
-            <w:vAlign w:val="center"/>
-            <w:hideMark/>
-          </w:tcPr>
-          <w:p>
-            <w:r>
-              <w:t>Giro/última movimentação/estoque</w:t>
-            </w:r>
-          </w:p>
-        </w:tc>
-        <w:tc>
-          <w:tcPr>
-            <w:tcW w:w="0" w:type="auto"/>
-            <w:vAlign w:val="center"/>
-            <w:hideMark/>
-          </w:tcPr>
-          <w:p>
-            <w:r>
-              <w:rPr>
-                <w:b/>
-                <w:bCs/>
-              </w:rPr>
-              <w:t>Não</w:t>
-            </w:r>
-          </w:p>
-        </w:tc>
-      </w:tr>
-    </w:tbl>
-    <w:p>
-      <w:r>
-        <w:t xml:space="preserve">Essa tabela é importantíssima: </w:t>
-      </w:r>
-      <w:r>
-        <w:rPr>
-          <w:b/>
-          <w:bCs/>
-        </w:rPr>
-        <w:t>a maior parte do valor do DUAXIS não depende de treinar dezenas de modelos.</w:t>
-      </w:r>
-    </w:p>
-    <w:p>
-      <w:pPr>
-        <w:numPr>
-          <w:ilvl w:val="0"/>
-          <w:numId w:val="2"/>
-        </w:numPr>
-      </w:pPr>
-      <w:r>
-        <w:rPr>
-          <w:b/>
-          <w:bCs/>
-        </w:rPr>
-        <w:t>Nosso próximo desenvolvimento deve ser “Quais produtos precisam de reposição?”.</w:t>
-      </w:r>
-      <w:r>
-        <w:t xml:space="preserve"> Essa é a evolução natural do que acabamos de construir. Ou seja, </w:t>
-      </w:r>
-      <w:r>
-        <w:rPr>
-          <w:b/>
-          <w:bCs/>
-        </w:rPr>
-        <w:t>reutilizamos o ML existente</w:t>
-      </w:r>
-      <w:r>
-        <w:t>. Não treinamos outro.</w:t>
-      </w:r>
-    </w:p>
-    <w:p>
-      <w:pPr>
-        <w:numPr>
-          <w:ilvl w:val="0"/>
-          <w:numId w:val="2"/>
-        </w:numPr>
-      </w:pPr>
-      <w:r>
-        <w:rPr>
-          <w:b/>
-          <w:bCs/>
-        </w:rPr>
-        <w:t>Depois implementaremos consultas logísticas determinísticas.</w:t>
-      </w:r>
-      <w:r>
-        <w:t xml:space="preserve"> Por exemplo, “Quais pedidos estão atrasados?” não precisa de inteligência artificial para descobrir o resultado. Se temos </w:t>
-      </w:r>
-      <w:proofErr w:type="spellStart"/>
-      <w:r>
-        <w:t>data_prevista_entrega</w:t>
-      </w:r>
-      <w:proofErr w:type="spellEnd"/>
-      <w:r>
-        <w:t xml:space="preserve">, </w:t>
-      </w:r>
-      <w:proofErr w:type="spellStart"/>
-      <w:r>
-        <w:t>data_entrega</w:t>
-      </w:r>
-      <w:proofErr w:type="spellEnd"/>
-      <w:r>
-        <w:t xml:space="preserve"> e status, o Python consegue consultar diretamente. A IA só terá que entender que a pessoa quer uma “consulta de atrasos” e chamar a função correta. </w:t>
-      </w:r>
-    </w:p>
-    <w:p>
-      <w:pPr>
-        <w:numPr>
-          <w:ilvl w:val="0"/>
-          <w:numId w:val="2"/>
-        </w:numPr>
-      </w:pPr>
-      <w:r>
-        <w:rPr>
-          <w:b/>
-          <w:bCs/>
-        </w:rPr>
-        <w:t>Depois criaremos as consultas financeiras básicas.</w:t>
-      </w:r>
-      <w:r>
-        <w:t xml:space="preserve"> Antes de tentar “Por que o lucro caiu?”, precisamos ter funções confiáveis como faturamento por período, custos por período, lucro por período, contas a pagar, contas a receber e fluxo de caixa realizado. Se esses blocos não estiverem sólidos, uma IA generativa poderá produzir uma explicação elegante sobre números calculados de maneira errada. </w:t>
-      </w:r>
-    </w:p>
-    <w:p>
-      <w:pPr>
-        <w:numPr>
-          <w:ilvl w:val="0"/>
-          <w:numId w:val="2"/>
-        </w:numPr>
-      </w:pPr>
-      <w:r>
-        <w:rPr>
-          <w:b/>
-          <w:bCs/>
-        </w:rPr>
-        <w:t>Em seguida construiremos “Por que o lucro caiu?” como análise, não necessariamente como ML.</w:t>
-      </w:r>
-    </w:p>
-    <w:p>
-      <w:pPr>
-        <w:numPr>
-          <w:ilvl w:val="0"/>
-          <w:numId w:val="2"/>
-        </w:numPr>
-      </w:pPr>
-      <w:r>
-        <w:t xml:space="preserve">Só então eu treinaria o segundo modelo de ML: previsão de fluxo de caixa. Essa pergunta realmente envolve futuro: </w:t>
-      </w:r>
-    </w:p>
-    <w:p>
-      <w:pPr>
-        <w:ind w:left="720"/>
-      </w:pPr>
-      <w:r>
-        <w:t>“Qual o fluxo de caixa previsto para o próximo mês?”</w:t>
-      </w:r>
-    </w:p>
-    <w:p>
-      <w:pPr>
-        <w:ind w:left="720"/>
-      </w:pPr>
-      <w:r>
-        <w:t>Aí faz sentido trabalhar com histórico de entradas e saídas, sazonalidade, contas a receber, contas a pagar etc. Podemos avaliar baseline, modelo 1, modelo 2, exatamente como fizemos na previsão de demanda.</w:t>
-      </w:r>
-    </w:p>
-    <w:p>
-      <w:pPr>
-        <w:ind w:left="720"/>
-      </w:pPr>
-      <w:r>
-        <w:t>Esse provavelmente é o segundo modelo de ML que vale o esforço.</w:t>
-      </w:r>
-    </w:p>
-    <w:p>
-      <w:pPr>
-        <w:numPr>
-          <w:ilvl w:val="0"/>
-          <w:numId w:val="2"/>
-        </w:numPr>
-      </w:pPr>
-      <w:r>
-        <w:rPr>
-          <w:b/>
-          <w:bCs/>
-        </w:rPr>
-        <w:t>Depois entra a IA generativa como orquestradora do Copiloto.</w:t>
-      </w:r>
-      <w:r>
-        <w:t xml:space="preserve"> </w:t>
-      </w:r>
-    </w:p>
-    <w:p>
-      <w:pPr>
-        <w:numPr>
-          <w:ilvl w:val="0"/>
-          <w:numId w:val="2"/>
-        </w:numPr>
-      </w:pPr>
-      <w:r>
-        <w:t xml:space="preserve">A IA não deve calcular números importantes sozinha. </w:t>
-      </w:r>
-    </w:p>
-    <w:p>
-      <w:pPr>
-        <w:numPr>
-          <w:ilvl w:val="0"/>
-          <w:numId w:val="2"/>
-        </w:numPr>
-      </w:pPr>
-      <w:r>
-        <w:rPr>
-          <w:b/>
-          <w:bCs/>
-        </w:rPr>
-        <w:t>Enquanto você ainda não aprendeu IA generativa, podemos desenvolver todo o “cérebro de dados” do DUAXIS.</w:t>
-      </w:r>
-      <w:r>
-        <w:t xml:space="preserve"> Isso significa que não precisamos esperar seu curso. Vamos construir as funções que a IA futuramente chamará. Quando chegar o momento de integrar o LLM, teremos uma caixa de ferramentas pronta e testada.</w:t>
+      <w:proofErr w:type="gramEnd"/>
+      <w:r>
+        <w:t>)</w:t>
+      </w:r>
+    </w:p>
+    <w:p>
+      <w:r>
+        <w:t xml:space="preserve">        ↓</w:t>
+      </w:r>
+    </w:p>
+    <w:p>
+      <w:r>
+        <w:t>MACHINE LEARNING</w:t>
+      </w:r>
+    </w:p>
+    <w:p>
+      <w:r>
+        <w:t>prevê demanda</w:t>
+      </w:r>
+    </w:p>
+    <w:p>
+      <w:r>
+        <w:t xml:space="preserve">        ↓</w:t>
+      </w:r>
+    </w:p>
+    <w:p>
+      <w:r>
+        <w:t>REGRAS DE NEGÓCIO</w:t>
+      </w:r>
+    </w:p>
+    <w:p>
+      <w:r>
+        <w:t>estoque</w:t>
+      </w:r>
+    </w:p>
+    <w:p>
+      <w:r>
+        <w:t>lead time</w:t>
+      </w:r>
+    </w:p>
+    <w:p>
+      <w:r>
+        <w:t>quantidade recomendada</w:t>
+      </w:r>
+    </w:p>
+    <w:p>
+      <w:r>
+        <w:t>impacto financeiro</w:t>
+      </w:r>
+    </w:p>
+    <w:p>
+      <w:r>
+        <w:t xml:space="preserve">        ↓</w:t>
+      </w:r>
+    </w:p>
+    <w:p>
+      <w:r>
+        <w:t>LLM / IA</w:t>
+      </w:r>
+    </w:p>
+    <w:p>
+      <w:r>
+        <w:t>transforma o resultado em resposta natural</w:t>
+      </w:r>
+    </w:p>
+    <w:p>
+      <w:r>
+        <w:t xml:space="preserve">        ↓</w:t>
+      </w:r>
+    </w:p>
+    <w:p>
+      <w:r>
+        <w:t>CHAT DUAXIS</w:t>
       </w:r>
     </w:p>
     <w:sectPr>

</xml_diff>

<commit_message>
Adiciona lógica para listar produtos com maior risco de ruptura, incluindo nova função no serviço de logística e integração no frontend para exibição das informações.
</commit_message>
<xml_diff>
--- a/DOCUMENTOS/PROXIMOS PASSOS.docx
+++ b/DOCUMENTOS/PROXIMOS PASSOS.docx
@@ -4,202 +4,222 @@
   <w:body>
     <w:p>
       <w:r>
+        <w:rPr>
+          <w:highlight w:val="yellow"/>
+        </w:rPr>
         <w:t xml:space="preserve">Etapa 1 — Criar a camada de IA e provar a interpretação da intenção. Vamos começar com uma única ferramenta, justamente aquela que já funciona: </w:t>
       </w:r>
       <w:proofErr w:type="spellStart"/>
       <w:r>
-        <w:t>analisar_</w:t>
-      </w:r>
-      <w:proofErr w:type="gramStart"/>
-      <w:r>
-        <w:t>reposicao</w:t>
+        <w:rPr>
+          <w:highlight w:val="yellow"/>
+        </w:rPr>
+        <w:t>analisar_reposicao</w:t>
       </w:r>
       <w:proofErr w:type="spellEnd"/>
       <w:r>
-        <w:t>(</w:t>
-      </w:r>
-      <w:proofErr w:type="gramEnd"/>
-      <w:r>
-        <w:t>). A IA terá que entender frases diferentes como “Quanto compro do PROD017?”, “Preciso repor o PROD017?”, “Meu estoque do PROD017 é suficiente?” e “Qual a situação do produto PROD017?”. Todas poderão acabar chamando a mesma função.</w:t>
-      </w:r>
-    </w:p>
-    <w:p>
-      <w:r>
+        <w:rPr>
+          <w:highlight w:val="yellow"/>
+        </w:rPr>
+        <w:t>(). A IA terá que entender frases diferentes como “Quanto compro do PROD017?”, “Preciso repor o PROD017?”, “Meu estoque do PROD017 é suficiente?” e “Qual a situação do produto PROD017?”. Todas poderão acabar chamando a mesma função.</w:t>
+      </w:r>
+      <w:r>
+        <w:rPr>
+          <w:highlight w:val="yellow"/>
+        </w:rPr>
+        <w:t xml:space="preserve"> FEITO</w:t>
+      </w:r>
+    </w:p>
+    <w:p>
+      <w:pPr>
+        <w:rPr>
+          <w:highlight w:val="yellow"/>
+        </w:rPr>
+      </w:pPr>
+      <w:r>
+        <w:rPr>
+          <w:highlight w:val="yellow"/>
+        </w:rPr>
         <w:t xml:space="preserve">Etapa 2 — Retirar do </w:t>
       </w:r>
       <w:proofErr w:type="spellStart"/>
       <w:r>
+        <w:rPr>
+          <w:highlight w:val="yellow"/>
+        </w:rPr>
         <w:t>JavaScript</w:t>
       </w:r>
       <w:proofErr w:type="spellEnd"/>
       <w:r>
-        <w:t xml:space="preserve"> a responsabilidade de interpretar português. Hoje o main.js procura PROD\</w:t>
-      </w:r>
-      <w:proofErr w:type="gramStart"/>
-      <w:r>
-        <w:t>d{</w:t>
-      </w:r>
-      <w:proofErr w:type="gramEnd"/>
-      <w:r>
-        <w:t>3}. Isso será substituído por algo muito mais simples: ele apenas envia a mensagem para /api/chat e recebe uma resposta.</w:t>
-      </w:r>
-    </w:p>
-    <w:p>
-      <w:r>
-        <w:t xml:space="preserve">Etapa 3 — Criar as funções determinísticas </w:t>
-      </w:r>
-      <w:proofErr w:type="gramStart"/>
-      <w:r>
-        <w:t>de Logística</w:t>
-      </w:r>
-      <w:proofErr w:type="gramEnd"/>
-      <w:r>
-        <w:t xml:space="preserve">. </w:t>
+        <w:rPr>
+          <w:highlight w:val="yellow"/>
+        </w:rPr>
+        <w:t xml:space="preserve"> a responsabilidade de interpretar português. Hoje o main.js procura PROD\d{3}. Isso será substituído por algo muito mais simples: ele apenas envia a mensagem para /api/chat e recebe uma resposta.</w:t>
+      </w:r>
+      <w:r>
+        <w:rPr>
+          <w:highlight w:val="yellow"/>
+        </w:rPr>
+        <w:t xml:space="preserve"> FEITO</w:t>
+      </w:r>
+    </w:p>
+    <w:p>
+      <w:r>
+        <w:t xml:space="preserve">Etapa 3 — Criar as funções determinísticas de Logística. </w:t>
       </w:r>
       <w:proofErr w:type="spellStart"/>
       <w:r>
-        <w:t>listar_produtos_</w:t>
-      </w:r>
-      <w:proofErr w:type="gramStart"/>
-      <w:r>
-        <w:t>reposicao</w:t>
+        <w:t>listar_produtos_reposicao</w:t>
       </w:r>
       <w:proofErr w:type="spellEnd"/>
       <w:r>
-        <w:t>(</w:t>
-      </w:r>
-      <w:proofErr w:type="gramEnd"/>
-      <w:r>
-        <w:t xml:space="preserve">), </w:t>
+        <w:t xml:space="preserve">(), </w:t>
       </w:r>
       <w:proofErr w:type="spellStart"/>
       <w:r>
-        <w:t>consultar_pedidos_</w:t>
-      </w:r>
-      <w:proofErr w:type="gramStart"/>
-      <w:r>
-        <w:t>atrasados</w:t>
+        <w:t>consultar_pedidos_atrasados</w:t>
       </w:r>
       <w:proofErr w:type="spellEnd"/>
       <w:r>
-        <w:t>(</w:t>
-      </w:r>
-      <w:proofErr w:type="gramEnd"/>
-      <w:r>
-        <w:t xml:space="preserve">), </w:t>
+        <w:t xml:space="preserve">(), </w:t>
       </w:r>
       <w:proofErr w:type="spellStart"/>
       <w:r>
-        <w:t>produto_maior_</w:t>
-      </w:r>
-      <w:proofErr w:type="gramStart"/>
-      <w:r>
-        <w:t>risco</w:t>
+        <w:t>produto_maior_risco</w:t>
       </w:r>
       <w:proofErr w:type="spellEnd"/>
       <w:r>
-        <w:t>(</w:t>
-      </w:r>
-      <w:proofErr w:type="gramEnd"/>
-      <w:r>
-        <w:t xml:space="preserve">), </w:t>
+        <w:t xml:space="preserve">(), </w:t>
       </w:r>
       <w:proofErr w:type="spellStart"/>
       <w:r>
-        <w:t>produtos_baixo_</w:t>
-      </w:r>
-      <w:proofErr w:type="gramStart"/>
-      <w:r>
-        <w:t>giro</w:t>
+        <w:t>produtos_baixo_giro</w:t>
       </w:r>
       <w:proofErr w:type="spellEnd"/>
       <w:r>
-        <w:t>(</w:t>
-      </w:r>
-      <w:proofErr w:type="gramEnd"/>
-      <w:r>
-        <w:t xml:space="preserve">) e </w:t>
+        <w:t xml:space="preserve">() e </w:t>
       </w:r>
       <w:proofErr w:type="spellStart"/>
       <w:r>
-        <w:t>fornecedor_com_mais_</w:t>
-      </w:r>
-      <w:proofErr w:type="gramStart"/>
-      <w:r>
-        <w:t>atrasos</w:t>
+        <w:t>fornecedor_com_mais_atrasos</w:t>
       </w:r>
       <w:proofErr w:type="spellEnd"/>
       <w:r>
-        <w:t>(</w:t>
-      </w:r>
-      <w:proofErr w:type="gramEnd"/>
-      <w:r>
-        <w:t>). Nenhuma exige novo ML.</w:t>
-      </w:r>
-    </w:p>
-    <w:p>
-      <w:r>
-        <w:t>Etapa 4 — Criar as funções financeiras. Faturamento, custos, lucro, contas a pagar, contas a receber e fluxo de caixa realizado.</w:t>
-      </w:r>
-    </w:p>
-    <w:p>
-      <w:r>
-        <w:t>Etapa 5 — Implementar “Por que o lucro caiu?”. Primeiro fazemos Python calcular as causas; depois a IA explica o resultado.</w:t>
-      </w:r>
-    </w:p>
-    <w:p>
-      <w:r>
-        <w:t>Etapa 6 — Só então treinar o segundo ML. Minha candidata continua sendo previsão de fluxo de caixa do próximo mês, porque essa pergunta realmente exige previsão futura.</w:t>
-      </w:r>
-    </w:p>
-    <w:p>
-      <w:r>
-        <w:t>Etapa 7 — Simulador. “E se a demanda aumentar 30%?”, “E se o fornecedor atrasar 10 dias?”, etc.</w:t>
-      </w:r>
-    </w:p>
-    <w:p>
-      <w:r>
-        <w:t xml:space="preserve">Etapa 8 — </w:t>
+        <w:t>(). Nenhuma exige novo ML.</w:t>
+      </w:r>
+    </w:p>
+    <w:p>
+      <w:r>
+        <w:t>Etapa 4</w:t>
+      </w:r>
+      <w:r>
+        <w:t>. Melhorar a busca por produto em linguagem natural</w:t>
+      </w:r>
+      <w:r>
+        <w:t xml:space="preserve">: </w:t>
+      </w:r>
+      <w:r>
+        <w:t xml:space="preserve">O fluxo ideal que você havia desenhado é: usuário fala de um produto pelo nome → IA entende → </w:t>
       </w:r>
       <w:proofErr w:type="spellStart"/>
       <w:r>
-        <w:t>Deploy</w:t>
+        <w:t>backend</w:t>
       </w:r>
       <w:proofErr w:type="spellEnd"/>
       <w:r>
-        <w:t xml:space="preserve">. Como seu </w:t>
-      </w:r>
-      <w:proofErr w:type="spellStart"/>
-      <w:r>
-        <w:t>frontend</w:t>
-      </w:r>
-      <w:proofErr w:type="spellEnd"/>
-      <w:r>
-        <w:t xml:space="preserve"> e </w:t>
-      </w:r>
-      <w:proofErr w:type="spellStart"/>
-      <w:r>
-        <w:t>backend</w:t>
-      </w:r>
-      <w:proofErr w:type="spellEnd"/>
-      <w:r>
-        <w:t xml:space="preserve"> são web, podemos publicar </w:t>
-      </w:r>
-      <w:proofErr w:type="spellStart"/>
-      <w:r>
-        <w:t>FastAPI</w:t>
-      </w:r>
-      <w:proofErr w:type="spellEnd"/>
-      <w:r>
-        <w:t xml:space="preserve"> e </w:t>
-      </w:r>
-      <w:proofErr w:type="spellStart"/>
-      <w:r>
-        <w:t>frontend</w:t>
-      </w:r>
-      <w:proofErr w:type="spellEnd"/>
-      <w:r>
-        <w:t xml:space="preserve"> em serviços com camada gratuita ou de baixo custo. Não precisamos decidir o provedor agora, porque isso muda com frequência. O mais importante é manter chaves de API em variáveis de ambiente e não no código.</w:t>
+        <w:t xml:space="preserve"> localiza o produto → análise de reposição → ML prevê demanda → regras calculam reposição → IA explica.</w:t>
+      </w:r>
+    </w:p>
+    <w:p>
+      <w:r>
+        <w:t xml:space="preserve">Etapa </w:t>
+      </w:r>
+      <w:r>
+        <w:t>5</w:t>
+      </w:r>
+      <w:r>
+        <w:t xml:space="preserve"> — Criar as funções financeiras. Faturamento, custos, lucro, contas a pagar, contas a receber e fluxo de caixa realizado.</w:t>
+      </w:r>
+    </w:p>
+    <w:p>
+      <w:r>
+        <w:t xml:space="preserve">Etapa 6 - </w:t>
+      </w:r>
+      <w:r>
+        <w:t>Tornar as consultas financeiras flexíveis por período</w:t>
+      </w:r>
+      <w:r>
+        <w:t xml:space="preserve">: </w:t>
+      </w:r>
+    </w:p>
+    <w:p>
+      <w:r>
+        <w:t xml:space="preserve">Etapa </w:t>
+      </w:r>
+      <w:r>
+        <w:t>7</w:t>
+      </w:r>
+      <w:r>
+        <w:t xml:space="preserve"> — Implementar “Por que o lucro caiu?”. Primeiro fazemos Python calcular as causas; depois a IA explica o resultado.</w:t>
+      </w:r>
+    </w:p>
+    <w:p>
+      <w:r>
+        <w:t>Etapa 8 -</w:t>
+      </w:r>
+      <w:r>
+        <w:t xml:space="preserve"> Criar uma camada de contexto/conversa</w:t>
+      </w:r>
+    </w:p>
+    <w:p>
+      <w:r>
+        <w:t xml:space="preserve">Etapa 9 - </w:t>
+      </w:r>
+      <w:r>
+        <w:t>Testes estruturados da IA</w:t>
+      </w:r>
+      <w:r>
+        <w:t>: montar uma bateria de perguntas</w:t>
+      </w:r>
+    </w:p>
+    <w:p>
+      <w:r>
+        <w:t xml:space="preserve">Etapa 10 - </w:t>
+      </w:r>
+      <w:r>
+        <w:t>Criar mecanismos melhores de confiabilidade</w:t>
+      </w:r>
+    </w:p>
+    <w:p>
+      <w:r>
+        <w:t xml:space="preserve">Etapa </w:t>
+      </w:r>
+      <w:r>
+        <w:t>11</w:t>
+      </w:r>
+      <w:r>
+        <w:t xml:space="preserve"> — Só então treinar o segundo ML. Minha candidata continua sendo previsão de fluxo de caixa do próximo mês, porque essa pergunta realmente exige previsão futura.</w:t>
+      </w:r>
+    </w:p>
+    <w:p>
+      <w:r>
+        <w:t xml:space="preserve">Etapa </w:t>
+      </w:r>
+      <w:r>
+        <w:t>12</w:t>
+      </w:r>
+      <w:r>
+        <w:t xml:space="preserve"> — Simulador. “E se a demanda aumentar 30%?”, “E se o fornecedor atrasar 10 dias?”, etc.</w:t>
+      </w:r>
+    </w:p>
+    <w:p>
+      <w:r>
+        <w:t>Etapa 13 – Relatórios</w:t>
+      </w:r>
+    </w:p>
+    <w:p>
+      <w:r>
+        <w:t xml:space="preserve">Etapa 12 – Deploy </w:t>
       </w:r>
     </w:p>
     <w:p/>
@@ -210,126 +230,146 @@
     <w:p/>
     <w:p/>
     <w:p/>
+    <w:p>
+      <w:r>
+        <w:rPr>
+          <w:b/>
+          <w:bCs/>
+        </w:rPr>
+        <w:t>Os produtos com maior quantidade recomendada de reposição:</w:t>
+      </w:r>
+      <w:r>
+        <w:t xml:space="preserve"> São os produtos que mais sai</w:t>
+      </w:r>
+    </w:p>
+    <w:p>
+      <w:r>
+        <w:rPr>
+          <w:highlight w:val="yellow"/>
+        </w:rPr>
+        <w:t>Produto com maior risco de ruptura = produto cuja velocidade de saída é alta em relação ao estoque disponível e ao tempo necessário para receber uma nova compra.</w:t>
+      </w:r>
+    </w:p>
+    <w:p>
+      <w:r>
+        <w:rPr>
+          <w:b/>
+          <w:bCs/>
+        </w:rPr>
+        <w:t>Produtos atrasados:</w:t>
+      </w:r>
+      <w:r>
+        <w:t xml:space="preserve"> resposta aparecendo duas vezes, colocar os de maior atraso, quantidade (unidade de medida), o valor total é tudo ou unitário?</w:t>
+      </w:r>
+    </w:p>
+    <w:p>
+      <w:r>
+        <w:t>Considerando a data pesquisada (dia 28/08) temos tantos itens em estoque.</w:t>
+      </w:r>
+    </w:p>
+    <w:p>
+      <w:r>
+        <w:t>Não é para responder coisas que não são relacionados do sistema</w:t>
+      </w:r>
+    </w:p>
     <w:p/>
     <w:p/>
     <w:p/>
     <w:p/>
     <w:p/>
+    <w:p/>
+    <w:p/>
+    <w:p>
+      <w:r>
+        <w:t>USUÁRIO</w:t>
+      </w:r>
+    </w:p>
+    <w:p>
+      <w:r>
+        <w:t>"Estou com pouco estoque da jaqueta preta.</w:t>
+      </w:r>
+    </w:p>
+    <w:p>
+      <w:r>
+        <w:t>Quanto devo comprar?"</w:t>
+      </w:r>
+    </w:p>
+    <w:p>
+      <w:r>
+        <w:t xml:space="preserve">        ↓</w:t>
+      </w:r>
+    </w:p>
+    <w:p>
+      <w:r>
+        <w:t>LLM / IA</w:t>
+      </w:r>
+    </w:p>
+    <w:p>
+      <w:r>
+        <w:t>entende:</w:t>
+      </w:r>
+    </w:p>
+    <w:p>
+      <w:r>
+        <w:t>- intenção = analisar reposição</w:t>
+      </w:r>
+    </w:p>
+    <w:p>
+      <w:r>
+        <w:t>- produto = jaqueta preta</w:t>
+      </w:r>
+    </w:p>
+    <w:p>
+      <w:r>
+        <w:t xml:space="preserve">        ↓</w:t>
+      </w:r>
+    </w:p>
+    <w:p>
+      <w:r>
+        <w:t>BACKEND</w:t>
+      </w:r>
+    </w:p>
+    <w:p>
+      <w:r>
+        <w:t>localiza o produto</w:t>
+      </w:r>
+    </w:p>
+    <w:p>
+      <w:r>
+        <w:t xml:space="preserve">chama </w:t>
+      </w:r>
+      <w:proofErr w:type="spellStart"/>
+      <w:r>
+        <w:t>analisar_reposicao</w:t>
+      </w:r>
+      <w:proofErr w:type="spellEnd"/>
+      <w:r>
+        <w:t>()</w:t>
+      </w:r>
+    </w:p>
+    <w:p>
+      <w:r>
+        <w:t xml:space="preserve">        ↓</w:t>
+      </w:r>
+    </w:p>
+    <w:p>
+      <w:r>
+        <w:t>MACHINE LEARNING</w:t>
+      </w:r>
+    </w:p>
+    <w:p>
+      <w:r>
+        <w:t>prevê demanda</w:t>
+      </w:r>
+    </w:p>
+    <w:p>
+      <w:r>
+        <w:t xml:space="preserve">        ↓</w:t>
+      </w:r>
+    </w:p>
     <w:p>
       <w:r>
         <w:lastRenderedPageBreak/>
-        <w:t>USUÁRIO</w:t>
-      </w:r>
-    </w:p>
-    <w:p>
-      <w:r>
-        <w:t>"Estou com pouco estoque da jaqueta preta.</w:t>
-      </w:r>
-    </w:p>
-    <w:p>
-      <w:r>
-        <w:t>Quanto devo comprar?"</w:t>
-      </w:r>
-    </w:p>
-    <w:p>
-      <w:r>
-        <w:t xml:space="preserve">        ↓</w:t>
-      </w:r>
-    </w:p>
-    <w:p>
-      <w:r>
-        <w:t>LLM / IA</w:t>
-      </w:r>
-    </w:p>
-    <w:p>
-      <w:r>
-        <w:t>entende:</w:t>
-      </w:r>
-    </w:p>
-    <w:p>
-      <w:r>
-        <w:t xml:space="preserve">- </w:t>
-      </w:r>
-      <w:proofErr w:type="gramStart"/>
-      <w:r>
-        <w:t>intenção</w:t>
-      </w:r>
-      <w:proofErr w:type="gramEnd"/>
-      <w:r>
-        <w:t xml:space="preserve"> = analisar reposição</w:t>
-      </w:r>
-    </w:p>
-    <w:p>
-      <w:r>
-        <w:t xml:space="preserve">- </w:t>
-      </w:r>
-      <w:proofErr w:type="gramStart"/>
-      <w:r>
-        <w:t>produto</w:t>
-      </w:r>
-      <w:proofErr w:type="gramEnd"/>
-      <w:r>
-        <w:t xml:space="preserve"> = jaqueta preta</w:t>
-      </w:r>
-    </w:p>
-    <w:p>
-      <w:r>
-        <w:t xml:space="preserve">        ↓</w:t>
-      </w:r>
-    </w:p>
-    <w:p>
-      <w:r>
-        <w:t>BACKEND</w:t>
-      </w:r>
-    </w:p>
-    <w:p>
-      <w:r>
-        <w:t>localiza o produto</w:t>
-      </w:r>
-    </w:p>
-    <w:p>
-      <w:r>
-        <w:t xml:space="preserve">chama </w:t>
-      </w:r>
-      <w:proofErr w:type="spellStart"/>
-      <w:r>
-        <w:t>analisar_</w:t>
-      </w:r>
-      <w:proofErr w:type="gramStart"/>
-      <w:r>
-        <w:t>reposicao</w:t>
-      </w:r>
-      <w:proofErr w:type="spellEnd"/>
-      <w:r>
-        <w:t>(</w:t>
-      </w:r>
-      <w:proofErr w:type="gramEnd"/>
-      <w:r>
-        <w:t>)</w:t>
-      </w:r>
-    </w:p>
-    <w:p>
-      <w:r>
-        <w:t xml:space="preserve">        ↓</w:t>
-      </w:r>
-    </w:p>
-    <w:p>
-      <w:r>
-        <w:t>MACHINE LEARNING</w:t>
-      </w:r>
-    </w:p>
-    <w:p>
-      <w:r>
-        <w:t>prevê demanda</w:t>
-      </w:r>
-    </w:p>
-    <w:p>
-      <w:r>
-        <w:t xml:space="preserve">        ↓</w:t>
-      </w:r>
-    </w:p>
-    <w:p>
-      <w:r>
         <w:t>REGRAS DE NEGÓCIO</w:t>
       </w:r>
     </w:p>
@@ -1344,6 +1384,7 @@
   <w:style w:type="character" w:default="1" w:styleId="Fontepargpadro">
     <w:name w:val="Default Paragraph Font"/>
     <w:uiPriority w:val="1"/>
+    <w:semiHidden/>
     <w:unhideWhenUsed/>
   </w:style>
   <w:style w:type="table" w:default="1" w:styleId="Tabelanormal">

</xml_diff>

<commit_message>
Adiciona lógica para análise de períodos em funções de estoque, incluindo novos parâmetros para data de início e fim, e implementa a função para obter o estoque em uma data específica.
</commit_message>
<xml_diff>
--- a/DOCUMENTOS/PROXIMOS PASSOS.docx
+++ b/DOCUMENTOS/PROXIMOS PASSOS.docx
@@ -14,14 +14,28 @@
         <w:rPr>
           <w:highlight w:val="yellow"/>
         </w:rPr>
-        <w:t>analisar_reposicao</w:t>
-      </w:r>
-      <w:proofErr w:type="spellEnd"/>
+        <w:t>analisar_</w:t>
+      </w:r>
+      <w:proofErr w:type="gramStart"/>
       <w:r>
         <w:rPr>
           <w:highlight w:val="yellow"/>
         </w:rPr>
-        <w:t>(). A IA terá que entender frases diferentes como “Quanto compro do PROD017?”, “Preciso repor o PROD017?”, “Meu estoque do PROD017 é suficiente?” e “Qual a situação do produto PROD017?”. Todas poderão acabar chamando a mesma função.</w:t>
+        <w:t>reposicao</w:t>
+      </w:r>
+      <w:proofErr w:type="spellEnd"/>
+      <w:r>
+        <w:rPr>
+          <w:highlight w:val="yellow"/>
+        </w:rPr>
+        <w:t>(</w:t>
+      </w:r>
+      <w:proofErr w:type="gramEnd"/>
+      <w:r>
+        <w:rPr>
+          <w:highlight w:val="yellow"/>
+        </w:rPr>
+        <w:t>). A IA terá que entender frases diferentes como “Quanto compro do PROD017?”, “Preciso repor o PROD017?”, “Meu estoque do PROD017 é suficiente?” e “Qual a situação do produto PROD017?”. Todas poderão acabar chamando a mesma função.</w:t>
       </w:r>
       <w:r>
         <w:rPr>
@@ -54,7 +68,21 @@
         <w:rPr>
           <w:highlight w:val="yellow"/>
         </w:rPr>
-        <w:t xml:space="preserve"> a responsabilidade de interpretar português. Hoje o main.js procura PROD\d{3}. Isso será substituído por algo muito mais simples: ele apenas envia a mensagem para /api/chat e recebe uma resposta.</w:t>
+        <w:t xml:space="preserve"> a responsabilidade de interpretar português. Hoje o main.js procura PROD\</w:t>
+      </w:r>
+      <w:proofErr w:type="gramStart"/>
+      <w:r>
+        <w:rPr>
+          <w:highlight w:val="yellow"/>
+        </w:rPr>
+        <w:t>d{</w:t>
+      </w:r>
+      <w:proofErr w:type="gramEnd"/>
+      <w:r>
+        <w:rPr>
+          <w:highlight w:val="yellow"/>
+        </w:rPr>
+        <w:t>3}. Isso será substituído por algo muito mais simples: ele apenas envia a mensagem para /api/chat e recebe uma resposta.</w:t>
       </w:r>
       <w:r>
         <w:rPr>
@@ -65,47 +93,95 @@
     </w:p>
     <w:p>
       <w:r>
-        <w:t xml:space="preserve">Etapa 3 — Criar as funções determinísticas de Logística. </w:t>
+        <w:t xml:space="preserve">Etapa 3 — Criar as funções determinísticas </w:t>
+      </w:r>
+      <w:proofErr w:type="gramStart"/>
+      <w:r>
+        <w:t>de Logística</w:t>
+      </w:r>
+      <w:proofErr w:type="gramEnd"/>
+      <w:r>
+        <w:t xml:space="preserve">. </w:t>
       </w:r>
       <w:proofErr w:type="spellStart"/>
       <w:r>
-        <w:t>listar_produtos_reposicao</w:t>
+        <w:t>listar_produtos_</w:t>
+      </w:r>
+      <w:proofErr w:type="gramStart"/>
+      <w:r>
+        <w:t>reposicao</w:t>
       </w:r>
       <w:proofErr w:type="spellEnd"/>
       <w:r>
-        <w:t xml:space="preserve">(), </w:t>
+        <w:t>(</w:t>
+      </w:r>
+      <w:proofErr w:type="gramEnd"/>
+      <w:r>
+        <w:t xml:space="preserve">), </w:t>
       </w:r>
       <w:proofErr w:type="spellStart"/>
       <w:r>
-        <w:t>consultar_pedidos_atrasados</w:t>
+        <w:t>consultar_pedidos_</w:t>
+      </w:r>
+      <w:proofErr w:type="gramStart"/>
+      <w:r>
+        <w:t>atrasados</w:t>
       </w:r>
       <w:proofErr w:type="spellEnd"/>
       <w:r>
-        <w:t xml:space="preserve">(), </w:t>
+        <w:t>(</w:t>
+      </w:r>
+      <w:proofErr w:type="gramEnd"/>
+      <w:r>
+        <w:t xml:space="preserve">), </w:t>
       </w:r>
       <w:proofErr w:type="spellStart"/>
       <w:r>
-        <w:t>produto_maior_risco</w:t>
+        <w:t>produto_maior_</w:t>
+      </w:r>
+      <w:proofErr w:type="gramStart"/>
+      <w:r>
+        <w:t>risco</w:t>
       </w:r>
       <w:proofErr w:type="spellEnd"/>
       <w:r>
-        <w:t xml:space="preserve">(), </w:t>
+        <w:t>(</w:t>
+      </w:r>
+      <w:proofErr w:type="gramEnd"/>
+      <w:r>
+        <w:t xml:space="preserve">), </w:t>
       </w:r>
       <w:proofErr w:type="spellStart"/>
       <w:r>
-        <w:t>produtos_baixo_giro</w:t>
+        <w:t>produtos_baixo_</w:t>
+      </w:r>
+      <w:proofErr w:type="gramStart"/>
+      <w:r>
+        <w:t>giro</w:t>
       </w:r>
       <w:proofErr w:type="spellEnd"/>
       <w:r>
-        <w:t xml:space="preserve">() e </w:t>
+        <w:t>(</w:t>
+      </w:r>
+      <w:proofErr w:type="gramEnd"/>
+      <w:r>
+        <w:t xml:space="preserve">) e </w:t>
       </w:r>
       <w:proofErr w:type="spellStart"/>
       <w:r>
-        <w:t>fornecedor_com_mais_atrasos</w:t>
+        <w:t>fornecedor_com_mais_</w:t>
+      </w:r>
+      <w:proofErr w:type="gramStart"/>
+      <w:r>
+        <w:t>atrasos</w:t>
       </w:r>
       <w:proofErr w:type="spellEnd"/>
       <w:r>
-        <w:t>(). Nenhuma exige novo ML.</w:t>
+        <w:t>(</w:t>
+      </w:r>
+      <w:proofErr w:type="gramEnd"/>
+      <w:r>
+        <w:t>). Nenhuma exige novo ML.</w:t>
       </w:r>
     </w:p>
     <w:p>
@@ -311,12 +387,28 @@
     </w:p>
     <w:p>
       <w:r>
-        <w:t>- intenção = analisar reposição</w:t>
-      </w:r>
-    </w:p>
-    <w:p>
-      <w:r>
-        <w:t>- produto = jaqueta preta</w:t>
+        <w:t xml:space="preserve">- </w:t>
+      </w:r>
+      <w:proofErr w:type="gramStart"/>
+      <w:r>
+        <w:t>intenção</w:t>
+      </w:r>
+      <w:proofErr w:type="gramEnd"/>
+      <w:r>
+        <w:t xml:space="preserve"> = analisar reposição</w:t>
+      </w:r>
+    </w:p>
+    <w:p>
+      <w:r>
+        <w:t xml:space="preserve">- </w:t>
+      </w:r>
+      <w:proofErr w:type="gramStart"/>
+      <w:r>
+        <w:t>produto</w:t>
+      </w:r>
+      <w:proofErr w:type="gramEnd"/>
+      <w:r>
+        <w:t xml:space="preserve"> = jaqueta preta</w:t>
       </w:r>
     </w:p>
     <w:p>
@@ -340,11 +432,19 @@
       </w:r>
       <w:proofErr w:type="spellStart"/>
       <w:r>
-        <w:t>analisar_reposicao</w:t>
+        <w:t>analisar_</w:t>
+      </w:r>
+      <w:proofErr w:type="gramStart"/>
+      <w:r>
+        <w:t>reposicao</w:t>
       </w:r>
       <w:proofErr w:type="spellEnd"/>
       <w:r>
-        <w:t>()</w:t>
+        <w:t>(</w:t>
+      </w:r>
+      <w:proofErr w:type="gramEnd"/>
+      <w:r>
+        <w:t>)</w:t>
       </w:r>
     </w:p>
     <w:p>
@@ -418,6 +518,1482 @@
         <w:t>CHAT DUAXIS</w:t>
       </w:r>
     </w:p>
+    <w:p/>
+    <w:p/>
+    <w:p/>
+    <w:p/>
+    <w:p/>
+    <w:p/>
+    <w:p/>
+    <w:p/>
+    <w:p/>
+    <w:p/>
+    <w:p/>
+    <w:p/>
+    <w:p/>
+    <w:p/>
+    <w:p/>
+    <w:p/>
+    <w:p/>
+    <w:p/>
+    <w:p/>
+    <w:p/>
+    <w:p/>
+    <w:tbl>
+      <w:tblPr>
+        <w:tblW w:w="0" w:type="auto"/>
+        <w:tblCellSpacing w:w="15" w:type="dxa"/>
+        <w:tblCellMar>
+          <w:top w:w="15" w:type="dxa"/>
+          <w:left w:w="15" w:type="dxa"/>
+          <w:bottom w:w="15" w:type="dxa"/>
+          <w:right w:w="15" w:type="dxa"/>
+        </w:tblCellMar>
+        <w:tblLook w:val="04A0" w:firstRow="1" w:lastRow="0" w:firstColumn="1" w:lastColumn="0" w:noHBand="0" w:noVBand="1"/>
+      </w:tblPr>
+      <w:tblGrid>
+        <w:gridCol w:w="311"/>
+        <w:gridCol w:w="4907"/>
+        <w:gridCol w:w="3286"/>
+      </w:tblGrid>
+      <w:tr>
+        <w:trPr>
+          <w:tblHeader/>
+          <w:tblCellSpacing w:w="15" w:type="dxa"/>
+        </w:trPr>
+        <w:tc>
+          <w:tcPr>
+            <w:tcW w:w="0" w:type="auto"/>
+            <w:vAlign w:val="center"/>
+            <w:hideMark/>
+          </w:tcPr>
+          <w:p>
+            <w:pPr>
+              <w:rPr>
+                <w:b/>
+                <w:bCs/>
+              </w:rPr>
+            </w:pPr>
+            <w:r>
+              <w:rPr>
+                <w:b/>
+                <w:bCs/>
+              </w:rPr>
+              <w:lastRenderedPageBreak/>
+              <w:t>#</w:t>
+            </w:r>
+          </w:p>
+        </w:tc>
+        <w:tc>
+          <w:tcPr>
+            <w:tcW w:w="0" w:type="auto"/>
+            <w:vAlign w:val="center"/>
+            <w:hideMark/>
+          </w:tcPr>
+          <w:p>
+            <w:pPr>
+              <w:rPr>
+                <w:b/>
+                <w:bCs/>
+              </w:rPr>
+            </w:pPr>
+            <w:r>
+              <w:rPr>
+                <w:b/>
+                <w:bCs/>
+              </w:rPr>
+              <w:t>Pergunta para fazer no chat</w:t>
+            </w:r>
+          </w:p>
+        </w:tc>
+        <w:tc>
+          <w:tcPr>
+            <w:tcW w:w="0" w:type="auto"/>
+            <w:vAlign w:val="center"/>
+            <w:hideMark/>
+          </w:tcPr>
+          <w:p>
+            <w:pPr>
+              <w:rPr>
+                <w:b/>
+                <w:bCs/>
+              </w:rPr>
+            </w:pPr>
+            <w:r>
+              <w:rPr>
+                <w:b/>
+                <w:bCs/>
+              </w:rPr>
+              <w:t>O que estamos testando</w:t>
+            </w:r>
+          </w:p>
+        </w:tc>
+      </w:tr>
+      <w:tr>
+        <w:trPr>
+          <w:tblCellSpacing w:w="15" w:type="dxa"/>
+        </w:trPr>
+        <w:tc>
+          <w:tcPr>
+            <w:tcW w:w="0" w:type="auto"/>
+            <w:vAlign w:val="center"/>
+            <w:hideMark/>
+          </w:tcPr>
+          <w:p>
+            <w:r>
+              <w:t>1</w:t>
+            </w:r>
+          </w:p>
+        </w:tc>
+        <w:tc>
+          <w:tcPr>
+            <w:tcW w:w="0" w:type="auto"/>
+            <w:vAlign w:val="center"/>
+            <w:hideMark/>
+          </w:tcPr>
+          <w:p>
+            <w:r>
+              <w:rPr>
+                <w:b/>
+                <w:bCs/>
+              </w:rPr>
+              <w:t>Qual é a previsão de demanda do produto PROD017?</w:t>
+            </w:r>
+          </w:p>
+        </w:tc>
+        <w:tc>
+          <w:tcPr>
+            <w:tcW w:w="0" w:type="auto"/>
+            <w:vAlign w:val="center"/>
+            <w:hideMark/>
+          </w:tcPr>
+          <w:p>
+            <w:r>
+              <w:t>Previsão individual</w:t>
+            </w:r>
+          </w:p>
+        </w:tc>
+      </w:tr>
+      <w:tr>
+        <w:trPr>
+          <w:tblCellSpacing w:w="15" w:type="dxa"/>
+        </w:trPr>
+        <w:tc>
+          <w:tcPr>
+            <w:tcW w:w="0" w:type="auto"/>
+            <w:vAlign w:val="center"/>
+            <w:hideMark/>
+          </w:tcPr>
+          <w:p>
+            <w:r>
+              <w:t>2</w:t>
+            </w:r>
+          </w:p>
+        </w:tc>
+        <w:tc>
+          <w:tcPr>
+            <w:tcW w:w="0" w:type="auto"/>
+            <w:vAlign w:val="center"/>
+            <w:hideMark/>
+          </w:tcPr>
+          <w:p>
+            <w:r>
+              <w:rPr>
+                <w:b/>
+                <w:bCs/>
+              </w:rPr>
+              <w:t>Analise a necessidade de reposição do PROD017.</w:t>
+            </w:r>
+          </w:p>
+        </w:tc>
+        <w:tc>
+          <w:tcPr>
+            <w:tcW w:w="0" w:type="auto"/>
+            <w:vAlign w:val="center"/>
+            <w:hideMark/>
+          </w:tcPr>
+          <w:p>
+            <w:r>
+              <w:t>Reposição individual</w:t>
+            </w:r>
+          </w:p>
+        </w:tc>
+      </w:tr>
+      <w:tr>
+        <w:trPr>
+          <w:tblCellSpacing w:w="15" w:type="dxa"/>
+        </w:trPr>
+        <w:tc>
+          <w:tcPr>
+            <w:tcW w:w="0" w:type="auto"/>
+            <w:vAlign w:val="center"/>
+            <w:hideMark/>
+          </w:tcPr>
+          <w:p>
+            <w:r>
+              <w:t>3</w:t>
+            </w:r>
+          </w:p>
+        </w:tc>
+        <w:tc>
+          <w:tcPr>
+            <w:tcW w:w="0" w:type="auto"/>
+            <w:vAlign w:val="center"/>
+            <w:hideMark/>
+          </w:tcPr>
+          <w:p>
+            <w:r>
+              <w:rPr>
+                <w:b/>
+                <w:bCs/>
+              </w:rPr>
+              <w:t>O PROD017 precisa ser reposto?</w:t>
+            </w:r>
+          </w:p>
+        </w:tc>
+        <w:tc>
+          <w:tcPr>
+            <w:tcW w:w="0" w:type="auto"/>
+            <w:vAlign w:val="center"/>
+            <w:hideMark/>
+          </w:tcPr>
+          <w:p>
+            <w:r>
+              <w:t>Variação em linguagem natural</w:t>
+            </w:r>
+          </w:p>
+        </w:tc>
+      </w:tr>
+      <w:tr>
+        <w:trPr>
+          <w:tblCellSpacing w:w="15" w:type="dxa"/>
+        </w:trPr>
+        <w:tc>
+          <w:tcPr>
+            <w:tcW w:w="0" w:type="auto"/>
+            <w:vAlign w:val="center"/>
+            <w:hideMark/>
+          </w:tcPr>
+          <w:p>
+            <w:r>
+              <w:t>4</w:t>
+            </w:r>
+          </w:p>
+        </w:tc>
+        <w:tc>
+          <w:tcPr>
+            <w:tcW w:w="0" w:type="auto"/>
+            <w:vAlign w:val="center"/>
+            <w:hideMark/>
+          </w:tcPr>
+          <w:p>
+            <w:r>
+              <w:rPr>
+                <w:b/>
+                <w:bCs/>
+              </w:rPr>
+              <w:t>Como está a situação do estoque do PROD017?</w:t>
+            </w:r>
+          </w:p>
+        </w:tc>
+        <w:tc>
+          <w:tcPr>
+            <w:tcW w:w="0" w:type="auto"/>
+            <w:vAlign w:val="center"/>
+            <w:hideMark/>
+          </w:tcPr>
+          <w:p>
+            <w:r>
+              <w:t>Se entende uma pergunta menos explícita</w:t>
+            </w:r>
+          </w:p>
+        </w:tc>
+      </w:tr>
+      <w:tr>
+        <w:trPr>
+          <w:tblCellSpacing w:w="15" w:type="dxa"/>
+        </w:trPr>
+        <w:tc>
+          <w:tcPr>
+            <w:tcW w:w="0" w:type="auto"/>
+            <w:vAlign w:val="center"/>
+            <w:hideMark/>
+          </w:tcPr>
+          <w:p>
+            <w:r>
+              <w:t>5</w:t>
+            </w:r>
+          </w:p>
+        </w:tc>
+        <w:tc>
+          <w:tcPr>
+            <w:tcW w:w="0" w:type="auto"/>
+            <w:vAlign w:val="center"/>
+            <w:hideMark/>
+          </w:tcPr>
+          <w:p>
+            <w:r>
+              <w:rPr>
+                <w:b/>
+                <w:bCs/>
+              </w:rPr>
+              <w:t>Devo me preocupar com a reposição do PROD017?</w:t>
+            </w:r>
+          </w:p>
+        </w:tc>
+        <w:tc>
+          <w:tcPr>
+            <w:tcW w:w="0" w:type="auto"/>
+            <w:vAlign w:val="center"/>
+            <w:hideMark/>
+          </w:tcPr>
+          <w:p>
+            <w:r>
+              <w:t>Intenção implícita de reposição</w:t>
+            </w:r>
+          </w:p>
+        </w:tc>
+      </w:tr>
+      <w:tr>
+        <w:trPr>
+          <w:tblCellSpacing w:w="15" w:type="dxa"/>
+        </w:trPr>
+        <w:tc>
+          <w:tcPr>
+            <w:tcW w:w="0" w:type="auto"/>
+            <w:vAlign w:val="center"/>
+            <w:hideMark/>
+          </w:tcPr>
+          <w:p>
+            <w:r>
+              <w:t>6</w:t>
+            </w:r>
+          </w:p>
+        </w:tc>
+        <w:tc>
+          <w:tcPr>
+            <w:tcW w:w="0" w:type="auto"/>
+            <w:vAlign w:val="center"/>
+            <w:hideMark/>
+          </w:tcPr>
+          <w:p>
+            <w:r>
+              <w:rPr>
+                <w:b/>
+                <w:bCs/>
+              </w:rPr>
+              <w:t>Quais produtos precisam de reposição?</w:t>
+            </w:r>
+          </w:p>
+        </w:tc>
+        <w:tc>
+          <w:tcPr>
+            <w:tcW w:w="0" w:type="auto"/>
+            <w:vAlign w:val="center"/>
+            <w:hideMark/>
+          </w:tcPr>
+          <w:p>
+            <w:r>
+              <w:t>Lista geral de reposição</w:t>
+            </w:r>
+          </w:p>
+        </w:tc>
+      </w:tr>
+      <w:tr>
+        <w:trPr>
+          <w:tblCellSpacing w:w="15" w:type="dxa"/>
+        </w:trPr>
+        <w:tc>
+          <w:tcPr>
+            <w:tcW w:w="0" w:type="auto"/>
+            <w:vAlign w:val="center"/>
+            <w:hideMark/>
+          </w:tcPr>
+          <w:p>
+            <w:r>
+              <w:t>7</w:t>
+            </w:r>
+          </w:p>
+        </w:tc>
+        <w:tc>
+          <w:tcPr>
+            <w:tcW w:w="0" w:type="auto"/>
+            <w:vAlign w:val="center"/>
+            <w:hideMark/>
+          </w:tcPr>
+          <w:p>
+            <w:r>
+              <w:rPr>
+                <w:b/>
+                <w:bCs/>
+              </w:rPr>
+              <w:t>Tem algum produto precisando ser reposto?</w:t>
+            </w:r>
+          </w:p>
+        </w:tc>
+        <w:tc>
+          <w:tcPr>
+            <w:tcW w:w="0" w:type="auto"/>
+            <w:vAlign w:val="center"/>
+            <w:hideMark/>
+          </w:tcPr>
+          <w:p>
+            <w:r>
+              <w:t>Mesma intenção, linguagem informal</w:t>
+            </w:r>
+          </w:p>
+        </w:tc>
+      </w:tr>
+      <w:tr>
+        <w:trPr>
+          <w:tblCellSpacing w:w="15" w:type="dxa"/>
+        </w:trPr>
+        <w:tc>
+          <w:tcPr>
+            <w:tcW w:w="0" w:type="auto"/>
+            <w:vAlign w:val="center"/>
+            <w:hideMark/>
+          </w:tcPr>
+          <w:p>
+            <w:r>
+              <w:t>8</w:t>
+            </w:r>
+          </w:p>
+        </w:tc>
+        <w:tc>
+          <w:tcPr>
+            <w:tcW w:w="0" w:type="auto"/>
+            <w:vAlign w:val="center"/>
+            <w:hideMark/>
+          </w:tcPr>
+          <w:p>
+            <w:r>
+              <w:rPr>
+                <w:b/>
+                <w:bCs/>
+              </w:rPr>
+              <w:t>Mostre os produtos que precisam de reposição.</w:t>
+            </w:r>
+          </w:p>
+        </w:tc>
+        <w:tc>
+          <w:tcPr>
+            <w:tcW w:w="0" w:type="auto"/>
+            <w:vAlign w:val="center"/>
+            <w:hideMark/>
+          </w:tcPr>
+          <w:p>
+            <w:r>
+              <w:t>Variação imperativa</w:t>
+            </w:r>
+          </w:p>
+        </w:tc>
+      </w:tr>
+      <w:tr>
+        <w:trPr>
+          <w:tblCellSpacing w:w="15" w:type="dxa"/>
+        </w:trPr>
+        <w:tc>
+          <w:tcPr>
+            <w:tcW w:w="0" w:type="auto"/>
+            <w:vAlign w:val="center"/>
+            <w:hideMark/>
+          </w:tcPr>
+          <w:p>
+            <w:r>
+              <w:t>9</w:t>
+            </w:r>
+          </w:p>
+        </w:tc>
+        <w:tc>
+          <w:tcPr>
+            <w:tcW w:w="0" w:type="auto"/>
+            <w:vAlign w:val="center"/>
+            <w:hideMark/>
+          </w:tcPr>
+          <w:p>
+            <w:r>
+              <w:rPr>
+                <w:b/>
+                <w:bCs/>
+              </w:rPr>
+              <w:t>Quais itens estão com necessidade de reposição?</w:t>
+            </w:r>
+          </w:p>
+        </w:tc>
+        <w:tc>
+          <w:tcPr>
+            <w:tcW w:w="0" w:type="auto"/>
+            <w:vAlign w:val="center"/>
+            <w:hideMark/>
+          </w:tcPr>
+          <w:p>
+            <w:r>
+              <w:t>Sinônimo produto → item</w:t>
+            </w:r>
+          </w:p>
+        </w:tc>
+      </w:tr>
+      <w:tr>
+        <w:trPr>
+          <w:tblCellSpacing w:w="15" w:type="dxa"/>
+        </w:trPr>
+        <w:tc>
+          <w:tcPr>
+            <w:tcW w:w="0" w:type="auto"/>
+            <w:vAlign w:val="center"/>
+            <w:hideMark/>
+          </w:tcPr>
+          <w:p>
+            <w:r>
+              <w:t>10</w:t>
+            </w:r>
+          </w:p>
+        </w:tc>
+        <w:tc>
+          <w:tcPr>
+            <w:tcW w:w="0" w:type="auto"/>
+            <w:vAlign w:val="center"/>
+            <w:hideMark/>
+          </w:tcPr>
+          <w:p>
+            <w:r>
+              <w:rPr>
+                <w:b/>
+                <w:bCs/>
+              </w:rPr>
+              <w:t>Existe algum pedido atrasado?</w:t>
+            </w:r>
+          </w:p>
+        </w:tc>
+        <w:tc>
+          <w:tcPr>
+            <w:tcW w:w="0" w:type="auto"/>
+            <w:vAlign w:val="center"/>
+            <w:hideMark/>
+          </w:tcPr>
+          <w:p>
+            <w:r>
+              <w:t>Pedidos atrasados</w:t>
+            </w:r>
+          </w:p>
+        </w:tc>
+      </w:tr>
+      <w:tr>
+        <w:trPr>
+          <w:tblCellSpacing w:w="15" w:type="dxa"/>
+        </w:trPr>
+        <w:tc>
+          <w:tcPr>
+            <w:tcW w:w="0" w:type="auto"/>
+            <w:vAlign w:val="center"/>
+            <w:hideMark/>
+          </w:tcPr>
+          <w:p>
+            <w:r>
+              <w:t>11</w:t>
+            </w:r>
+          </w:p>
+        </w:tc>
+        <w:tc>
+          <w:tcPr>
+            <w:tcW w:w="0" w:type="auto"/>
+            <w:vAlign w:val="center"/>
+            <w:hideMark/>
+          </w:tcPr>
+          <w:p>
+            <w:r>
+              <w:rPr>
+                <w:b/>
+                <w:bCs/>
+              </w:rPr>
+              <w:t>Quais pedidos estão atrasados?</w:t>
+            </w:r>
+          </w:p>
+        </w:tc>
+        <w:tc>
+          <w:tcPr>
+            <w:tcW w:w="0" w:type="auto"/>
+            <w:vAlign w:val="center"/>
+            <w:hideMark/>
+          </w:tcPr>
+          <w:p>
+            <w:r>
+              <w:t>Listagem de atrasos</w:t>
+            </w:r>
+          </w:p>
+        </w:tc>
+      </w:tr>
+      <w:tr>
+        <w:trPr>
+          <w:tblCellSpacing w:w="15" w:type="dxa"/>
+        </w:trPr>
+        <w:tc>
+          <w:tcPr>
+            <w:tcW w:w="0" w:type="auto"/>
+            <w:vAlign w:val="center"/>
+            <w:hideMark/>
+          </w:tcPr>
+          <w:p>
+            <w:r>
+              <w:t>12</w:t>
+            </w:r>
+          </w:p>
+        </w:tc>
+        <w:tc>
+          <w:tcPr>
+            <w:tcW w:w="0" w:type="auto"/>
+            <w:vAlign w:val="center"/>
+            <w:hideMark/>
+          </w:tcPr>
+          <w:p>
+            <w:r>
+              <w:rPr>
+                <w:b/>
+                <w:bCs/>
+              </w:rPr>
+              <w:t>Temos compras que ainda não chegaram e já passaram da data prevista?</w:t>
+            </w:r>
+          </w:p>
+        </w:tc>
+        <w:tc>
+          <w:tcPr>
+            <w:tcW w:w="0" w:type="auto"/>
+            <w:vAlign w:val="center"/>
+            <w:hideMark/>
+          </w:tcPr>
+          <w:p>
+            <w:r>
+              <w:t>Entendimento sem usar “pedido atrasado”</w:t>
+            </w:r>
+          </w:p>
+        </w:tc>
+      </w:tr>
+      <w:tr>
+        <w:trPr>
+          <w:tblCellSpacing w:w="15" w:type="dxa"/>
+        </w:trPr>
+        <w:tc>
+          <w:tcPr>
+            <w:tcW w:w="0" w:type="auto"/>
+            <w:vAlign w:val="center"/>
+            <w:hideMark/>
+          </w:tcPr>
+          <w:p>
+            <w:r>
+              <w:t>13</w:t>
+            </w:r>
+          </w:p>
+        </w:tc>
+        <w:tc>
+          <w:tcPr>
+            <w:tcW w:w="0" w:type="auto"/>
+            <w:vAlign w:val="center"/>
+            <w:hideMark/>
+          </w:tcPr>
+          <w:p>
+            <w:r>
+              <w:rPr>
+                <w:b/>
+                <w:bCs/>
+              </w:rPr>
+              <w:t>Mostre os pedidos de fornecedores que estão em atraso.</w:t>
+            </w:r>
+          </w:p>
+        </w:tc>
+        <w:tc>
+          <w:tcPr>
+            <w:tcW w:w="0" w:type="auto"/>
+            <w:vAlign w:val="center"/>
+            <w:hideMark/>
+          </w:tcPr>
+          <w:p>
+            <w:r>
+              <w:t>Contexto fornecedor + atraso</w:t>
+            </w:r>
+          </w:p>
+        </w:tc>
+      </w:tr>
+      <w:tr>
+        <w:trPr>
+          <w:tblCellSpacing w:w="15" w:type="dxa"/>
+        </w:trPr>
+        <w:tc>
+          <w:tcPr>
+            <w:tcW w:w="0" w:type="auto"/>
+            <w:vAlign w:val="center"/>
+            <w:hideMark/>
+          </w:tcPr>
+          <w:p>
+            <w:r>
+              <w:t>14</w:t>
+            </w:r>
+          </w:p>
+        </w:tc>
+        <w:tc>
+          <w:tcPr>
+            <w:tcW w:w="0" w:type="auto"/>
+            <w:vAlign w:val="center"/>
+            <w:hideMark/>
+          </w:tcPr>
+          <w:p>
+            <w:r>
+              <w:rPr>
+                <w:b/>
+                <w:bCs/>
+              </w:rPr>
+              <w:t>Quantos pedidos estão atrasados atualmente?</w:t>
+            </w:r>
+          </w:p>
+        </w:tc>
+        <w:tc>
+          <w:tcPr>
+            <w:tcW w:w="0" w:type="auto"/>
+            <w:vAlign w:val="center"/>
+            <w:hideMark/>
+          </w:tcPr>
+          <w:p>
+            <w:r>
+              <w:t>Resumo dos atrasados</w:t>
+            </w:r>
+          </w:p>
+        </w:tc>
+      </w:tr>
+      <w:tr>
+        <w:trPr>
+          <w:tblCellSpacing w:w="15" w:type="dxa"/>
+        </w:trPr>
+        <w:tc>
+          <w:tcPr>
+            <w:tcW w:w="0" w:type="auto"/>
+            <w:vAlign w:val="center"/>
+            <w:hideMark/>
+          </w:tcPr>
+          <w:p>
+            <w:r>
+              <w:t>15</w:t>
+            </w:r>
+          </w:p>
+        </w:tc>
+        <w:tc>
+          <w:tcPr>
+            <w:tcW w:w="0" w:type="auto"/>
+            <w:vAlign w:val="center"/>
+            <w:hideMark/>
+          </w:tcPr>
+          <w:p>
+            <w:r>
+              <w:rPr>
+                <w:b/>
+                <w:bCs/>
+              </w:rPr>
+              <w:t>Quais produtos têm maior risco de ruptura?</w:t>
+            </w:r>
+          </w:p>
+        </w:tc>
+        <w:tc>
+          <w:tcPr>
+            <w:tcW w:w="0" w:type="auto"/>
+            <w:vAlign w:val="center"/>
+            <w:hideMark/>
+          </w:tcPr>
+          <w:p>
+            <w:r>
+              <w:t>Ranking de risco</w:t>
+            </w:r>
+          </w:p>
+        </w:tc>
+      </w:tr>
+      <w:tr>
+        <w:trPr>
+          <w:tblCellSpacing w:w="15" w:type="dxa"/>
+        </w:trPr>
+        <w:tc>
+          <w:tcPr>
+            <w:tcW w:w="0" w:type="auto"/>
+            <w:vAlign w:val="center"/>
+            <w:hideMark/>
+          </w:tcPr>
+          <w:p>
+            <w:r>
+              <w:t>16</w:t>
+            </w:r>
+          </w:p>
+        </w:tc>
+        <w:tc>
+          <w:tcPr>
+            <w:tcW w:w="0" w:type="auto"/>
+            <w:vAlign w:val="center"/>
+            <w:hideMark/>
+          </w:tcPr>
+          <w:p>
+            <w:r>
+              <w:rPr>
+                <w:b/>
+                <w:bCs/>
+              </w:rPr>
+              <w:t>Existe algum produto com risco crítico de ruptura?</w:t>
+            </w:r>
+          </w:p>
+        </w:tc>
+        <w:tc>
+          <w:tcPr>
+            <w:tcW w:w="0" w:type="auto"/>
+            <w:vAlign w:val="center"/>
+            <w:hideMark/>
+          </w:tcPr>
+          <w:p>
+            <w:r>
+              <w:t>Classificação específica</w:t>
+            </w:r>
+          </w:p>
+        </w:tc>
+      </w:tr>
+      <w:tr>
+        <w:trPr>
+          <w:tblCellSpacing w:w="15" w:type="dxa"/>
+        </w:trPr>
+        <w:tc>
+          <w:tcPr>
+            <w:tcW w:w="0" w:type="auto"/>
+            <w:vAlign w:val="center"/>
+            <w:hideMark/>
+          </w:tcPr>
+          <w:p>
+            <w:r>
+              <w:t>17</w:t>
+            </w:r>
+          </w:p>
+        </w:tc>
+        <w:tc>
+          <w:tcPr>
+            <w:tcW w:w="0" w:type="auto"/>
+            <w:vAlign w:val="center"/>
+            <w:hideMark/>
+          </w:tcPr>
+          <w:p>
+            <w:r>
+              <w:rPr>
+                <w:b/>
+                <w:bCs/>
+              </w:rPr>
+              <w:t>Quais itens correm maior risco de ficar sem estoque?</w:t>
+            </w:r>
+          </w:p>
+        </w:tc>
+        <w:tc>
+          <w:tcPr>
+            <w:tcW w:w="0" w:type="auto"/>
+            <w:vAlign w:val="center"/>
+            <w:hideMark/>
+          </w:tcPr>
+          <w:p>
+            <w:r>
+              <w:t>“Ruptura” expressa em linguagem comum</w:t>
+            </w:r>
+          </w:p>
+        </w:tc>
+      </w:tr>
+      <w:tr>
+        <w:trPr>
+          <w:tblCellSpacing w:w="15" w:type="dxa"/>
+        </w:trPr>
+        <w:tc>
+          <w:tcPr>
+            <w:tcW w:w="0" w:type="auto"/>
+            <w:vAlign w:val="center"/>
+            <w:hideMark/>
+          </w:tcPr>
+          <w:p>
+            <w:r>
+              <w:t>18</w:t>
+            </w:r>
+          </w:p>
+        </w:tc>
+        <w:tc>
+          <w:tcPr>
+            <w:tcW w:w="0" w:type="auto"/>
+            <w:vAlign w:val="center"/>
+            <w:hideMark/>
+          </w:tcPr>
+          <w:p>
+            <w:r>
+              <w:rPr>
+                <w:b/>
+                <w:bCs/>
+              </w:rPr>
+              <w:t>Tem algum produto que pode acabar antes de chegar uma nova reposição?</w:t>
+            </w:r>
+          </w:p>
+        </w:tc>
+        <w:tc>
+          <w:tcPr>
+            <w:tcW w:w="0" w:type="auto"/>
+            <w:vAlign w:val="center"/>
+            <w:hideMark/>
+          </w:tcPr>
+          <w:p>
+            <w:r>
+              <w:t>Relação cobertura × lead time em linguagem natural</w:t>
+            </w:r>
+          </w:p>
+        </w:tc>
+      </w:tr>
+      <w:tr>
+        <w:trPr>
+          <w:tblCellSpacing w:w="15" w:type="dxa"/>
+        </w:trPr>
+        <w:tc>
+          <w:tcPr>
+            <w:tcW w:w="0" w:type="auto"/>
+            <w:vAlign w:val="center"/>
+            <w:hideMark/>
+          </w:tcPr>
+          <w:p>
+            <w:r>
+              <w:t>19</w:t>
+            </w:r>
+          </w:p>
+        </w:tc>
+        <w:tc>
+          <w:tcPr>
+            <w:tcW w:w="0" w:type="auto"/>
+            <w:vAlign w:val="center"/>
+            <w:hideMark/>
+          </w:tcPr>
+          <w:p>
+            <w:r>
+              <w:rPr>
+                <w:b/>
+                <w:bCs/>
+              </w:rPr>
+              <w:t>Como está o risco de ruptura dos nossos produtos?</w:t>
+            </w:r>
+          </w:p>
+        </w:tc>
+        <w:tc>
+          <w:tcPr>
+            <w:tcW w:w="0" w:type="auto"/>
+            <w:vAlign w:val="center"/>
+            <w:hideMark/>
+          </w:tcPr>
+          <w:p>
+            <w:r>
+              <w:t>Pergunta geral</w:t>
+            </w:r>
+          </w:p>
+        </w:tc>
+      </w:tr>
+      <w:tr>
+        <w:trPr>
+          <w:tblCellSpacing w:w="15" w:type="dxa"/>
+        </w:trPr>
+        <w:tc>
+          <w:tcPr>
+            <w:tcW w:w="0" w:type="auto"/>
+            <w:vAlign w:val="center"/>
+            <w:hideMark/>
+          </w:tcPr>
+          <w:p>
+            <w:r>
+              <w:lastRenderedPageBreak/>
+              <w:t>20</w:t>
+            </w:r>
+          </w:p>
+        </w:tc>
+        <w:tc>
+          <w:tcPr>
+            <w:tcW w:w="0" w:type="auto"/>
+            <w:vAlign w:val="center"/>
+            <w:hideMark/>
+          </w:tcPr>
+          <w:p>
+            <w:r>
+              <w:rPr>
+                <w:b/>
+                <w:bCs/>
+              </w:rPr>
+              <w:t>Quais produtos tiveram menor giro entre maio e julho de 2026?</w:t>
+            </w:r>
+          </w:p>
+        </w:tc>
+        <w:tc>
+          <w:tcPr>
+            <w:tcW w:w="0" w:type="auto"/>
+            <w:vAlign w:val="center"/>
+            <w:hideMark/>
+          </w:tcPr>
+          <w:p>
+            <w:r>
+              <w:t>Baixo giro em período já validado</w:t>
+            </w:r>
+          </w:p>
+        </w:tc>
+      </w:tr>
+      <w:tr>
+        <w:trPr>
+          <w:tblCellSpacing w:w="15" w:type="dxa"/>
+        </w:trPr>
+        <w:tc>
+          <w:tcPr>
+            <w:tcW w:w="0" w:type="auto"/>
+            <w:vAlign w:val="center"/>
+            <w:hideMark/>
+          </w:tcPr>
+          <w:p>
+            <w:r>
+              <w:t>21</w:t>
+            </w:r>
+          </w:p>
+        </w:tc>
+        <w:tc>
+          <w:tcPr>
+            <w:tcW w:w="0" w:type="auto"/>
+            <w:vAlign w:val="center"/>
+            <w:hideMark/>
+          </w:tcPr>
+          <w:p>
+            <w:r>
+              <w:rPr>
+                <w:b/>
+                <w:bCs/>
+              </w:rPr>
+              <w:t>Quais produtos tiveram menor giro entre janeiro e março de 2026?</w:t>
+            </w:r>
+          </w:p>
+        </w:tc>
+        <w:tc>
+          <w:tcPr>
+            <w:tcW w:w="0" w:type="auto"/>
+            <w:vAlign w:val="center"/>
+            <w:hideMark/>
+          </w:tcPr>
+          <w:p>
+            <w:r>
+              <w:t>Período de 3 meses já validado</w:t>
+            </w:r>
+          </w:p>
+        </w:tc>
+      </w:tr>
+      <w:tr>
+        <w:trPr>
+          <w:tblCellSpacing w:w="15" w:type="dxa"/>
+        </w:trPr>
+        <w:tc>
+          <w:tcPr>
+            <w:tcW w:w="0" w:type="auto"/>
+            <w:vAlign w:val="center"/>
+            <w:hideMark/>
+          </w:tcPr>
+          <w:p>
+            <w:r>
+              <w:t>22</w:t>
+            </w:r>
+          </w:p>
+        </w:tc>
+        <w:tc>
+          <w:tcPr>
+            <w:tcW w:w="0" w:type="auto"/>
+            <w:vAlign w:val="center"/>
+            <w:hideMark/>
+          </w:tcPr>
+          <w:p>
+            <w:r>
+              <w:rPr>
+                <w:b/>
+                <w:bCs/>
+              </w:rPr>
+              <w:t>Quais produtos tiveram menor giro entre janeiro e junho de 2026?</w:t>
+            </w:r>
+          </w:p>
+        </w:tc>
+        <w:tc>
+          <w:tcPr>
+            <w:tcW w:w="0" w:type="auto"/>
+            <w:vAlign w:val="center"/>
+            <w:hideMark/>
+          </w:tcPr>
+          <w:p>
+            <w:r>
+              <w:t>Período de 6 meses</w:t>
+            </w:r>
+          </w:p>
+        </w:tc>
+      </w:tr>
+      <w:tr>
+        <w:trPr>
+          <w:tblCellSpacing w:w="15" w:type="dxa"/>
+        </w:trPr>
+        <w:tc>
+          <w:tcPr>
+            <w:tcW w:w="0" w:type="auto"/>
+            <w:vAlign w:val="center"/>
+            <w:hideMark/>
+          </w:tcPr>
+          <w:p>
+            <w:r>
+              <w:t>23</w:t>
+            </w:r>
+          </w:p>
+        </w:tc>
+        <w:tc>
+          <w:tcPr>
+            <w:tcW w:w="0" w:type="auto"/>
+            <w:vAlign w:val="center"/>
+            <w:hideMark/>
+          </w:tcPr>
+          <w:p>
+            <w:r>
+              <w:rPr>
+                <w:b/>
+                <w:bCs/>
+              </w:rPr>
+              <w:t>Quais produtos tiveram menor giro entre novembro de 2025 e fevereiro de 2026?</w:t>
+            </w:r>
+          </w:p>
+        </w:tc>
+        <w:tc>
+          <w:tcPr>
+            <w:tcW w:w="0" w:type="auto"/>
+            <w:vAlign w:val="center"/>
+            <w:hideMark/>
+          </w:tcPr>
+          <w:p>
+            <w:r>
+              <w:rPr>
+                <w:rFonts w:ascii="Segoe UI Emoji" w:hAnsi="Segoe UI Emoji" w:cs="Segoe UI Emoji"/>
+              </w:rPr>
+              <w:t>⭐</w:t>
+            </w:r>
+            <w:r>
+              <w:t xml:space="preserve"> Virada de ano</w:t>
+            </w:r>
+          </w:p>
+        </w:tc>
+      </w:tr>
+      <w:tr>
+        <w:trPr>
+          <w:tblCellSpacing w:w="15" w:type="dxa"/>
+        </w:trPr>
+        <w:tc>
+          <w:tcPr>
+            <w:tcW w:w="0" w:type="auto"/>
+            <w:vAlign w:val="center"/>
+            <w:hideMark/>
+          </w:tcPr>
+          <w:p>
+            <w:r>
+              <w:t>24</w:t>
+            </w:r>
+          </w:p>
+        </w:tc>
+        <w:tc>
+          <w:tcPr>
+            <w:tcW w:w="0" w:type="auto"/>
+            <w:vAlign w:val="center"/>
+            <w:hideMark/>
+          </w:tcPr>
+          <w:p>
+            <w:r>
+              <w:rPr>
+                <w:b/>
+                <w:bCs/>
+              </w:rPr>
+              <w:t>Entre novembro de 2025 e fevereiro de 2026, quais itens apresentaram menor movimentação em relação ao estoque?</w:t>
+            </w:r>
+          </w:p>
+        </w:tc>
+        <w:tc>
+          <w:tcPr>
+            <w:tcW w:w="0" w:type="auto"/>
+            <w:vAlign w:val="center"/>
+            <w:hideMark/>
+          </w:tcPr>
+          <w:p>
+            <w:r>
+              <w:rPr>
+                <w:rFonts w:ascii="Segoe UI Emoji" w:hAnsi="Segoe UI Emoji" w:cs="Segoe UI Emoji"/>
+              </w:rPr>
+              <w:t>⭐</w:t>
+            </w:r>
+            <w:r>
+              <w:t xml:space="preserve"> Virada de ano sem dizer “menor giro”</w:t>
+            </w:r>
+          </w:p>
+        </w:tc>
+      </w:tr>
+      <w:tr>
+        <w:trPr>
+          <w:tblCellSpacing w:w="15" w:type="dxa"/>
+        </w:trPr>
+        <w:tc>
+          <w:tcPr>
+            <w:tcW w:w="0" w:type="auto"/>
+            <w:vAlign w:val="center"/>
+            <w:hideMark/>
+          </w:tcPr>
+          <w:p>
+            <w:r>
+              <w:t>25</w:t>
+            </w:r>
+          </w:p>
+        </w:tc>
+        <w:tc>
+          <w:tcPr>
+            <w:tcW w:w="0" w:type="auto"/>
+            <w:vAlign w:val="center"/>
+            <w:hideMark/>
+          </w:tcPr>
+          <w:p>
+            <w:r>
+              <w:rPr>
+                <w:b/>
+                <w:bCs/>
+              </w:rPr>
+              <w:t>Quais produtos estão com baixo giro?</w:t>
+            </w:r>
+          </w:p>
+        </w:tc>
+        <w:tc>
+          <w:tcPr>
+            <w:tcW w:w="0" w:type="auto"/>
+            <w:vAlign w:val="center"/>
+            <w:hideMark/>
+          </w:tcPr>
+          <w:p>
+            <w:r>
+              <w:t>Período padrão automático</w:t>
+            </w:r>
+          </w:p>
+        </w:tc>
+      </w:tr>
+      <w:tr>
+        <w:trPr>
+          <w:tblCellSpacing w:w="15" w:type="dxa"/>
+        </w:trPr>
+        <w:tc>
+          <w:tcPr>
+            <w:tcW w:w="0" w:type="auto"/>
+            <w:vAlign w:val="center"/>
+            <w:hideMark/>
+          </w:tcPr>
+          <w:p>
+            <w:r>
+              <w:t>26</w:t>
+            </w:r>
+          </w:p>
+        </w:tc>
+        <w:tc>
+          <w:tcPr>
+            <w:tcW w:w="0" w:type="auto"/>
+            <w:vAlign w:val="center"/>
+            <w:hideMark/>
+          </w:tcPr>
+          <w:p>
+            <w:r>
+              <w:rPr>
+                <w:b/>
+                <w:bCs/>
+              </w:rPr>
+              <w:t>Tem algum produto encalhado?</w:t>
+            </w:r>
+          </w:p>
+        </w:tc>
+        <w:tc>
+          <w:tcPr>
+            <w:tcW w:w="0" w:type="auto"/>
+            <w:vAlign w:val="center"/>
+            <w:hideMark/>
+          </w:tcPr>
+          <w:p>
+            <w:r>
+              <w:t>Sinônimo que deve acionar baixo giro, mas responder como “candidato”</w:t>
+            </w:r>
+          </w:p>
+        </w:tc>
+      </w:tr>
+      <w:tr>
+        <w:trPr>
+          <w:tblCellSpacing w:w="15" w:type="dxa"/>
+        </w:trPr>
+        <w:tc>
+          <w:tcPr>
+            <w:tcW w:w="0" w:type="auto"/>
+            <w:vAlign w:val="center"/>
+            <w:hideMark/>
+          </w:tcPr>
+          <w:p>
+            <w:r>
+              <w:t>27</w:t>
+            </w:r>
+          </w:p>
+        </w:tc>
+        <w:tc>
+          <w:tcPr>
+            <w:tcW w:w="0" w:type="auto"/>
+            <w:vAlign w:val="center"/>
+            <w:hideMark/>
+          </w:tcPr>
+          <w:p>
+            <w:r>
+              <w:rPr>
+                <w:b/>
+                <w:bCs/>
+              </w:rPr>
+              <w:t>Quais itens estão vendendo mais devagar em relação ao histórico?</w:t>
+            </w:r>
+          </w:p>
+        </w:tc>
+        <w:tc>
+          <w:tcPr>
+            <w:tcW w:w="0" w:type="auto"/>
+            <w:vAlign w:val="center"/>
+            <w:hideMark/>
+          </w:tcPr>
+          <w:p>
+            <w:r>
+              <w:t>Desaceleração sem usar “baixo giro”</w:t>
+            </w:r>
+          </w:p>
+        </w:tc>
+      </w:tr>
+      <w:tr>
+        <w:trPr>
+          <w:tblCellSpacing w:w="15" w:type="dxa"/>
+        </w:trPr>
+        <w:tc>
+          <w:tcPr>
+            <w:tcW w:w="0" w:type="auto"/>
+            <w:vAlign w:val="center"/>
+            <w:hideMark/>
+          </w:tcPr>
+          <w:p>
+            <w:r>
+              <w:t>28</w:t>
+            </w:r>
+          </w:p>
+        </w:tc>
+        <w:tc>
+          <w:tcPr>
+            <w:tcW w:w="0" w:type="auto"/>
+            <w:vAlign w:val="center"/>
+            <w:hideMark/>
+          </w:tcPr>
+          <w:p>
+            <w:r>
+              <w:rPr>
+                <w:b/>
+                <w:bCs/>
+              </w:rPr>
+              <w:t>Quais produtos tiveram desaceleração nas vendas entre janeiro e junho de 2026 em relação ao estoque?</w:t>
+            </w:r>
+          </w:p>
+        </w:tc>
+        <w:tc>
+          <w:tcPr>
+            <w:tcW w:w="0" w:type="auto"/>
+            <w:vAlign w:val="center"/>
+            <w:hideMark/>
+          </w:tcPr>
+          <w:p>
+            <w:r>
+              <w:t>Período + interpretação</w:t>
+            </w:r>
+          </w:p>
+        </w:tc>
+      </w:tr>
+      <w:tr>
+        <w:trPr>
+          <w:tblCellSpacing w:w="15" w:type="dxa"/>
+        </w:trPr>
+        <w:tc>
+          <w:tcPr>
+            <w:tcW w:w="0" w:type="auto"/>
+            <w:vAlign w:val="center"/>
+            <w:hideMark/>
+          </w:tcPr>
+          <w:p>
+            <w:r>
+              <w:t>29</w:t>
+            </w:r>
+          </w:p>
+        </w:tc>
+        <w:tc>
+          <w:tcPr>
+            <w:tcW w:w="0" w:type="auto"/>
+            <w:vAlign w:val="center"/>
+            <w:hideMark/>
+          </w:tcPr>
+          <w:p>
+            <w:r>
+              <w:rPr>
+                <w:b/>
+                <w:bCs/>
+              </w:rPr>
+              <w:t>Quais produtos podem ser considerados candidatos a menor giro entre novembro de 2025 e fevereiro de 2026?</w:t>
+            </w:r>
+          </w:p>
+        </w:tc>
+        <w:tc>
+          <w:tcPr>
+            <w:tcW w:w="0" w:type="auto"/>
+            <w:vAlign w:val="center"/>
+            <w:hideMark/>
+          </w:tcPr>
+          <w:p>
+            <w:r>
+              <w:t>Terminologia exata da metodologia</w:t>
+            </w:r>
+          </w:p>
+        </w:tc>
+      </w:tr>
+      <w:tr>
+        <w:trPr>
+          <w:tblCellSpacing w:w="15" w:type="dxa"/>
+        </w:trPr>
+        <w:tc>
+          <w:tcPr>
+            <w:tcW w:w="0" w:type="auto"/>
+            <w:vAlign w:val="center"/>
+            <w:hideMark/>
+          </w:tcPr>
+          <w:p>
+            <w:r>
+              <w:t>30</w:t>
+            </w:r>
+          </w:p>
+        </w:tc>
+        <w:tc>
+          <w:tcPr>
+            <w:tcW w:w="0" w:type="auto"/>
+            <w:vAlign w:val="center"/>
+            <w:hideMark/>
+          </w:tcPr>
+          <w:p>
+            <w:r>
+              <w:rPr>
+                <w:b/>
+                <w:bCs/>
+              </w:rPr>
+              <w:t>Quais produtos parecem estar com estoque alto em relação ao ritmo de vendas entre janeiro e março de 2026?</w:t>
+            </w:r>
+          </w:p>
+        </w:tc>
+        <w:tc>
+          <w:tcPr>
+            <w:tcW w:w="0" w:type="auto"/>
+            <w:vAlign w:val="center"/>
+            <w:hideMark/>
+          </w:tcPr>
+          <w:p>
+            <w:r>
+              <w:t>Se consegue inferir a ferramenta a partir do conceito</w:t>
+            </w:r>
+          </w:p>
+        </w:tc>
+      </w:tr>
+    </w:tbl>
+    <w:p/>
     <w:sectPr>
       <w:pgSz w:w="11906" w:h="16838"/>
       <w:pgMar w:top="1417" w:right="1701" w:bottom="1417" w:left="1701" w:header="708" w:footer="708" w:gutter="0"/>
@@ -1384,7 +2960,6 @@
   <w:style w:type="character" w:default="1" w:styleId="Fontepargpadro">
     <w:name w:val="Default Paragraph Font"/>
     <w:uiPriority w:val="1"/>
-    <w:semiHidden/>
     <w:unhideWhenUsed/>
   </w:style>
   <w:style w:type="table" w:default="1" w:styleId="Tabelanormal">

</xml_diff>

<commit_message>
Atualiza o documento de próximos passos com o status das etapas de desenvolvimento, incluindo a finalização da camada de logística e a implementação de funções financeiras. Adiciona novas sugestões de perguntas no frontend e ajusta a lógica de resposta da IA para incluir a nova sugestão "que perguntas posso fazer". Remove o arquivo de dados de compras da Urban Style, que não é mais necessário. Melhora a apresentação das sugestões de perguntas no frontend com novas classes CSS.
</commit_message>
<xml_diff>
--- a/DOCUMENTOS/PROXIMOS PASSOS.docx
+++ b/DOCUMENTOS/PROXIMOS PASSOS.docx
@@ -3,207 +3,1170 @@
 <w:document xmlns:wpc="http://schemas.microsoft.com/office/word/2010/wordprocessingCanvas" xmlns:cx="http://schemas.microsoft.com/office/drawing/2014/chartex" xmlns:cx1="http://schemas.microsoft.com/office/drawing/2015/9/8/chartex" xmlns:cx2="http://schemas.microsoft.com/office/drawing/2015/10/21/chartex" xmlns:cx3="http://schemas.microsoft.com/office/drawing/2016/5/9/chartex" xmlns:cx4="http://schemas.microsoft.com/office/drawing/2016/5/10/chartex" xmlns:cx5="http://schemas.microsoft.com/office/drawing/2016/5/11/chartex" xmlns:cx6="http://schemas.microsoft.com/office/drawing/2016/5/12/chartex" xmlns:cx7="http://schemas.microsoft.com/office/drawing/2016/5/13/chartex" xmlns:cx8="http://schemas.microsoft.com/office/drawing/2016/5/14/chartex" xmlns:mc="http://schemas.openxmlformats.org/markup-compatibility/2006" xmlns:aink="http://schemas.microsoft.com/office/drawing/2016/ink" xmlns:am3d="http://schemas.microsoft.com/office/drawing/2017/model3d" xmlns:o="urn:schemas-microsoft-com:office:office" xmlns:oel="http://schemas.microsoft.com/office/2019/extlst" xmlns:r="http://schemas.openxmlformats.org/officeDocument/2006/relationships" xmlns:m="http://schemas.openxmlformats.org/officeDocument/2006/math" xmlns:v="urn:schemas-microsoft-com:vml" xmlns:wp14="http://schemas.microsoft.com/office/word/2010/wordprocessingDrawing" xmlns:wp="http://schemas.openxmlformats.org/drawingml/2006/wordprocessingDrawing" xmlns:w10="urn:schemas-microsoft-com:office:word" xmlns:w="http://schemas.openxmlformats.org/wordprocessingml/2006/main" xmlns:w14="http://schemas.microsoft.com/office/word/2010/wordml" xmlns:w15="http://schemas.microsoft.com/office/word/2012/wordml" xmlns:w16cex="http://schemas.microsoft.com/office/word/2018/wordml/cex" xmlns:w16cid="http://schemas.microsoft.com/office/word/2016/wordml/cid" xmlns:w16="http://schemas.microsoft.com/office/word/2018/wordml" xmlns:w16du="http://schemas.microsoft.com/office/word/2023/wordml/word16du" xmlns:w16sdtdh="http://schemas.microsoft.com/office/word/2020/wordml/sdtdatahash" xmlns:w16sdtfl="http://schemas.microsoft.com/office/word/2024/wordml/sdtformatlock" xmlns:w16se="http://schemas.microsoft.com/office/word/2015/wordml/symex" xmlns:wpg="http://schemas.microsoft.com/office/word/2010/wordprocessingGroup" xmlns:wpi="http://schemas.microsoft.com/office/word/2010/wordprocessingInk" xmlns:wne="http://schemas.microsoft.com/office/word/2006/wordml" xmlns:wps="http://schemas.microsoft.com/office/word/2010/wordprocessingShape" mc:Ignorable="w14 w15 w16se w16cid w16 w16cex w16sdtdh w16sdtfl w16du wp14">
   <w:body>
     <w:p>
-      <w:r>
+      <w:pPr>
         <w:rPr>
-          <w:highlight w:val="yellow"/>
+          <w:b/>
+          <w:bCs/>
         </w:rPr>
-        <w:t xml:space="preserve">Etapa 1 — Criar a camada de IA e provar a interpretação da intenção. Vamos começar com uma única ferramenta, justamente aquela que já funciona: </w:t>
-      </w:r>
-      <w:proofErr w:type="spellStart"/>
+      </w:pPr>
       <w:r>
         <w:rPr>
-          <w:highlight w:val="yellow"/>
+          <w:b/>
+          <w:bCs/>
         </w:rPr>
-        <w:t>analisar_</w:t>
-      </w:r>
-      <w:proofErr w:type="gramStart"/>
-      <w:r>
+        <w:t>O que já está feito (não reabrir no MVP)</w:t>
+      </w:r>
+    </w:p>
+    <w:p>
+      <w:r>
+        <w:t>Logística (chat) — encerrada e validada: reposição, risco de ruptura, pedidos atrasados (reconstrução histórica), baixo giro, fornecedores por taxa de atraso.</w:t>
+      </w:r>
+    </w:p>
+    <w:p>
+      <w:r>
+        <w:t>Financeiro (chat) — os 6 indicadores + camada de análise:</w:t>
+      </w:r>
+    </w:p>
+    <w:tbl>
+      <w:tblPr>
+        <w:tblW w:w="0" w:type="auto"/>
+        <w:tblCellSpacing w:w="15" w:type="dxa"/>
+        <w:shd w:val="clear" w:color="auto" w:fill="282C34"/>
+        <w:tblCellMar>
+          <w:top w:w="15" w:type="dxa"/>
+          <w:left w:w="15" w:type="dxa"/>
+          <w:bottom w:w="15" w:type="dxa"/>
+          <w:right w:w="15" w:type="dxa"/>
+        </w:tblCellMar>
+        <w:tblLook w:val="04A0" w:firstRow="1" w:lastRow="0" w:firstColumn="1" w:lastColumn="0" w:noHBand="0" w:noVBand="1"/>
+      </w:tblPr>
+      <w:tblGrid>
+        <w:gridCol w:w="6913"/>
+        <w:gridCol w:w="995"/>
+      </w:tblGrid>
+      <w:tr>
+        <w:trPr>
+          <w:tblHeader/>
+          <w:tblCellSpacing w:w="15" w:type="dxa"/>
+        </w:trPr>
+        <w:tc>
+          <w:tcPr>
+            <w:tcW w:w="0" w:type="auto"/>
+            <w:noWrap/>
+            <w:tcMar>
+              <w:top w:w="90" w:type="dxa"/>
+              <w:left w:w="150" w:type="dxa"/>
+              <w:bottom w:w="90" w:type="dxa"/>
+              <w:right w:w="150" w:type="dxa"/>
+            </w:tcMar>
+            <w:hideMark/>
+          </w:tcPr>
+          <w:p>
+            <w:pPr>
+              <w:rPr>
+                <w:b/>
+                <w:bCs/>
+              </w:rPr>
+            </w:pPr>
+            <w:r>
+              <w:rPr>
+                <w:b/>
+                <w:bCs/>
+              </w:rPr>
+              <w:t>Camada</w:t>
+            </w:r>
+          </w:p>
+        </w:tc>
+        <w:tc>
+          <w:tcPr>
+            <w:tcW w:w="0" w:type="auto"/>
+            <w:noWrap/>
+            <w:tcMar>
+              <w:top w:w="90" w:type="dxa"/>
+              <w:left w:w="150" w:type="dxa"/>
+              <w:bottom w:w="90" w:type="dxa"/>
+              <w:right w:w="150" w:type="dxa"/>
+            </w:tcMar>
+            <w:hideMark/>
+          </w:tcPr>
+          <w:p>
+            <w:pPr>
+              <w:rPr>
+                <w:b/>
+                <w:bCs/>
+              </w:rPr>
+            </w:pPr>
+            <w:r>
+              <w:rPr>
+                <w:b/>
+                <w:bCs/>
+              </w:rPr>
+              <w:t>Status</w:t>
+            </w:r>
+          </w:p>
+        </w:tc>
+      </w:tr>
+      <w:tr>
+        <w:trPr>
+          <w:tblCellSpacing w:w="15" w:type="dxa"/>
+        </w:trPr>
+        <w:tc>
+          <w:tcPr>
+            <w:tcW w:w="0" w:type="auto"/>
+            <w:shd w:val="clear" w:color="auto" w:fill="282C34"/>
+            <w:tcMar>
+              <w:top w:w="90" w:type="dxa"/>
+              <w:left w:w="150" w:type="dxa"/>
+              <w:bottom w:w="90" w:type="dxa"/>
+              <w:right w:w="150" w:type="dxa"/>
+            </w:tcMar>
+            <w:hideMark/>
+          </w:tcPr>
+          <w:p>
+            <w:r>
+              <w:t>Faturamento, despesa, lucro (fat − CMV − opex), AR, AP, fluxo de caixa</w:t>
+            </w:r>
+          </w:p>
+        </w:tc>
+        <w:tc>
+          <w:tcPr>
+            <w:tcW w:w="0" w:type="auto"/>
+            <w:shd w:val="clear" w:color="auto" w:fill="282C34"/>
+            <w:tcMar>
+              <w:top w:w="90" w:type="dxa"/>
+              <w:left w:w="150" w:type="dxa"/>
+              <w:bottom w:w="90" w:type="dxa"/>
+              <w:right w:w="150" w:type="dxa"/>
+            </w:tcMar>
+            <w:hideMark/>
+          </w:tcPr>
+          <w:p>
+            <w:r>
+              <w:t>Feito</w:t>
+            </w:r>
+          </w:p>
+        </w:tc>
+      </w:tr>
+      <w:tr>
+        <w:trPr>
+          <w:tblCellSpacing w:w="15" w:type="dxa"/>
+        </w:trPr>
+        <w:tc>
+          <w:tcPr>
+            <w:tcW w:w="0" w:type="auto"/>
+            <w:shd w:val="clear" w:color="auto" w:fill="282C34"/>
+            <w:tcMar>
+              <w:top w:w="90" w:type="dxa"/>
+              <w:left w:w="150" w:type="dxa"/>
+              <w:bottom w:w="90" w:type="dxa"/>
+              <w:right w:w="150" w:type="dxa"/>
+            </w:tcMar>
+            <w:hideMark/>
+          </w:tcPr>
+          <w:p>
+            <w:r>
+              <w:t>Comparar períodos</w:t>
+            </w:r>
+          </w:p>
+        </w:tc>
+        <w:tc>
+          <w:tcPr>
+            <w:tcW w:w="0" w:type="auto"/>
+            <w:shd w:val="clear" w:color="auto" w:fill="282C34"/>
+            <w:tcMar>
+              <w:top w:w="90" w:type="dxa"/>
+              <w:left w:w="150" w:type="dxa"/>
+              <w:bottom w:w="90" w:type="dxa"/>
+              <w:right w:w="150" w:type="dxa"/>
+            </w:tcMar>
+            <w:hideMark/>
+          </w:tcPr>
+          <w:p>
+            <w:r>
+              <w:t>Feito</w:t>
+            </w:r>
+          </w:p>
+        </w:tc>
+      </w:tr>
+      <w:tr>
+        <w:trPr>
+          <w:tblCellSpacing w:w="15" w:type="dxa"/>
+        </w:trPr>
+        <w:tc>
+          <w:tcPr>
+            <w:tcW w:w="0" w:type="auto"/>
+            <w:shd w:val="clear" w:color="auto" w:fill="282C34"/>
+            <w:tcMar>
+              <w:top w:w="90" w:type="dxa"/>
+              <w:left w:w="150" w:type="dxa"/>
+              <w:bottom w:w="90" w:type="dxa"/>
+              <w:right w:w="150" w:type="dxa"/>
+            </w:tcMar>
+            <w:hideMark/>
+          </w:tcPr>
+          <w:p>
+            <w:r>
+              <w:t>“Por que o lucro caiu?” (explicar_variacao_lucro)</w:t>
+            </w:r>
+          </w:p>
+        </w:tc>
+        <w:tc>
+          <w:tcPr>
+            <w:tcW w:w="0" w:type="auto"/>
+            <w:shd w:val="clear" w:color="auto" w:fill="282C34"/>
+            <w:tcMar>
+              <w:top w:w="90" w:type="dxa"/>
+              <w:left w:w="150" w:type="dxa"/>
+              <w:bottom w:w="90" w:type="dxa"/>
+              <w:right w:w="150" w:type="dxa"/>
+            </w:tcMar>
+            <w:hideMark/>
+          </w:tcPr>
+          <w:p>
+            <w:r>
+              <w:t>Feito</w:t>
+            </w:r>
+          </w:p>
+        </w:tc>
+      </w:tr>
+      <w:tr>
+        <w:trPr>
+          <w:tblCellSpacing w:w="15" w:type="dxa"/>
+        </w:trPr>
+        <w:tc>
+          <w:tcPr>
+            <w:tcW w:w="0" w:type="auto"/>
+            <w:shd w:val="clear" w:color="auto" w:fill="282C34"/>
+            <w:tcMar>
+              <w:top w:w="90" w:type="dxa"/>
+              <w:left w:w="150" w:type="dxa"/>
+              <w:bottom w:w="90" w:type="dxa"/>
+              <w:right w:w="150" w:type="dxa"/>
+            </w:tcMar>
+            <w:hideMark/>
+          </w:tcPr>
+          <w:p>
+            <w:r>
+              <w:t>“E se” despesa e “e se” CMV</w:t>
+            </w:r>
+          </w:p>
+        </w:tc>
+        <w:tc>
+          <w:tcPr>
+            <w:tcW w:w="0" w:type="auto"/>
+            <w:shd w:val="clear" w:color="auto" w:fill="282C34"/>
+            <w:tcMar>
+              <w:top w:w="90" w:type="dxa"/>
+              <w:left w:w="150" w:type="dxa"/>
+              <w:bottom w:w="90" w:type="dxa"/>
+              <w:right w:w="150" w:type="dxa"/>
+            </w:tcMar>
+            <w:hideMark/>
+          </w:tcPr>
+          <w:p>
+            <w:r>
+              <w:t>Feito</w:t>
+            </w:r>
+          </w:p>
+        </w:tc>
+      </w:tr>
+      <w:tr>
+        <w:trPr>
+          <w:tblCellSpacing w:w="15" w:type="dxa"/>
+        </w:trPr>
+        <w:tc>
+          <w:tcPr>
+            <w:tcW w:w="0" w:type="auto"/>
+            <w:shd w:val="clear" w:color="auto" w:fill="282C34"/>
+            <w:tcMar>
+              <w:top w:w="90" w:type="dxa"/>
+              <w:left w:w="150" w:type="dxa"/>
+              <w:bottom w:w="90" w:type="dxa"/>
+              <w:right w:w="150" w:type="dxa"/>
+            </w:tcMar>
+            <w:hideMark/>
+          </w:tcPr>
+          <w:p>
+            <w:r>
+              <w:t>Glossário (CMV, competência vs caixa, etc.)</w:t>
+            </w:r>
+          </w:p>
+        </w:tc>
+        <w:tc>
+          <w:tcPr>
+            <w:tcW w:w="0" w:type="auto"/>
+            <w:shd w:val="clear" w:color="auto" w:fill="282C34"/>
+            <w:tcMar>
+              <w:top w:w="90" w:type="dxa"/>
+              <w:left w:w="150" w:type="dxa"/>
+              <w:bottom w:w="90" w:type="dxa"/>
+              <w:right w:w="150" w:type="dxa"/>
+            </w:tcMar>
+            <w:hideMark/>
+          </w:tcPr>
+          <w:p>
+            <w:r>
+              <w:t>Feito</w:t>
+            </w:r>
+          </w:p>
+        </w:tc>
+      </w:tr>
+      <w:tr>
+        <w:trPr>
+          <w:tblCellSpacing w:w="15" w:type="dxa"/>
+        </w:trPr>
+        <w:tc>
+          <w:tcPr>
+            <w:tcW w:w="0" w:type="auto"/>
+            <w:shd w:val="clear" w:color="auto" w:fill="282C34"/>
+            <w:tcMar>
+              <w:top w:w="90" w:type="dxa"/>
+              <w:left w:w="150" w:type="dxa"/>
+              <w:bottom w:w="90" w:type="dxa"/>
+              <w:right w:w="150" w:type="dxa"/>
+            </w:tcMar>
+            <w:hideMark/>
+          </w:tcPr>
+          <w:p>
+            <w:r>
+              <w:t>Sugestões de onboarding</w:t>
+            </w:r>
+          </w:p>
+        </w:tc>
+        <w:tc>
+          <w:tcPr>
+            <w:tcW w:w="0" w:type="auto"/>
+            <w:shd w:val="clear" w:color="auto" w:fill="282C34"/>
+            <w:tcMar>
+              <w:top w:w="90" w:type="dxa"/>
+              <w:left w:w="150" w:type="dxa"/>
+              <w:bottom w:w="90" w:type="dxa"/>
+              <w:right w:w="150" w:type="dxa"/>
+            </w:tcMar>
+            <w:hideMark/>
+          </w:tcPr>
+          <w:p>
+            <w:r>
+              <w:t>Feito</w:t>
+            </w:r>
+          </w:p>
+        </w:tc>
+      </w:tr>
+    </w:tbl>
+    <w:p>
+      <w:r>
+        <w:t>Arquitetura que vale para o Dashboard também: o backend calcula; o frontend só desenha; a LLM não entra nos gráficos.</w:t>
+      </w:r>
+    </w:p>
+    <w:p>
+      <w:r>
+        <w:t>1. Dashboard — maior buraco do MVP (prioridade)</w:t>
+      </w:r>
+    </w:p>
+    <w:p>
+      <w:r>
+        <w:t>2. Copiloto — o que ainda é casca (não é indicador novo)</w:t>
+      </w:r>
+    </w:p>
+    <w:p>
+      <w:r>
+        <w:t>Útil na demo, mas não é o próximo bloco grande:</w:t>
+      </w:r>
+    </w:p>
+    <w:tbl>
+      <w:tblPr>
+        <w:tblW w:w="0" w:type="auto"/>
+        <w:tblCellSpacing w:w="15" w:type="dxa"/>
+        <w:shd w:val="clear" w:color="auto" w:fill="282C34"/>
+        <w:tblCellMar>
+          <w:top w:w="15" w:type="dxa"/>
+          <w:left w:w="15" w:type="dxa"/>
+          <w:bottom w:w="15" w:type="dxa"/>
+          <w:right w:w="15" w:type="dxa"/>
+        </w:tblCellMar>
+        <w:tblLook w:val="04A0" w:firstRow="1" w:lastRow="0" w:firstColumn="1" w:lastColumn="0" w:noHBand="0" w:noVBand="1"/>
+      </w:tblPr>
+      <w:tblGrid>
+        <w:gridCol w:w="1820"/>
+        <w:gridCol w:w="3687"/>
+        <w:gridCol w:w="2997"/>
+      </w:tblGrid>
+      <w:tr>
+        <w:trPr>
+          <w:tblHeader/>
+          <w:tblCellSpacing w:w="15" w:type="dxa"/>
+        </w:trPr>
+        <w:tc>
+          <w:tcPr>
+            <w:tcW w:w="0" w:type="auto"/>
+            <w:noWrap/>
+            <w:tcMar>
+              <w:top w:w="90" w:type="dxa"/>
+              <w:left w:w="150" w:type="dxa"/>
+              <w:bottom w:w="90" w:type="dxa"/>
+              <w:right w:w="150" w:type="dxa"/>
+            </w:tcMar>
+            <w:hideMark/>
+          </w:tcPr>
+          <w:p>
+            <w:pPr>
+              <w:rPr>
+                <w:b/>
+                <w:bCs/>
+              </w:rPr>
+            </w:pPr>
+            <w:r>
+              <w:rPr>
+                <w:b/>
+                <w:bCs/>
+              </w:rPr>
+              <w:t>Item</w:t>
+            </w:r>
+          </w:p>
+        </w:tc>
+        <w:tc>
+          <w:tcPr>
+            <w:tcW w:w="0" w:type="auto"/>
+            <w:noWrap/>
+            <w:tcMar>
+              <w:top w:w="90" w:type="dxa"/>
+              <w:left w:w="150" w:type="dxa"/>
+              <w:bottom w:w="90" w:type="dxa"/>
+              <w:right w:w="150" w:type="dxa"/>
+            </w:tcMar>
+            <w:hideMark/>
+          </w:tcPr>
+          <w:p>
+            <w:pPr>
+              <w:rPr>
+                <w:b/>
+                <w:bCs/>
+              </w:rPr>
+            </w:pPr>
+            <w:r>
+              <w:rPr>
+                <w:b/>
+                <w:bCs/>
+              </w:rPr>
+              <w:t>Situação</w:t>
+            </w:r>
+          </w:p>
+        </w:tc>
+        <w:tc>
+          <w:tcPr>
+            <w:tcW w:w="0" w:type="auto"/>
+            <w:noWrap/>
+            <w:tcMar>
+              <w:top w:w="90" w:type="dxa"/>
+              <w:left w:w="150" w:type="dxa"/>
+              <w:bottom w:w="90" w:type="dxa"/>
+              <w:right w:w="150" w:type="dxa"/>
+            </w:tcMar>
+            <w:hideMark/>
+          </w:tcPr>
+          <w:p>
+            <w:pPr>
+              <w:rPr>
+                <w:b/>
+                <w:bCs/>
+              </w:rPr>
+            </w:pPr>
+            <w:r>
+              <w:rPr>
+                <w:b/>
+                <w:bCs/>
+              </w:rPr>
+              <w:t>MVP?</w:t>
+            </w:r>
+          </w:p>
+        </w:tc>
+      </w:tr>
+      <w:tr>
+        <w:trPr>
+          <w:tblCellSpacing w:w="15" w:type="dxa"/>
+        </w:trPr>
+        <w:tc>
+          <w:tcPr>
+            <w:tcW w:w="0" w:type="auto"/>
+            <w:shd w:val="clear" w:color="auto" w:fill="282C34"/>
+            <w:tcMar>
+              <w:top w:w="90" w:type="dxa"/>
+              <w:left w:w="150" w:type="dxa"/>
+              <w:bottom w:w="90" w:type="dxa"/>
+              <w:right w:w="150" w:type="dxa"/>
+            </w:tcMar>
+            <w:hideMark/>
+          </w:tcPr>
+          <w:p>
+            <w:r>
+              <w:t>Histórico de conversas</w:t>
+            </w:r>
+          </w:p>
+        </w:tc>
+        <w:tc>
+          <w:tcPr>
+            <w:tcW w:w="0" w:type="auto"/>
+            <w:shd w:val="clear" w:color="auto" w:fill="282C34"/>
+            <w:tcMar>
+              <w:top w:w="90" w:type="dxa"/>
+              <w:left w:w="150" w:type="dxa"/>
+              <w:bottom w:w="90" w:type="dxa"/>
+              <w:right w:w="150" w:type="dxa"/>
+            </w:tcMar>
+            <w:hideMark/>
+          </w:tcPr>
+          <w:p>
+            <w:r>
+              <w:t>Sidebar vazia; .cursorrules manda não persistir sem discutir</w:t>
+            </w:r>
+          </w:p>
+        </w:tc>
+        <w:tc>
+          <w:tcPr>
+            <w:tcW w:w="0" w:type="auto"/>
+            <w:shd w:val="clear" w:color="auto" w:fill="282C34"/>
+            <w:tcMar>
+              <w:top w:w="90" w:type="dxa"/>
+              <w:left w:w="150" w:type="dxa"/>
+              <w:bottom w:w="90" w:type="dxa"/>
+              <w:right w:w="150" w:type="dxa"/>
+            </w:tcMar>
+            <w:hideMark/>
+          </w:tcPr>
+          <w:p>
+            <w:r>
+              <w:t>Fora, ou só “Nova conversa” limpando a tela</w:t>
+            </w:r>
+          </w:p>
+        </w:tc>
+      </w:tr>
+      <w:tr>
+        <w:trPr>
+          <w:tblCellSpacing w:w="15" w:type="dxa"/>
+        </w:trPr>
+        <w:tc>
+          <w:tcPr>
+            <w:tcW w:w="0" w:type="auto"/>
+            <w:shd w:val="clear" w:color="auto" w:fill="282C34"/>
+            <w:tcMar>
+              <w:top w:w="90" w:type="dxa"/>
+              <w:left w:w="150" w:type="dxa"/>
+              <w:bottom w:w="90" w:type="dxa"/>
+              <w:right w:w="150" w:type="dxa"/>
+            </w:tcMar>
+            <w:hideMark/>
+          </w:tcPr>
+          <w:p>
+            <w:r>
+              <w:t>Comparar Simulações</w:t>
+            </w:r>
+          </w:p>
+        </w:tc>
+        <w:tc>
+          <w:tcPr>
+            <w:tcW w:w="0" w:type="auto"/>
+            <w:shd w:val="clear" w:color="auto" w:fill="282C34"/>
+            <w:tcMar>
+              <w:top w:w="90" w:type="dxa"/>
+              <w:left w:w="150" w:type="dxa"/>
+              <w:bottom w:w="90" w:type="dxa"/>
+              <w:right w:w="150" w:type="dxa"/>
+            </w:tcMar>
+            <w:hideMark/>
+          </w:tcPr>
+          <w:p>
+            <w:r>
+              <w:t>Botão morto</w:t>
+            </w:r>
+          </w:p>
+        </w:tc>
+        <w:tc>
+          <w:tcPr>
+            <w:tcW w:w="0" w:type="auto"/>
+            <w:shd w:val="clear" w:color="auto" w:fill="282C34"/>
+            <w:tcMar>
+              <w:top w:w="90" w:type="dxa"/>
+              <w:left w:w="150" w:type="dxa"/>
+              <w:bottom w:w="90" w:type="dxa"/>
+              <w:right w:w="150" w:type="dxa"/>
+            </w:tcMar>
+            <w:hideMark/>
+          </w:tcPr>
+          <w:p>
+            <w:r>
+              <w:t>Fora (as sims já existem uma a uma no chat)</w:t>
+            </w:r>
+          </w:p>
+        </w:tc>
+      </w:tr>
+      <w:tr>
+        <w:trPr>
+          <w:tblCellSpacing w:w="15" w:type="dxa"/>
+        </w:trPr>
+        <w:tc>
+          <w:tcPr>
+            <w:tcW w:w="0" w:type="auto"/>
+            <w:shd w:val="clear" w:color="auto" w:fill="282C34"/>
+            <w:tcMar>
+              <w:top w:w="90" w:type="dxa"/>
+              <w:left w:w="150" w:type="dxa"/>
+              <w:bottom w:w="90" w:type="dxa"/>
+              <w:right w:w="150" w:type="dxa"/>
+            </w:tcMar>
+            <w:hideMark/>
+          </w:tcPr>
+          <w:p>
+            <w:r>
+              <w:t>Explorar</w:t>
+            </w:r>
+          </w:p>
+        </w:tc>
+        <w:tc>
+          <w:tcPr>
+            <w:tcW w:w="0" w:type="auto"/>
+            <w:shd w:val="clear" w:color="auto" w:fill="282C34"/>
+            <w:tcMar>
+              <w:top w:w="90" w:type="dxa"/>
+              <w:left w:w="150" w:type="dxa"/>
+              <w:bottom w:w="90" w:type="dxa"/>
+              <w:right w:w="150" w:type="dxa"/>
+            </w:tcMar>
+            <w:hideMark/>
+          </w:tcPr>
+          <w:p>
+            <w:r>
+              <w:t>Botão morto</w:t>
+            </w:r>
+          </w:p>
+        </w:tc>
+        <w:tc>
+          <w:tcPr>
+            <w:tcW w:w="0" w:type="auto"/>
+            <w:shd w:val="clear" w:color="auto" w:fill="282C34"/>
+            <w:tcMar>
+              <w:top w:w="90" w:type="dxa"/>
+              <w:left w:w="150" w:type="dxa"/>
+              <w:bottom w:w="90" w:type="dxa"/>
+              <w:right w:w="150" w:type="dxa"/>
+            </w:tcMar>
+            <w:hideMark/>
+          </w:tcPr>
+          <w:p>
+            <w:r>
+              <w:t>Fora (já tem “exemplos de perguntas”)</w:t>
+            </w:r>
+          </w:p>
+        </w:tc>
+      </w:tr>
+      <w:tr>
+        <w:trPr>
+          <w:tblCellSpacing w:w="15" w:type="dxa"/>
+        </w:trPr>
+        <w:tc>
+          <w:tcPr>
+            <w:tcW w:w="0" w:type="auto"/>
+            <w:shd w:val="clear" w:color="auto" w:fill="282C34"/>
+            <w:tcMar>
+              <w:top w:w="90" w:type="dxa"/>
+              <w:left w:w="150" w:type="dxa"/>
+              <w:bottom w:w="90" w:type="dxa"/>
+              <w:right w:w="150" w:type="dxa"/>
+            </w:tcMar>
+            <w:hideMark/>
+          </w:tcPr>
+          <w:p>
+            <w:r>
+              <w:t>Gerar Relatório</w:t>
+            </w:r>
+          </w:p>
+        </w:tc>
+        <w:tc>
+          <w:tcPr>
+            <w:tcW w:w="0" w:type="auto"/>
+            <w:shd w:val="clear" w:color="auto" w:fill="282C34"/>
+            <w:tcMar>
+              <w:top w:w="90" w:type="dxa"/>
+              <w:left w:w="150" w:type="dxa"/>
+              <w:bottom w:w="90" w:type="dxa"/>
+              <w:right w:w="150" w:type="dxa"/>
+            </w:tcMar>
+            <w:hideMark/>
+          </w:tcPr>
+          <w:p>
+            <w:r>
+              <w:t>Botão em quase toda resposta, não gera nada</w:t>
+            </w:r>
+          </w:p>
+        </w:tc>
+        <w:tc>
+          <w:tcPr>
+            <w:tcW w:w="0" w:type="auto"/>
+            <w:shd w:val="clear" w:color="auto" w:fill="282C34"/>
+            <w:tcMar>
+              <w:top w:w="90" w:type="dxa"/>
+              <w:left w:w="150" w:type="dxa"/>
+              <w:bottom w:w="90" w:type="dxa"/>
+              <w:right w:w="150" w:type="dxa"/>
+            </w:tcMar>
+            <w:hideMark/>
+          </w:tcPr>
+          <w:p>
+            <w:r>
+              <w:t>Esconder no MVP</w:t>
+            </w:r>
+          </w:p>
+        </w:tc>
+      </w:tr>
+      <w:tr>
+        <w:trPr>
+          <w:tblCellSpacing w:w="15" w:type="dxa"/>
+        </w:trPr>
+        <w:tc>
+          <w:tcPr>
+            <w:tcW w:w="0" w:type="auto"/>
+            <w:shd w:val="clear" w:color="auto" w:fill="282C34"/>
+            <w:tcMar>
+              <w:top w:w="90" w:type="dxa"/>
+              <w:left w:w="150" w:type="dxa"/>
+              <w:bottom w:w="90" w:type="dxa"/>
+              <w:right w:w="150" w:type="dxa"/>
+            </w:tcMar>
+            <w:hideMark/>
+          </w:tcPr>
+          <w:p>
+            <w:r>
+              <w:lastRenderedPageBreak/>
+              <w:t>Análise / Recomendações</w:t>
+            </w:r>
+          </w:p>
+        </w:tc>
+        <w:tc>
+          <w:tcPr>
+            <w:tcW w:w="0" w:type="auto"/>
+            <w:shd w:val="clear" w:color="auto" w:fill="282C34"/>
+            <w:tcMar>
+              <w:top w:w="90" w:type="dxa"/>
+              <w:left w:w="150" w:type="dxa"/>
+              <w:bottom w:w="90" w:type="dxa"/>
+              <w:right w:w="150" w:type="dxa"/>
+            </w:tcMar>
+            <w:hideMark/>
+          </w:tcPr>
+          <w:p>
+            <w:r>
+              <w:t>Muitas vezes vazios</w:t>
+            </w:r>
+          </w:p>
+        </w:tc>
+        <w:tc>
+          <w:tcPr>
+            <w:tcW w:w="0" w:type="auto"/>
+            <w:shd w:val="clear" w:color="auto" w:fill="282C34"/>
+            <w:tcMar>
+              <w:top w:w="90" w:type="dxa"/>
+              <w:left w:w="150" w:type="dxa"/>
+              <w:bottom w:w="90" w:type="dxa"/>
+              <w:right w:w="150" w:type="dxa"/>
+            </w:tcMar>
+            <w:hideMark/>
+          </w:tcPr>
+          <w:p>
+            <w:r>
+              <w:t>Esconder quando vazio (já fazem isso em conceito/sim)</w:t>
+            </w:r>
+          </w:p>
+        </w:tc>
+      </w:tr>
+      <w:tr>
+        <w:trPr>
+          <w:tblCellSpacing w:w="15" w:type="dxa"/>
+        </w:trPr>
+        <w:tc>
+          <w:tcPr>
+            <w:tcW w:w="0" w:type="auto"/>
+            <w:shd w:val="clear" w:color="auto" w:fill="282C34"/>
+            <w:tcMar>
+              <w:top w:w="90" w:type="dxa"/>
+              <w:left w:w="150" w:type="dxa"/>
+              <w:bottom w:w="90" w:type="dxa"/>
+              <w:right w:w="150" w:type="dxa"/>
+            </w:tcMar>
+            <w:hideMark/>
+          </w:tcPr>
+          <w:p>
+            <w:r>
+              <w:t>“E se o faturamento subir X%”</w:t>
+            </w:r>
+          </w:p>
+        </w:tc>
+        <w:tc>
+          <w:tcPr>
+            <w:tcW w:w="0" w:type="auto"/>
+            <w:shd w:val="clear" w:color="auto" w:fill="282C34"/>
+            <w:tcMar>
+              <w:top w:w="90" w:type="dxa"/>
+              <w:left w:w="150" w:type="dxa"/>
+              <w:bottom w:w="90" w:type="dxa"/>
+              <w:right w:w="150" w:type="dxa"/>
+            </w:tcMar>
+            <w:hideMark/>
+          </w:tcPr>
+          <w:p>
+            <w:r>
+              <w:t>Não existe; só despesa e CMV</w:t>
+            </w:r>
+          </w:p>
+        </w:tc>
+        <w:tc>
+          <w:tcPr>
+            <w:tcW w:w="0" w:type="auto"/>
+            <w:shd w:val="clear" w:color="auto" w:fill="282C34"/>
+            <w:tcMar>
+              <w:top w:w="90" w:type="dxa"/>
+              <w:left w:w="150" w:type="dxa"/>
+              <w:bottom w:w="90" w:type="dxa"/>
+              <w:right w:w="150" w:type="dxa"/>
+            </w:tcMar>
+            <w:hideMark/>
+          </w:tcPr>
+          <w:p>
+            <w:r>
+              <w:t>Opcional depois do dashboard</w:t>
+            </w:r>
+          </w:p>
+        </w:tc>
+      </w:tr>
+      <w:tr>
+        <w:trPr>
+          <w:tblCellSpacing w:w="15" w:type="dxa"/>
+        </w:trPr>
+        <w:tc>
+          <w:tcPr>
+            <w:tcW w:w="0" w:type="auto"/>
+            <w:shd w:val="clear" w:color="auto" w:fill="282C34"/>
+            <w:tcMar>
+              <w:top w:w="90" w:type="dxa"/>
+              <w:left w:w="150" w:type="dxa"/>
+              <w:bottom w:w="90" w:type="dxa"/>
+              <w:right w:w="150" w:type="dxa"/>
+            </w:tcMar>
+            <w:hideMark/>
+          </w:tcPr>
+          <w:p>
+            <w:r>
+              <w:t>“E se” de logística</w:t>
+            </w:r>
+          </w:p>
+        </w:tc>
+        <w:tc>
+          <w:tcPr>
+            <w:tcW w:w="0" w:type="auto"/>
+            <w:shd w:val="clear" w:color="auto" w:fill="282C34"/>
+            <w:tcMar>
+              <w:top w:w="90" w:type="dxa"/>
+              <w:left w:w="150" w:type="dxa"/>
+              <w:bottom w:w="90" w:type="dxa"/>
+              <w:right w:w="150" w:type="dxa"/>
+            </w:tcMar>
+            <w:hideMark/>
+          </w:tcPr>
+          <w:p>
+            <w:r>
+              <w:t>Proibido agora pelo próprio recorte do MVP</w:t>
+            </w:r>
+          </w:p>
+        </w:tc>
+        <w:tc>
+          <w:tcPr>
+            <w:tcW w:w="0" w:type="auto"/>
+            <w:shd w:val="clear" w:color="auto" w:fill="282C34"/>
+            <w:tcMar>
+              <w:top w:w="90" w:type="dxa"/>
+              <w:left w:w="150" w:type="dxa"/>
+              <w:bottom w:w="90" w:type="dxa"/>
+              <w:right w:w="150" w:type="dxa"/>
+            </w:tcMar>
+            <w:hideMark/>
+          </w:tcPr>
+          <w:p>
+            <w:r>
+              <w:t>Fora</w:t>
+            </w:r>
+          </w:p>
+        </w:tc>
+      </w:tr>
+      <w:tr>
+        <w:trPr>
+          <w:tblCellSpacing w:w="15" w:type="dxa"/>
+        </w:trPr>
+        <w:tc>
+          <w:tcPr>
+            <w:tcW w:w="0" w:type="auto"/>
+            <w:shd w:val="clear" w:color="auto" w:fill="282C34"/>
+            <w:tcMar>
+              <w:top w:w="90" w:type="dxa"/>
+              <w:left w:w="150" w:type="dxa"/>
+              <w:bottom w:w="90" w:type="dxa"/>
+              <w:right w:w="150" w:type="dxa"/>
+            </w:tcMar>
+            <w:hideMark/>
+          </w:tcPr>
+          <w:p>
+            <w:r>
+              <w:t>Mini-chat do dashboard</w:t>
+            </w:r>
+          </w:p>
+        </w:tc>
+        <w:tc>
+          <w:tcPr>
+            <w:tcW w:w="0" w:type="auto"/>
+            <w:shd w:val="clear" w:color="auto" w:fill="282C34"/>
+            <w:tcMar>
+              <w:top w:w="90" w:type="dxa"/>
+              <w:left w:w="150" w:type="dxa"/>
+              <w:bottom w:w="90" w:type="dxa"/>
+              <w:right w:w="150" w:type="dxa"/>
+            </w:tcMar>
+            <w:hideMark/>
+          </w:tcPr>
+          <w:p>
+            <w:r>
+              <w:t>Não dispara o copiloto</w:t>
+            </w:r>
+          </w:p>
+        </w:tc>
+        <w:tc>
+          <w:tcPr>
+            <w:tcW w:w="0" w:type="auto"/>
+            <w:shd w:val="clear" w:color="auto" w:fill="282C34"/>
+            <w:tcMar>
+              <w:top w:w="90" w:type="dxa"/>
+              <w:left w:w="150" w:type="dxa"/>
+              <w:bottom w:w="90" w:type="dxa"/>
+              <w:right w:w="150" w:type="dxa"/>
+            </w:tcMar>
+            <w:hideMark/>
+          </w:tcPr>
+          <w:p>
+            <w:r>
+              <w:t>Sim, junto com o dashboard (redirect ou mesmo enviarPerguntaDuaxis)</w:t>
+            </w:r>
+          </w:p>
+        </w:tc>
+      </w:tr>
+    </w:tbl>
+    <w:p/>
+    <w:p>
+      <w:r>
+        <w:t>3. Fontes de Dados — página de marketing</w:t>
+      </w:r>
+    </w:p>
+    <w:p>
+      <w:r>
+        <w:t>4. Configurações — fora do MVP</w:t>
+      </w:r>
+    </w:p>
+    <w:p/>
+    <w:p>
+      <w:pPr>
         <w:rPr>
-          <w:highlight w:val="yellow"/>
+          <w:b/>
+          <w:bCs/>
         </w:rPr>
-        <w:t>reposicao</w:t>
-      </w:r>
-      <w:proofErr w:type="spellEnd"/>
+      </w:pPr>
       <w:r>
         <w:rPr>
-          <w:highlight w:val="yellow"/>
+          <w:b/>
+          <w:bCs/>
         </w:rPr>
-        <w:t>(</w:t>
-      </w:r>
-      <w:proofErr w:type="gramEnd"/>
-      <w:r>
-        <w:rPr>
-          <w:highlight w:val="yellow"/>
-        </w:rPr>
-        <w:t>). A IA terá que entender frases diferentes como “Quanto compro do PROD017?”, “Preciso repor o PROD017?”, “Meu estoque do PROD017 é suficiente?” e “Qual a situação do produto PROD017?”. Todas poderão acabar chamando a mesma função.</w:t>
-      </w:r>
-      <w:r>
-        <w:rPr>
-          <w:highlight w:val="yellow"/>
-        </w:rPr>
-        <w:t xml:space="preserve"> FEITO</w:t>
-      </w:r>
-    </w:p>
-    <w:p>
-      <w:pPr>
-        <w:rPr>
-          <w:highlight w:val="yellow"/>
-        </w:rPr>
-      </w:pPr>
-      <w:r>
-        <w:rPr>
-          <w:highlight w:val="yellow"/>
-        </w:rPr>
-        <w:t xml:space="preserve">Etapa 2 — Retirar do </w:t>
-      </w:r>
-      <w:proofErr w:type="spellStart"/>
-      <w:r>
-        <w:rPr>
-          <w:highlight w:val="yellow"/>
-        </w:rPr>
-        <w:t>JavaScript</w:t>
-      </w:r>
-      <w:proofErr w:type="spellEnd"/>
-      <w:r>
-        <w:rPr>
-          <w:highlight w:val="yellow"/>
-        </w:rPr>
-        <w:t xml:space="preserve"> a responsabilidade de interpretar português. Hoje o main.js procura PROD\</w:t>
-      </w:r>
-      <w:proofErr w:type="gramStart"/>
-      <w:r>
-        <w:rPr>
-          <w:highlight w:val="yellow"/>
-        </w:rPr>
-        <w:t>d{</w:t>
-      </w:r>
-      <w:proofErr w:type="gramEnd"/>
-      <w:r>
-        <w:rPr>
-          <w:highlight w:val="yellow"/>
-        </w:rPr>
-        <w:t>3}. Isso será substituído por algo muito mais simples: ele apenas envia a mensagem para /api/chat e recebe uma resposta.</w:t>
-      </w:r>
-      <w:r>
-        <w:rPr>
-          <w:highlight w:val="yellow"/>
-        </w:rPr>
-        <w:t xml:space="preserve"> FEITO</w:t>
-      </w:r>
-    </w:p>
-    <w:p>
-      <w:r>
-        <w:t xml:space="preserve">Etapa 3 — Criar as funções determinísticas </w:t>
-      </w:r>
-      <w:proofErr w:type="gramStart"/>
-      <w:r>
-        <w:t>de Logística</w:t>
-      </w:r>
-      <w:proofErr w:type="gramEnd"/>
-      <w:r>
-        <w:t xml:space="preserve">. </w:t>
-      </w:r>
-      <w:proofErr w:type="spellStart"/>
-      <w:r>
-        <w:t>listar_produtos_</w:t>
-      </w:r>
-      <w:proofErr w:type="gramStart"/>
-      <w:r>
-        <w:t>reposicao</w:t>
-      </w:r>
-      <w:proofErr w:type="spellEnd"/>
-      <w:r>
-        <w:t>(</w:t>
-      </w:r>
-      <w:proofErr w:type="gramEnd"/>
-      <w:r>
-        <w:t xml:space="preserve">), </w:t>
-      </w:r>
-      <w:proofErr w:type="spellStart"/>
-      <w:r>
-        <w:t>consultar_pedidos_</w:t>
-      </w:r>
-      <w:proofErr w:type="gramStart"/>
-      <w:r>
-        <w:t>atrasados</w:t>
-      </w:r>
-      <w:proofErr w:type="spellEnd"/>
-      <w:r>
-        <w:t>(</w:t>
-      </w:r>
-      <w:proofErr w:type="gramEnd"/>
-      <w:r>
-        <w:t xml:space="preserve">), </w:t>
-      </w:r>
-      <w:proofErr w:type="spellStart"/>
-      <w:r>
-        <w:t>produto_maior_</w:t>
-      </w:r>
-      <w:proofErr w:type="gramStart"/>
-      <w:r>
-        <w:t>risco</w:t>
-      </w:r>
-      <w:proofErr w:type="spellEnd"/>
-      <w:r>
-        <w:t>(</w:t>
-      </w:r>
-      <w:proofErr w:type="gramEnd"/>
-      <w:r>
-        <w:t xml:space="preserve">), </w:t>
-      </w:r>
-      <w:proofErr w:type="spellStart"/>
-      <w:r>
-        <w:t>produtos_baixo_</w:t>
-      </w:r>
-      <w:proofErr w:type="gramStart"/>
-      <w:r>
-        <w:t>giro</w:t>
-      </w:r>
-      <w:proofErr w:type="spellEnd"/>
-      <w:r>
-        <w:t>(</w:t>
-      </w:r>
-      <w:proofErr w:type="gramEnd"/>
-      <w:r>
-        <w:t xml:space="preserve">) e </w:t>
-      </w:r>
-      <w:proofErr w:type="spellStart"/>
-      <w:r>
-        <w:t>fornecedor_com_mais_</w:t>
-      </w:r>
-      <w:proofErr w:type="gramStart"/>
-      <w:r>
-        <w:t>atrasos</w:t>
-      </w:r>
-      <w:proofErr w:type="spellEnd"/>
-      <w:r>
-        <w:t>(</w:t>
-      </w:r>
-      <w:proofErr w:type="gramEnd"/>
-      <w:r>
-        <w:t>). Nenhuma exige novo ML.</w:t>
-      </w:r>
-    </w:p>
-    <w:p>
-      <w:r>
-        <w:t>Etapa 4</w:t>
-      </w:r>
-      <w:r>
-        <w:t>. Melhorar a busca por produto em linguagem natural</w:t>
-      </w:r>
-      <w:r>
-        <w:t xml:space="preserve">: </w:t>
-      </w:r>
-      <w:r>
-        <w:t xml:space="preserve">O fluxo ideal que você havia desenhado é: usuário fala de um produto pelo nome → IA entende → </w:t>
-      </w:r>
-      <w:proofErr w:type="spellStart"/>
-      <w:r>
-        <w:t>backend</w:t>
-      </w:r>
-      <w:proofErr w:type="spellEnd"/>
-      <w:r>
-        <w:t xml:space="preserve"> localiza o produto → análise de reposição → ML prevê demanda → regras calculam reposição → IA explica.</w:t>
+        <w:t>Prioridade agora (só MVP)</w:t>
+      </w:r>
+    </w:p>
+    <w:p>
+      <w:pPr>
+        <w:numPr>
+          <w:ilvl w:val="0"/>
+          <w:numId w:val="4"/>
+        </w:numPr>
+      </w:pPr>
+      <w:r>
+        <w:t>Definir os 4 KPIs com os mesmos nomes e fórmulas do chat.</w:t>
+      </w:r>
+    </w:p>
+    <w:p>
+      <w:pPr>
+        <w:numPr>
+          <w:ilvl w:val="0"/>
+          <w:numId w:val="4"/>
+        </w:numPr>
+      </w:pPr>
+      <w:r>
+        <w:t>Combinar o recorte de filtro (período + módulo). Aba Dia: só se definirmos o intervalo; senão, Mês e Ano.</w:t>
+      </w:r>
+    </w:p>
+    <w:p>
+      <w:pPr>
+        <w:numPr>
+          <w:ilvl w:val="0"/>
+          <w:numId w:val="4"/>
+        </w:numPr>
+      </w:pPr>
+      <w:r>
+        <w:t>Endpoint no FastAPI reusando calcular_* / comparar_* / logística.</w:t>
+      </w:r>
+    </w:p>
+    <w:p>
+      <w:pPr>
+        <w:numPr>
+          <w:ilvl w:val="0"/>
+          <w:numId w:val="4"/>
+        </w:numPr>
+      </w:pPr>
+      <w:r>
+        <w:t>Testar o JSON contra os CSVs (igual junho/2026 no chat).</w:t>
+      </w:r>
+    </w:p>
+    <w:p>
+      <w:pPr>
+        <w:numPr>
+          <w:ilvl w:val="0"/>
+          <w:numId w:val="4"/>
+        </w:numPr>
+      </w:pPr>
+      <w:r>
+        <w:t>Ligar index.html (cards + 2–3 gráficos).</w:t>
+      </w:r>
+    </w:p>
+    <w:p>
+      <w:pPr>
+        <w:numPr>
+          <w:ilvl w:val="0"/>
+          <w:numId w:val="4"/>
+        </w:numPr>
+      </w:pPr>
+      <w:r>
+        <w:t>Filtro global de verdade.</w:t>
+      </w:r>
+    </w:p>
+    <w:p>
+      <w:pPr>
+        <w:numPr>
+          <w:ilvl w:val="0"/>
+          <w:numId w:val="4"/>
+        </w:numPr>
+      </w:pPr>
+      <w:r>
+        <w:t>Camada de Contexto/conversa</w:t>
+      </w:r>
+    </w:p>
+    <w:p>
+      <w:pPr>
+        <w:numPr>
+          <w:ilvl w:val="0"/>
+          <w:numId w:val="4"/>
+        </w:numPr>
+      </w:pPr>
+      <w:r>
+        <w:t>Encaminhar o mini-chat do dashboard para o copiloto.</w:t>
+      </w:r>
+    </w:p>
+    <w:p>
+      <w:pPr>
+        <w:numPr>
+          <w:ilvl w:val="0"/>
+          <w:numId w:val="4"/>
+        </w:numPr>
+      </w:pPr>
+      <w:r>
+        <w:t>Definir OQUE colocaremos em Recomendações.</w:t>
+      </w:r>
+    </w:p>
+    <w:p>
+      <w:pPr>
+        <w:numPr>
+          <w:ilvl w:val="0"/>
+          <w:numId w:val="4"/>
+        </w:numPr>
+      </w:pPr>
+      <w:r>
+        <w:t>Gerar o relatório de cada pergunta feita se o usuário quiser</w:t>
+      </w:r>
+    </w:p>
+    <w:p>
+      <w:pPr>
+        <w:numPr>
+          <w:ilvl w:val="0"/>
+          <w:numId w:val="4"/>
+        </w:numPr>
+      </w:pPr>
+      <w:r>
+        <w:t>Ao lado tem o campo de “histórico” fazer a conversa ir pra l</w:t>
+      </w:r>
+      <w:r>
+        <w:t>á</w:t>
+      </w:r>
+    </w:p>
+    <w:p>
+      <w:pPr>
+        <w:numPr>
+          <w:ilvl w:val="0"/>
+          <w:numId w:val="4"/>
+        </w:numPr>
+      </w:pPr>
+      <w:r>
+        <w:t>Bateria estruturada de testes da IA</w:t>
+      </w:r>
+    </w:p>
+    <w:p>
+      <w:pPr>
+        <w:numPr>
+          <w:ilvl w:val="0"/>
+          <w:numId w:val="4"/>
+        </w:numPr>
+      </w:pPr>
+      <w:r>
+        <w:t>Mecanismos melhores de confiabilidade</w:t>
+      </w:r>
+    </w:p>
+    <w:p>
+      <w:pPr>
+        <w:numPr>
+          <w:ilvl w:val="0"/>
+          <w:numId w:val="4"/>
+        </w:numPr>
+      </w:pPr>
+      <w:r>
+        <w:lastRenderedPageBreak/>
+        <w:t>Segundo ML (fluxo de caixa do próximo mês)</w:t>
+      </w:r>
+    </w:p>
+    <w:p/>
+    <w:p/>
+    <w:p>
+      <w:r>
+        <w:t>Etapa 8 -</w:t>
+      </w:r>
+      <w:r>
+        <w:t xml:space="preserve"> Criar uma camada de contexto/conversa</w:t>
+      </w:r>
+    </w:p>
+    <w:p>
+      <w:r>
+        <w:t xml:space="preserve">Etapa 9 - </w:t>
+      </w:r>
+      <w:r>
+        <w:t>Testes estruturados da IA</w:t>
+      </w:r>
+      <w:r>
+        <w:t>: montar uma bateria de perguntas</w:t>
+      </w:r>
+    </w:p>
+    <w:p>
+      <w:r>
+        <w:t xml:space="preserve">Etapa 10 - </w:t>
+      </w:r>
+      <w:r>
+        <w:t>Criar mecanismos melhores de confiabilidade</w:t>
       </w:r>
     </w:p>
     <w:p>
@@ -211,81 +1174,10 @@
         <w:t xml:space="preserve">Etapa </w:t>
       </w:r>
       <w:r>
-        <w:t>5</w:t>
-      </w:r>
-      <w:r>
-        <w:t xml:space="preserve"> — Criar as funções financeiras. Faturamento, custos, lucro, contas a pagar, contas a receber e fluxo de caixa realizado.</w:t>
-      </w:r>
-    </w:p>
-    <w:p>
-      <w:r>
-        <w:t xml:space="preserve">Etapa 6 - </w:t>
-      </w:r>
-      <w:r>
-        <w:t>Tornar as consultas financeiras flexíveis por período</w:t>
-      </w:r>
-      <w:r>
-        <w:t xml:space="preserve">: </w:t>
-      </w:r>
-    </w:p>
-    <w:p>
-      <w:r>
-        <w:t xml:space="preserve">Etapa </w:t>
-      </w:r>
-      <w:r>
-        <w:t>7</w:t>
-      </w:r>
-      <w:r>
-        <w:t xml:space="preserve"> — Implementar “Por que o lucro caiu?”. Primeiro fazemos Python calcular as causas; depois a IA explica o resultado.</w:t>
-      </w:r>
-    </w:p>
-    <w:p>
-      <w:r>
-        <w:t>Etapa 8 -</w:t>
-      </w:r>
-      <w:r>
-        <w:t xml:space="preserve"> Criar uma camada de contexto/conversa</w:t>
-      </w:r>
-    </w:p>
-    <w:p>
-      <w:r>
-        <w:t xml:space="preserve">Etapa 9 - </w:t>
-      </w:r>
-      <w:r>
-        <w:t>Testes estruturados da IA</w:t>
-      </w:r>
-      <w:r>
-        <w:t>: montar uma bateria de perguntas</w:t>
-      </w:r>
-    </w:p>
-    <w:p>
-      <w:r>
-        <w:t xml:space="preserve">Etapa 10 - </w:t>
-      </w:r>
-      <w:r>
-        <w:t>Criar mecanismos melhores de confiabilidade</w:t>
-      </w:r>
-    </w:p>
-    <w:p>
-      <w:r>
-        <w:t xml:space="preserve">Etapa </w:t>
-      </w:r>
-      <w:r>
         <w:t>11</w:t>
       </w:r>
       <w:r>
         <w:t xml:space="preserve"> — Só então treinar o segundo ML. Minha candidata continua sendo previsão de fluxo de caixa do próximo mês, porque essa pergunta realmente exige previsão futura.</w:t>
-      </w:r>
-    </w:p>
-    <w:p>
-      <w:r>
-        <w:t xml:space="preserve">Etapa </w:t>
-      </w:r>
-      <w:r>
-        <w:t>12</w:t>
-      </w:r>
-      <w:r>
-        <w:t xml:space="preserve"> — Simulador. “E se a demanda aumentar 30%?”, “E se o fornecedor atrasar 10 dias?”, etc.</w:t>
       </w:r>
     </w:p>
     <w:p>
@@ -387,28 +1279,12 @@
     </w:p>
     <w:p>
       <w:r>
-        <w:t xml:space="preserve">- </w:t>
-      </w:r>
-      <w:proofErr w:type="gramStart"/>
-      <w:r>
-        <w:t>intenção</w:t>
-      </w:r>
-      <w:proofErr w:type="gramEnd"/>
-      <w:r>
-        <w:t xml:space="preserve"> = analisar reposição</w:t>
-      </w:r>
-    </w:p>
-    <w:p>
-      <w:r>
-        <w:t xml:space="preserve">- </w:t>
-      </w:r>
-      <w:proofErr w:type="gramStart"/>
-      <w:r>
-        <w:t>produto</w:t>
-      </w:r>
-      <w:proofErr w:type="gramEnd"/>
-      <w:r>
-        <w:t xml:space="preserve"> = jaqueta preta</w:t>
+        <w:t>- intenção = analisar reposição</w:t>
+      </w:r>
+    </w:p>
+    <w:p>
+      <w:r>
+        <w:t>- produto = jaqueta preta</w:t>
       </w:r>
     </w:p>
     <w:p>
@@ -428,23 +1304,7 @@
     </w:p>
     <w:p>
       <w:r>
-        <w:t xml:space="preserve">chama </w:t>
-      </w:r>
-      <w:proofErr w:type="spellStart"/>
-      <w:r>
-        <w:t>analisar_</w:t>
-      </w:r>
-      <w:proofErr w:type="gramStart"/>
-      <w:r>
-        <w:t>reposicao</w:t>
-      </w:r>
-      <w:proofErr w:type="spellEnd"/>
-      <w:r>
-        <w:t>(</w:t>
-      </w:r>
-      <w:proofErr w:type="gramEnd"/>
-      <w:r>
-        <w:t>)</w:t>
+        <w:t>chama analisar_reposicao()</w:t>
       </w:r>
     </w:p>
     <w:p>
@@ -469,7 +1329,6 @@
     </w:p>
     <w:p>
       <w:r>
-        <w:lastRenderedPageBreak/>
         <w:t>REGRAS DE NEGÓCIO</w:t>
       </w:r>
     </w:p>
@@ -579,7 +1438,6 @@
                 <w:b/>
                 <w:bCs/>
               </w:rPr>
-              <w:lastRenderedPageBreak/>
               <w:t>#</w:t>
             </w:r>
           </w:p>
@@ -1001,6 +1859,7 @@
           </w:tcPr>
           <w:p>
             <w:r>
+              <w:lastRenderedPageBreak/>
               <w:t>9</w:t>
             </w:r>
           </w:p>
@@ -1496,7 +2355,6 @@
           </w:tcPr>
           <w:p>
             <w:r>
-              <w:lastRenderedPageBreak/>
               <w:t>20</w:t>
             </w:r>
           </w:p>
@@ -1779,6 +2637,7 @@
           </w:tcPr>
           <w:p>
             <w:r>
+              <w:lastRenderedPageBreak/>
               <w:t>26</w:t>
             </w:r>
           </w:p>
@@ -2007,6 +2866,119 @@
 <file path=word/numbering.xml><?xml version="1.0" encoding="utf-8"?>
 <w:numbering xmlns:wpc="http://schemas.microsoft.com/office/word/2010/wordprocessingCanvas" xmlns:cx="http://schemas.microsoft.com/office/drawing/2014/chartex" xmlns:cx1="http://schemas.microsoft.com/office/drawing/2015/9/8/chartex" xmlns:cx2="http://schemas.microsoft.com/office/drawing/2015/10/21/chartex" xmlns:cx3="http://schemas.microsoft.com/office/drawing/2016/5/9/chartex" xmlns:cx4="http://schemas.microsoft.com/office/drawing/2016/5/10/chartex" xmlns:cx5="http://schemas.microsoft.com/office/drawing/2016/5/11/chartex" xmlns:cx6="http://schemas.microsoft.com/office/drawing/2016/5/12/chartex" xmlns:cx7="http://schemas.microsoft.com/office/drawing/2016/5/13/chartex" xmlns:cx8="http://schemas.microsoft.com/office/drawing/2016/5/14/chartex" xmlns:mc="http://schemas.openxmlformats.org/markup-compatibility/2006" xmlns:aink="http://schemas.microsoft.com/office/drawing/2016/ink" xmlns:am3d="http://schemas.microsoft.com/office/drawing/2017/model3d" xmlns:o="urn:schemas-microsoft-com:office:office" xmlns:oel="http://schemas.microsoft.com/office/2019/extlst" xmlns:r="http://schemas.openxmlformats.org/officeDocument/2006/relationships" xmlns:m="http://schemas.openxmlformats.org/officeDocument/2006/math" xmlns:v="urn:schemas-microsoft-com:vml" xmlns:wp14="http://schemas.microsoft.com/office/word/2010/wordprocessingDrawing" xmlns:wp="http://schemas.openxmlformats.org/drawingml/2006/wordprocessingDrawing" xmlns:w10="urn:schemas-microsoft-com:office:word" xmlns:w="http://schemas.openxmlformats.org/wordprocessingml/2006/main" xmlns:w14="http://schemas.microsoft.com/office/word/2010/wordml" xmlns:w15="http://schemas.microsoft.com/office/word/2012/wordml" xmlns:w16cex="http://schemas.microsoft.com/office/word/2018/wordml/cex" xmlns:w16cid="http://schemas.microsoft.com/office/word/2016/wordml/cid" xmlns:w16="http://schemas.microsoft.com/office/word/2018/wordml" xmlns:w16du="http://schemas.microsoft.com/office/word/2023/wordml/word16du" xmlns:w16sdtdh="http://schemas.microsoft.com/office/word/2020/wordml/sdtdatahash" xmlns:w16sdtfl="http://schemas.microsoft.com/office/word/2024/wordml/sdtformatlock" xmlns:w16se="http://schemas.microsoft.com/office/word/2015/wordml/symex" xmlns:wpg="http://schemas.microsoft.com/office/word/2010/wordprocessingGroup" xmlns:wpi="http://schemas.microsoft.com/office/word/2010/wordprocessingInk" xmlns:wne="http://schemas.microsoft.com/office/word/2006/wordml" xmlns:wps="http://schemas.microsoft.com/office/word/2010/wordprocessingShape" mc:Ignorable="w14 w15 w16se w16cid w16 w16cex w16sdtdh w16sdtfl w16du wp14">
   <w:abstractNum w:abstractNumId="0" w15:restartNumberingAfterBreak="0">
+    <w:nsid w:val="09F35696"/>
+    <w:multiLevelType w:val="multilevel"/>
+    <w:tmpl w:val="269C9090"/>
+    <w:lvl w:ilvl="0">
+      <w:start w:val="1"/>
+      <w:numFmt w:val="decimal"/>
+      <w:lvlText w:val="%1."/>
+      <w:lvlJc w:val="left"/>
+      <w:pPr>
+        <w:tabs>
+          <w:tab w:val="num" w:pos="720"/>
+        </w:tabs>
+        <w:ind w:left="720" w:hanging="360"/>
+      </w:pPr>
+    </w:lvl>
+    <w:lvl w:ilvl="1" w:tentative="1">
+      <w:start w:val="1"/>
+      <w:numFmt w:val="decimal"/>
+      <w:lvlText w:val="%2."/>
+      <w:lvlJc w:val="left"/>
+      <w:pPr>
+        <w:tabs>
+          <w:tab w:val="num" w:pos="1440"/>
+        </w:tabs>
+        <w:ind w:left="1440" w:hanging="360"/>
+      </w:pPr>
+    </w:lvl>
+    <w:lvl w:ilvl="2" w:tentative="1">
+      <w:start w:val="1"/>
+      <w:numFmt w:val="decimal"/>
+      <w:lvlText w:val="%3."/>
+      <w:lvlJc w:val="left"/>
+      <w:pPr>
+        <w:tabs>
+          <w:tab w:val="num" w:pos="2160"/>
+        </w:tabs>
+        <w:ind w:left="2160" w:hanging="360"/>
+      </w:pPr>
+    </w:lvl>
+    <w:lvl w:ilvl="3" w:tentative="1">
+      <w:start w:val="1"/>
+      <w:numFmt w:val="decimal"/>
+      <w:lvlText w:val="%4."/>
+      <w:lvlJc w:val="left"/>
+      <w:pPr>
+        <w:tabs>
+          <w:tab w:val="num" w:pos="2880"/>
+        </w:tabs>
+        <w:ind w:left="2880" w:hanging="360"/>
+      </w:pPr>
+    </w:lvl>
+    <w:lvl w:ilvl="4" w:tentative="1">
+      <w:start w:val="1"/>
+      <w:numFmt w:val="decimal"/>
+      <w:lvlText w:val="%5."/>
+      <w:lvlJc w:val="left"/>
+      <w:pPr>
+        <w:tabs>
+          <w:tab w:val="num" w:pos="3600"/>
+        </w:tabs>
+        <w:ind w:left="3600" w:hanging="360"/>
+      </w:pPr>
+    </w:lvl>
+    <w:lvl w:ilvl="5" w:tentative="1">
+      <w:start w:val="1"/>
+      <w:numFmt w:val="decimal"/>
+      <w:lvlText w:val="%6."/>
+      <w:lvlJc w:val="left"/>
+      <w:pPr>
+        <w:tabs>
+          <w:tab w:val="num" w:pos="4320"/>
+        </w:tabs>
+        <w:ind w:left="4320" w:hanging="360"/>
+      </w:pPr>
+    </w:lvl>
+    <w:lvl w:ilvl="6" w:tentative="1">
+      <w:start w:val="1"/>
+      <w:numFmt w:val="decimal"/>
+      <w:lvlText w:val="%7."/>
+      <w:lvlJc w:val="left"/>
+      <w:pPr>
+        <w:tabs>
+          <w:tab w:val="num" w:pos="5040"/>
+        </w:tabs>
+        <w:ind w:left="5040" w:hanging="360"/>
+      </w:pPr>
+    </w:lvl>
+    <w:lvl w:ilvl="7" w:tentative="1">
+      <w:start w:val="1"/>
+      <w:numFmt w:val="decimal"/>
+      <w:lvlText w:val="%8."/>
+      <w:lvlJc w:val="left"/>
+      <w:pPr>
+        <w:tabs>
+          <w:tab w:val="num" w:pos="5760"/>
+        </w:tabs>
+        <w:ind w:left="5760" w:hanging="360"/>
+      </w:pPr>
+    </w:lvl>
+    <w:lvl w:ilvl="8" w:tentative="1">
+      <w:start w:val="1"/>
+      <w:numFmt w:val="decimal"/>
+      <w:lvlText w:val="%9."/>
+      <w:lvlJc w:val="left"/>
+      <w:pPr>
+        <w:tabs>
+          <w:tab w:val="num" w:pos="6480"/>
+        </w:tabs>
+        <w:ind w:left="6480" w:hanging="360"/>
+      </w:pPr>
+    </w:lvl>
+  </w:abstractNum>
+  <w:abstractNum w:abstractNumId="1" w15:restartNumberingAfterBreak="0">
     <w:nsid w:val="2685703F"/>
     <w:multiLevelType w:val="multilevel"/>
     <w:tmpl w:val="CA8850E8"/>
@@ -2119,7 +3091,7 @@
       </w:pPr>
     </w:lvl>
   </w:abstractNum>
-  <w:abstractNum w:abstractNumId="1" w15:restartNumberingAfterBreak="0">
+  <w:abstractNum w:abstractNumId="2" w15:restartNumberingAfterBreak="0">
     <w:nsid w:val="4A427DC7"/>
     <w:multiLevelType w:val="multilevel"/>
     <w:tmpl w:val="22D4A230"/>
@@ -2232,7 +3204,7 @@
       </w:pPr>
     </w:lvl>
   </w:abstractNum>
-  <w:abstractNum w:abstractNumId="2" w15:restartNumberingAfterBreak="0">
+  <w:abstractNum w:abstractNumId="3" w15:restartNumberingAfterBreak="0">
     <w:nsid w:val="6F554E95"/>
     <w:multiLevelType w:val="multilevel"/>
     <w:tmpl w:val="CEF655AE"/>
@@ -2346,13 +3318,16 @@
     </w:lvl>
   </w:abstractNum>
   <w:num w:numId="1" w16cid:durableId="1135953619">
+    <w:abstractNumId w:val="3"/>
+  </w:num>
+  <w:num w:numId="2" w16cid:durableId="403264717">
+    <w:abstractNumId w:val="1"/>
+  </w:num>
+  <w:num w:numId="3" w16cid:durableId="1114907504">
     <w:abstractNumId w:val="2"/>
   </w:num>
-  <w:num w:numId="2" w16cid:durableId="403264717">
+  <w:num w:numId="4" w16cid:durableId="756482612">
     <w:abstractNumId w:val="0"/>
-  </w:num>
-  <w:num w:numId="3" w16cid:durableId="1114907504">
-    <w:abstractNumId w:val="1"/>
   </w:num>
 </w:numbering>
 </file>

</xml_diff>

<commit_message>
Adiciona suporte para contexto de sessão no chat, permitindo que perguntas subsequentes utilizem informações anteriores, como ferramenta, produto e períodos. Implementa lógica para atualizar o contexto a partir das respostas do backend, melhorando a continuidade das interações. Essa atualização visa aprimorar a experiência do usuário ao facilitar a consulta de informações relacionadas em uma única sessão de chat.
</commit_message>
<xml_diff>
--- a/DOCUMENTOS/PROXIMOS PASSOS.docx
+++ b/DOCUMENTOS/PROXIMOS PASSOS.docx
@@ -14,971 +14,6 @@
           <w:b/>
           <w:bCs/>
         </w:rPr>
-        <w:t>O que já está feito (não reabrir no MVP)</w:t>
-      </w:r>
-    </w:p>
-    <w:p>
-      <w:r>
-        <w:t>Logística (chat) — encerrada e validada: reposição, risco de ruptura, pedidos atrasados (reconstrução histórica), baixo giro, fornecedores por taxa de atraso.</w:t>
-      </w:r>
-    </w:p>
-    <w:p>
-      <w:r>
-        <w:t>Financeiro (chat) — os 6 indicadores + camada de análise:</w:t>
-      </w:r>
-    </w:p>
-    <w:tbl>
-      <w:tblPr>
-        <w:tblW w:w="0" w:type="auto"/>
-        <w:tblCellSpacing w:w="15" w:type="dxa"/>
-        <w:shd w:val="clear" w:color="auto" w:fill="282C34"/>
-        <w:tblCellMar>
-          <w:top w:w="15" w:type="dxa"/>
-          <w:left w:w="15" w:type="dxa"/>
-          <w:bottom w:w="15" w:type="dxa"/>
-          <w:right w:w="15" w:type="dxa"/>
-        </w:tblCellMar>
-        <w:tblLook w:val="04A0" w:firstRow="1" w:lastRow="0" w:firstColumn="1" w:lastColumn="0" w:noHBand="0" w:noVBand="1"/>
-      </w:tblPr>
-      <w:tblGrid>
-        <w:gridCol w:w="6913"/>
-        <w:gridCol w:w="995"/>
-      </w:tblGrid>
-      <w:tr>
-        <w:trPr>
-          <w:tblHeader/>
-          <w:tblCellSpacing w:w="15" w:type="dxa"/>
-        </w:trPr>
-        <w:tc>
-          <w:tcPr>
-            <w:tcW w:w="0" w:type="auto"/>
-            <w:noWrap/>
-            <w:tcMar>
-              <w:top w:w="90" w:type="dxa"/>
-              <w:left w:w="150" w:type="dxa"/>
-              <w:bottom w:w="90" w:type="dxa"/>
-              <w:right w:w="150" w:type="dxa"/>
-            </w:tcMar>
-            <w:hideMark/>
-          </w:tcPr>
-          <w:p>
-            <w:pPr>
-              <w:rPr>
-                <w:b/>
-                <w:bCs/>
-              </w:rPr>
-            </w:pPr>
-            <w:r>
-              <w:rPr>
-                <w:b/>
-                <w:bCs/>
-              </w:rPr>
-              <w:t>Camada</w:t>
-            </w:r>
-          </w:p>
-        </w:tc>
-        <w:tc>
-          <w:tcPr>
-            <w:tcW w:w="0" w:type="auto"/>
-            <w:noWrap/>
-            <w:tcMar>
-              <w:top w:w="90" w:type="dxa"/>
-              <w:left w:w="150" w:type="dxa"/>
-              <w:bottom w:w="90" w:type="dxa"/>
-              <w:right w:w="150" w:type="dxa"/>
-            </w:tcMar>
-            <w:hideMark/>
-          </w:tcPr>
-          <w:p>
-            <w:pPr>
-              <w:rPr>
-                <w:b/>
-                <w:bCs/>
-              </w:rPr>
-            </w:pPr>
-            <w:r>
-              <w:rPr>
-                <w:b/>
-                <w:bCs/>
-              </w:rPr>
-              <w:t>Status</w:t>
-            </w:r>
-          </w:p>
-        </w:tc>
-      </w:tr>
-      <w:tr>
-        <w:trPr>
-          <w:tblCellSpacing w:w="15" w:type="dxa"/>
-        </w:trPr>
-        <w:tc>
-          <w:tcPr>
-            <w:tcW w:w="0" w:type="auto"/>
-            <w:shd w:val="clear" w:color="auto" w:fill="282C34"/>
-            <w:tcMar>
-              <w:top w:w="90" w:type="dxa"/>
-              <w:left w:w="150" w:type="dxa"/>
-              <w:bottom w:w="90" w:type="dxa"/>
-              <w:right w:w="150" w:type="dxa"/>
-            </w:tcMar>
-            <w:hideMark/>
-          </w:tcPr>
-          <w:p>
-            <w:r>
-              <w:t>Faturamento, despesa, lucro (fat − CMV − opex), AR, AP, fluxo de caixa</w:t>
-            </w:r>
-          </w:p>
-        </w:tc>
-        <w:tc>
-          <w:tcPr>
-            <w:tcW w:w="0" w:type="auto"/>
-            <w:shd w:val="clear" w:color="auto" w:fill="282C34"/>
-            <w:tcMar>
-              <w:top w:w="90" w:type="dxa"/>
-              <w:left w:w="150" w:type="dxa"/>
-              <w:bottom w:w="90" w:type="dxa"/>
-              <w:right w:w="150" w:type="dxa"/>
-            </w:tcMar>
-            <w:hideMark/>
-          </w:tcPr>
-          <w:p>
-            <w:r>
-              <w:t>Feito</w:t>
-            </w:r>
-          </w:p>
-        </w:tc>
-      </w:tr>
-      <w:tr>
-        <w:trPr>
-          <w:tblCellSpacing w:w="15" w:type="dxa"/>
-        </w:trPr>
-        <w:tc>
-          <w:tcPr>
-            <w:tcW w:w="0" w:type="auto"/>
-            <w:shd w:val="clear" w:color="auto" w:fill="282C34"/>
-            <w:tcMar>
-              <w:top w:w="90" w:type="dxa"/>
-              <w:left w:w="150" w:type="dxa"/>
-              <w:bottom w:w="90" w:type="dxa"/>
-              <w:right w:w="150" w:type="dxa"/>
-            </w:tcMar>
-            <w:hideMark/>
-          </w:tcPr>
-          <w:p>
-            <w:r>
-              <w:t>Comparar períodos</w:t>
-            </w:r>
-          </w:p>
-        </w:tc>
-        <w:tc>
-          <w:tcPr>
-            <w:tcW w:w="0" w:type="auto"/>
-            <w:shd w:val="clear" w:color="auto" w:fill="282C34"/>
-            <w:tcMar>
-              <w:top w:w="90" w:type="dxa"/>
-              <w:left w:w="150" w:type="dxa"/>
-              <w:bottom w:w="90" w:type="dxa"/>
-              <w:right w:w="150" w:type="dxa"/>
-            </w:tcMar>
-            <w:hideMark/>
-          </w:tcPr>
-          <w:p>
-            <w:r>
-              <w:t>Feito</w:t>
-            </w:r>
-          </w:p>
-        </w:tc>
-      </w:tr>
-      <w:tr>
-        <w:trPr>
-          <w:tblCellSpacing w:w="15" w:type="dxa"/>
-        </w:trPr>
-        <w:tc>
-          <w:tcPr>
-            <w:tcW w:w="0" w:type="auto"/>
-            <w:shd w:val="clear" w:color="auto" w:fill="282C34"/>
-            <w:tcMar>
-              <w:top w:w="90" w:type="dxa"/>
-              <w:left w:w="150" w:type="dxa"/>
-              <w:bottom w:w="90" w:type="dxa"/>
-              <w:right w:w="150" w:type="dxa"/>
-            </w:tcMar>
-            <w:hideMark/>
-          </w:tcPr>
-          <w:p>
-            <w:r>
-              <w:t>“Por que o lucro caiu?” (explicar_variacao_lucro)</w:t>
-            </w:r>
-          </w:p>
-        </w:tc>
-        <w:tc>
-          <w:tcPr>
-            <w:tcW w:w="0" w:type="auto"/>
-            <w:shd w:val="clear" w:color="auto" w:fill="282C34"/>
-            <w:tcMar>
-              <w:top w:w="90" w:type="dxa"/>
-              <w:left w:w="150" w:type="dxa"/>
-              <w:bottom w:w="90" w:type="dxa"/>
-              <w:right w:w="150" w:type="dxa"/>
-            </w:tcMar>
-            <w:hideMark/>
-          </w:tcPr>
-          <w:p>
-            <w:r>
-              <w:t>Feito</w:t>
-            </w:r>
-          </w:p>
-        </w:tc>
-      </w:tr>
-      <w:tr>
-        <w:trPr>
-          <w:tblCellSpacing w:w="15" w:type="dxa"/>
-        </w:trPr>
-        <w:tc>
-          <w:tcPr>
-            <w:tcW w:w="0" w:type="auto"/>
-            <w:shd w:val="clear" w:color="auto" w:fill="282C34"/>
-            <w:tcMar>
-              <w:top w:w="90" w:type="dxa"/>
-              <w:left w:w="150" w:type="dxa"/>
-              <w:bottom w:w="90" w:type="dxa"/>
-              <w:right w:w="150" w:type="dxa"/>
-            </w:tcMar>
-            <w:hideMark/>
-          </w:tcPr>
-          <w:p>
-            <w:r>
-              <w:t>“E se” despesa e “e se” CMV</w:t>
-            </w:r>
-          </w:p>
-        </w:tc>
-        <w:tc>
-          <w:tcPr>
-            <w:tcW w:w="0" w:type="auto"/>
-            <w:shd w:val="clear" w:color="auto" w:fill="282C34"/>
-            <w:tcMar>
-              <w:top w:w="90" w:type="dxa"/>
-              <w:left w:w="150" w:type="dxa"/>
-              <w:bottom w:w="90" w:type="dxa"/>
-              <w:right w:w="150" w:type="dxa"/>
-            </w:tcMar>
-            <w:hideMark/>
-          </w:tcPr>
-          <w:p>
-            <w:r>
-              <w:t>Feito</w:t>
-            </w:r>
-          </w:p>
-        </w:tc>
-      </w:tr>
-      <w:tr>
-        <w:trPr>
-          <w:tblCellSpacing w:w="15" w:type="dxa"/>
-        </w:trPr>
-        <w:tc>
-          <w:tcPr>
-            <w:tcW w:w="0" w:type="auto"/>
-            <w:shd w:val="clear" w:color="auto" w:fill="282C34"/>
-            <w:tcMar>
-              <w:top w:w="90" w:type="dxa"/>
-              <w:left w:w="150" w:type="dxa"/>
-              <w:bottom w:w="90" w:type="dxa"/>
-              <w:right w:w="150" w:type="dxa"/>
-            </w:tcMar>
-            <w:hideMark/>
-          </w:tcPr>
-          <w:p>
-            <w:r>
-              <w:t>Glossário (CMV, competência vs caixa, etc.)</w:t>
-            </w:r>
-          </w:p>
-        </w:tc>
-        <w:tc>
-          <w:tcPr>
-            <w:tcW w:w="0" w:type="auto"/>
-            <w:shd w:val="clear" w:color="auto" w:fill="282C34"/>
-            <w:tcMar>
-              <w:top w:w="90" w:type="dxa"/>
-              <w:left w:w="150" w:type="dxa"/>
-              <w:bottom w:w="90" w:type="dxa"/>
-              <w:right w:w="150" w:type="dxa"/>
-            </w:tcMar>
-            <w:hideMark/>
-          </w:tcPr>
-          <w:p>
-            <w:r>
-              <w:t>Feito</w:t>
-            </w:r>
-          </w:p>
-        </w:tc>
-      </w:tr>
-      <w:tr>
-        <w:trPr>
-          <w:tblCellSpacing w:w="15" w:type="dxa"/>
-        </w:trPr>
-        <w:tc>
-          <w:tcPr>
-            <w:tcW w:w="0" w:type="auto"/>
-            <w:shd w:val="clear" w:color="auto" w:fill="282C34"/>
-            <w:tcMar>
-              <w:top w:w="90" w:type="dxa"/>
-              <w:left w:w="150" w:type="dxa"/>
-              <w:bottom w:w="90" w:type="dxa"/>
-              <w:right w:w="150" w:type="dxa"/>
-            </w:tcMar>
-            <w:hideMark/>
-          </w:tcPr>
-          <w:p>
-            <w:r>
-              <w:t>Sugestões de onboarding</w:t>
-            </w:r>
-          </w:p>
-        </w:tc>
-        <w:tc>
-          <w:tcPr>
-            <w:tcW w:w="0" w:type="auto"/>
-            <w:shd w:val="clear" w:color="auto" w:fill="282C34"/>
-            <w:tcMar>
-              <w:top w:w="90" w:type="dxa"/>
-              <w:left w:w="150" w:type="dxa"/>
-              <w:bottom w:w="90" w:type="dxa"/>
-              <w:right w:w="150" w:type="dxa"/>
-            </w:tcMar>
-            <w:hideMark/>
-          </w:tcPr>
-          <w:p>
-            <w:r>
-              <w:t>Feito</w:t>
-            </w:r>
-          </w:p>
-        </w:tc>
-      </w:tr>
-    </w:tbl>
-    <w:p>
-      <w:r>
-        <w:t>Arquitetura que vale para o Dashboard também: o backend calcula; o frontend só desenha; a LLM não entra nos gráficos.</w:t>
-      </w:r>
-    </w:p>
-    <w:p>
-      <w:r>
-        <w:t>1. Dashboard — maior buraco do MVP (prioridade)</w:t>
-      </w:r>
-    </w:p>
-    <w:p>
-      <w:r>
-        <w:t>2. Copiloto — o que ainda é casca (não é indicador novo)</w:t>
-      </w:r>
-    </w:p>
-    <w:p>
-      <w:r>
-        <w:t>Útil na demo, mas não é o próximo bloco grande:</w:t>
-      </w:r>
-    </w:p>
-    <w:tbl>
-      <w:tblPr>
-        <w:tblW w:w="0" w:type="auto"/>
-        <w:tblCellSpacing w:w="15" w:type="dxa"/>
-        <w:shd w:val="clear" w:color="auto" w:fill="282C34"/>
-        <w:tblCellMar>
-          <w:top w:w="15" w:type="dxa"/>
-          <w:left w:w="15" w:type="dxa"/>
-          <w:bottom w:w="15" w:type="dxa"/>
-          <w:right w:w="15" w:type="dxa"/>
-        </w:tblCellMar>
-        <w:tblLook w:val="04A0" w:firstRow="1" w:lastRow="0" w:firstColumn="1" w:lastColumn="0" w:noHBand="0" w:noVBand="1"/>
-      </w:tblPr>
-      <w:tblGrid>
-        <w:gridCol w:w="1820"/>
-        <w:gridCol w:w="3687"/>
-        <w:gridCol w:w="2997"/>
-      </w:tblGrid>
-      <w:tr>
-        <w:trPr>
-          <w:tblHeader/>
-          <w:tblCellSpacing w:w="15" w:type="dxa"/>
-        </w:trPr>
-        <w:tc>
-          <w:tcPr>
-            <w:tcW w:w="0" w:type="auto"/>
-            <w:noWrap/>
-            <w:tcMar>
-              <w:top w:w="90" w:type="dxa"/>
-              <w:left w:w="150" w:type="dxa"/>
-              <w:bottom w:w="90" w:type="dxa"/>
-              <w:right w:w="150" w:type="dxa"/>
-            </w:tcMar>
-            <w:hideMark/>
-          </w:tcPr>
-          <w:p>
-            <w:pPr>
-              <w:rPr>
-                <w:b/>
-                <w:bCs/>
-              </w:rPr>
-            </w:pPr>
-            <w:r>
-              <w:rPr>
-                <w:b/>
-                <w:bCs/>
-              </w:rPr>
-              <w:t>Item</w:t>
-            </w:r>
-          </w:p>
-        </w:tc>
-        <w:tc>
-          <w:tcPr>
-            <w:tcW w:w="0" w:type="auto"/>
-            <w:noWrap/>
-            <w:tcMar>
-              <w:top w:w="90" w:type="dxa"/>
-              <w:left w:w="150" w:type="dxa"/>
-              <w:bottom w:w="90" w:type="dxa"/>
-              <w:right w:w="150" w:type="dxa"/>
-            </w:tcMar>
-            <w:hideMark/>
-          </w:tcPr>
-          <w:p>
-            <w:pPr>
-              <w:rPr>
-                <w:b/>
-                <w:bCs/>
-              </w:rPr>
-            </w:pPr>
-            <w:r>
-              <w:rPr>
-                <w:b/>
-                <w:bCs/>
-              </w:rPr>
-              <w:t>Situação</w:t>
-            </w:r>
-          </w:p>
-        </w:tc>
-        <w:tc>
-          <w:tcPr>
-            <w:tcW w:w="0" w:type="auto"/>
-            <w:noWrap/>
-            <w:tcMar>
-              <w:top w:w="90" w:type="dxa"/>
-              <w:left w:w="150" w:type="dxa"/>
-              <w:bottom w:w="90" w:type="dxa"/>
-              <w:right w:w="150" w:type="dxa"/>
-            </w:tcMar>
-            <w:hideMark/>
-          </w:tcPr>
-          <w:p>
-            <w:pPr>
-              <w:rPr>
-                <w:b/>
-                <w:bCs/>
-              </w:rPr>
-            </w:pPr>
-            <w:r>
-              <w:rPr>
-                <w:b/>
-                <w:bCs/>
-              </w:rPr>
-              <w:t>MVP?</w:t>
-            </w:r>
-          </w:p>
-        </w:tc>
-      </w:tr>
-      <w:tr>
-        <w:trPr>
-          <w:tblCellSpacing w:w="15" w:type="dxa"/>
-        </w:trPr>
-        <w:tc>
-          <w:tcPr>
-            <w:tcW w:w="0" w:type="auto"/>
-            <w:shd w:val="clear" w:color="auto" w:fill="282C34"/>
-            <w:tcMar>
-              <w:top w:w="90" w:type="dxa"/>
-              <w:left w:w="150" w:type="dxa"/>
-              <w:bottom w:w="90" w:type="dxa"/>
-              <w:right w:w="150" w:type="dxa"/>
-            </w:tcMar>
-            <w:hideMark/>
-          </w:tcPr>
-          <w:p>
-            <w:r>
-              <w:t>Histórico de conversas</w:t>
-            </w:r>
-          </w:p>
-        </w:tc>
-        <w:tc>
-          <w:tcPr>
-            <w:tcW w:w="0" w:type="auto"/>
-            <w:shd w:val="clear" w:color="auto" w:fill="282C34"/>
-            <w:tcMar>
-              <w:top w:w="90" w:type="dxa"/>
-              <w:left w:w="150" w:type="dxa"/>
-              <w:bottom w:w="90" w:type="dxa"/>
-              <w:right w:w="150" w:type="dxa"/>
-            </w:tcMar>
-            <w:hideMark/>
-          </w:tcPr>
-          <w:p>
-            <w:r>
-              <w:t>Sidebar vazia; .cursorrules manda não persistir sem discutir</w:t>
-            </w:r>
-          </w:p>
-        </w:tc>
-        <w:tc>
-          <w:tcPr>
-            <w:tcW w:w="0" w:type="auto"/>
-            <w:shd w:val="clear" w:color="auto" w:fill="282C34"/>
-            <w:tcMar>
-              <w:top w:w="90" w:type="dxa"/>
-              <w:left w:w="150" w:type="dxa"/>
-              <w:bottom w:w="90" w:type="dxa"/>
-              <w:right w:w="150" w:type="dxa"/>
-            </w:tcMar>
-            <w:hideMark/>
-          </w:tcPr>
-          <w:p>
-            <w:r>
-              <w:t>Fora, ou só “Nova conversa” limpando a tela</w:t>
-            </w:r>
-          </w:p>
-        </w:tc>
-      </w:tr>
-      <w:tr>
-        <w:trPr>
-          <w:tblCellSpacing w:w="15" w:type="dxa"/>
-        </w:trPr>
-        <w:tc>
-          <w:tcPr>
-            <w:tcW w:w="0" w:type="auto"/>
-            <w:shd w:val="clear" w:color="auto" w:fill="282C34"/>
-            <w:tcMar>
-              <w:top w:w="90" w:type="dxa"/>
-              <w:left w:w="150" w:type="dxa"/>
-              <w:bottom w:w="90" w:type="dxa"/>
-              <w:right w:w="150" w:type="dxa"/>
-            </w:tcMar>
-            <w:hideMark/>
-          </w:tcPr>
-          <w:p>
-            <w:r>
-              <w:t>Comparar Simulações</w:t>
-            </w:r>
-          </w:p>
-        </w:tc>
-        <w:tc>
-          <w:tcPr>
-            <w:tcW w:w="0" w:type="auto"/>
-            <w:shd w:val="clear" w:color="auto" w:fill="282C34"/>
-            <w:tcMar>
-              <w:top w:w="90" w:type="dxa"/>
-              <w:left w:w="150" w:type="dxa"/>
-              <w:bottom w:w="90" w:type="dxa"/>
-              <w:right w:w="150" w:type="dxa"/>
-            </w:tcMar>
-            <w:hideMark/>
-          </w:tcPr>
-          <w:p>
-            <w:r>
-              <w:t>Botão morto</w:t>
-            </w:r>
-          </w:p>
-        </w:tc>
-        <w:tc>
-          <w:tcPr>
-            <w:tcW w:w="0" w:type="auto"/>
-            <w:shd w:val="clear" w:color="auto" w:fill="282C34"/>
-            <w:tcMar>
-              <w:top w:w="90" w:type="dxa"/>
-              <w:left w:w="150" w:type="dxa"/>
-              <w:bottom w:w="90" w:type="dxa"/>
-              <w:right w:w="150" w:type="dxa"/>
-            </w:tcMar>
-            <w:hideMark/>
-          </w:tcPr>
-          <w:p>
-            <w:r>
-              <w:t>Fora (as sims já existem uma a uma no chat)</w:t>
-            </w:r>
-          </w:p>
-        </w:tc>
-      </w:tr>
-      <w:tr>
-        <w:trPr>
-          <w:tblCellSpacing w:w="15" w:type="dxa"/>
-        </w:trPr>
-        <w:tc>
-          <w:tcPr>
-            <w:tcW w:w="0" w:type="auto"/>
-            <w:shd w:val="clear" w:color="auto" w:fill="282C34"/>
-            <w:tcMar>
-              <w:top w:w="90" w:type="dxa"/>
-              <w:left w:w="150" w:type="dxa"/>
-              <w:bottom w:w="90" w:type="dxa"/>
-              <w:right w:w="150" w:type="dxa"/>
-            </w:tcMar>
-            <w:hideMark/>
-          </w:tcPr>
-          <w:p>
-            <w:r>
-              <w:t>Explorar</w:t>
-            </w:r>
-          </w:p>
-        </w:tc>
-        <w:tc>
-          <w:tcPr>
-            <w:tcW w:w="0" w:type="auto"/>
-            <w:shd w:val="clear" w:color="auto" w:fill="282C34"/>
-            <w:tcMar>
-              <w:top w:w="90" w:type="dxa"/>
-              <w:left w:w="150" w:type="dxa"/>
-              <w:bottom w:w="90" w:type="dxa"/>
-              <w:right w:w="150" w:type="dxa"/>
-            </w:tcMar>
-            <w:hideMark/>
-          </w:tcPr>
-          <w:p>
-            <w:r>
-              <w:t>Botão morto</w:t>
-            </w:r>
-          </w:p>
-        </w:tc>
-        <w:tc>
-          <w:tcPr>
-            <w:tcW w:w="0" w:type="auto"/>
-            <w:shd w:val="clear" w:color="auto" w:fill="282C34"/>
-            <w:tcMar>
-              <w:top w:w="90" w:type="dxa"/>
-              <w:left w:w="150" w:type="dxa"/>
-              <w:bottom w:w="90" w:type="dxa"/>
-              <w:right w:w="150" w:type="dxa"/>
-            </w:tcMar>
-            <w:hideMark/>
-          </w:tcPr>
-          <w:p>
-            <w:r>
-              <w:t>Fora (já tem “exemplos de perguntas”)</w:t>
-            </w:r>
-          </w:p>
-        </w:tc>
-      </w:tr>
-      <w:tr>
-        <w:trPr>
-          <w:tblCellSpacing w:w="15" w:type="dxa"/>
-        </w:trPr>
-        <w:tc>
-          <w:tcPr>
-            <w:tcW w:w="0" w:type="auto"/>
-            <w:shd w:val="clear" w:color="auto" w:fill="282C34"/>
-            <w:tcMar>
-              <w:top w:w="90" w:type="dxa"/>
-              <w:left w:w="150" w:type="dxa"/>
-              <w:bottom w:w="90" w:type="dxa"/>
-              <w:right w:w="150" w:type="dxa"/>
-            </w:tcMar>
-            <w:hideMark/>
-          </w:tcPr>
-          <w:p>
-            <w:r>
-              <w:t>Gerar Relatório</w:t>
-            </w:r>
-          </w:p>
-        </w:tc>
-        <w:tc>
-          <w:tcPr>
-            <w:tcW w:w="0" w:type="auto"/>
-            <w:shd w:val="clear" w:color="auto" w:fill="282C34"/>
-            <w:tcMar>
-              <w:top w:w="90" w:type="dxa"/>
-              <w:left w:w="150" w:type="dxa"/>
-              <w:bottom w:w="90" w:type="dxa"/>
-              <w:right w:w="150" w:type="dxa"/>
-            </w:tcMar>
-            <w:hideMark/>
-          </w:tcPr>
-          <w:p>
-            <w:r>
-              <w:t>Botão em quase toda resposta, não gera nada</w:t>
-            </w:r>
-          </w:p>
-        </w:tc>
-        <w:tc>
-          <w:tcPr>
-            <w:tcW w:w="0" w:type="auto"/>
-            <w:shd w:val="clear" w:color="auto" w:fill="282C34"/>
-            <w:tcMar>
-              <w:top w:w="90" w:type="dxa"/>
-              <w:left w:w="150" w:type="dxa"/>
-              <w:bottom w:w="90" w:type="dxa"/>
-              <w:right w:w="150" w:type="dxa"/>
-            </w:tcMar>
-            <w:hideMark/>
-          </w:tcPr>
-          <w:p>
-            <w:r>
-              <w:t>Esconder no MVP</w:t>
-            </w:r>
-          </w:p>
-        </w:tc>
-      </w:tr>
-      <w:tr>
-        <w:trPr>
-          <w:tblCellSpacing w:w="15" w:type="dxa"/>
-        </w:trPr>
-        <w:tc>
-          <w:tcPr>
-            <w:tcW w:w="0" w:type="auto"/>
-            <w:shd w:val="clear" w:color="auto" w:fill="282C34"/>
-            <w:tcMar>
-              <w:top w:w="90" w:type="dxa"/>
-              <w:left w:w="150" w:type="dxa"/>
-              <w:bottom w:w="90" w:type="dxa"/>
-              <w:right w:w="150" w:type="dxa"/>
-            </w:tcMar>
-            <w:hideMark/>
-          </w:tcPr>
-          <w:p>
-            <w:r>
-              <w:lastRenderedPageBreak/>
-              <w:t>Análise / Recomendações</w:t>
-            </w:r>
-          </w:p>
-        </w:tc>
-        <w:tc>
-          <w:tcPr>
-            <w:tcW w:w="0" w:type="auto"/>
-            <w:shd w:val="clear" w:color="auto" w:fill="282C34"/>
-            <w:tcMar>
-              <w:top w:w="90" w:type="dxa"/>
-              <w:left w:w="150" w:type="dxa"/>
-              <w:bottom w:w="90" w:type="dxa"/>
-              <w:right w:w="150" w:type="dxa"/>
-            </w:tcMar>
-            <w:hideMark/>
-          </w:tcPr>
-          <w:p>
-            <w:r>
-              <w:t>Muitas vezes vazios</w:t>
-            </w:r>
-          </w:p>
-        </w:tc>
-        <w:tc>
-          <w:tcPr>
-            <w:tcW w:w="0" w:type="auto"/>
-            <w:shd w:val="clear" w:color="auto" w:fill="282C34"/>
-            <w:tcMar>
-              <w:top w:w="90" w:type="dxa"/>
-              <w:left w:w="150" w:type="dxa"/>
-              <w:bottom w:w="90" w:type="dxa"/>
-              <w:right w:w="150" w:type="dxa"/>
-            </w:tcMar>
-            <w:hideMark/>
-          </w:tcPr>
-          <w:p>
-            <w:r>
-              <w:t>Esconder quando vazio (já fazem isso em conceito/sim)</w:t>
-            </w:r>
-          </w:p>
-        </w:tc>
-      </w:tr>
-      <w:tr>
-        <w:trPr>
-          <w:tblCellSpacing w:w="15" w:type="dxa"/>
-        </w:trPr>
-        <w:tc>
-          <w:tcPr>
-            <w:tcW w:w="0" w:type="auto"/>
-            <w:shd w:val="clear" w:color="auto" w:fill="282C34"/>
-            <w:tcMar>
-              <w:top w:w="90" w:type="dxa"/>
-              <w:left w:w="150" w:type="dxa"/>
-              <w:bottom w:w="90" w:type="dxa"/>
-              <w:right w:w="150" w:type="dxa"/>
-            </w:tcMar>
-            <w:hideMark/>
-          </w:tcPr>
-          <w:p>
-            <w:r>
-              <w:t>“E se o faturamento subir X%”</w:t>
-            </w:r>
-          </w:p>
-        </w:tc>
-        <w:tc>
-          <w:tcPr>
-            <w:tcW w:w="0" w:type="auto"/>
-            <w:shd w:val="clear" w:color="auto" w:fill="282C34"/>
-            <w:tcMar>
-              <w:top w:w="90" w:type="dxa"/>
-              <w:left w:w="150" w:type="dxa"/>
-              <w:bottom w:w="90" w:type="dxa"/>
-              <w:right w:w="150" w:type="dxa"/>
-            </w:tcMar>
-            <w:hideMark/>
-          </w:tcPr>
-          <w:p>
-            <w:r>
-              <w:t>Não existe; só despesa e CMV</w:t>
-            </w:r>
-          </w:p>
-        </w:tc>
-        <w:tc>
-          <w:tcPr>
-            <w:tcW w:w="0" w:type="auto"/>
-            <w:shd w:val="clear" w:color="auto" w:fill="282C34"/>
-            <w:tcMar>
-              <w:top w:w="90" w:type="dxa"/>
-              <w:left w:w="150" w:type="dxa"/>
-              <w:bottom w:w="90" w:type="dxa"/>
-              <w:right w:w="150" w:type="dxa"/>
-            </w:tcMar>
-            <w:hideMark/>
-          </w:tcPr>
-          <w:p>
-            <w:r>
-              <w:t>Opcional depois do dashboard</w:t>
-            </w:r>
-          </w:p>
-        </w:tc>
-      </w:tr>
-      <w:tr>
-        <w:trPr>
-          <w:tblCellSpacing w:w="15" w:type="dxa"/>
-        </w:trPr>
-        <w:tc>
-          <w:tcPr>
-            <w:tcW w:w="0" w:type="auto"/>
-            <w:shd w:val="clear" w:color="auto" w:fill="282C34"/>
-            <w:tcMar>
-              <w:top w:w="90" w:type="dxa"/>
-              <w:left w:w="150" w:type="dxa"/>
-              <w:bottom w:w="90" w:type="dxa"/>
-              <w:right w:w="150" w:type="dxa"/>
-            </w:tcMar>
-            <w:hideMark/>
-          </w:tcPr>
-          <w:p>
-            <w:r>
-              <w:t>“E se” de logística</w:t>
-            </w:r>
-          </w:p>
-        </w:tc>
-        <w:tc>
-          <w:tcPr>
-            <w:tcW w:w="0" w:type="auto"/>
-            <w:shd w:val="clear" w:color="auto" w:fill="282C34"/>
-            <w:tcMar>
-              <w:top w:w="90" w:type="dxa"/>
-              <w:left w:w="150" w:type="dxa"/>
-              <w:bottom w:w="90" w:type="dxa"/>
-              <w:right w:w="150" w:type="dxa"/>
-            </w:tcMar>
-            <w:hideMark/>
-          </w:tcPr>
-          <w:p>
-            <w:r>
-              <w:t>Proibido agora pelo próprio recorte do MVP</w:t>
-            </w:r>
-          </w:p>
-        </w:tc>
-        <w:tc>
-          <w:tcPr>
-            <w:tcW w:w="0" w:type="auto"/>
-            <w:shd w:val="clear" w:color="auto" w:fill="282C34"/>
-            <w:tcMar>
-              <w:top w:w="90" w:type="dxa"/>
-              <w:left w:w="150" w:type="dxa"/>
-              <w:bottom w:w="90" w:type="dxa"/>
-              <w:right w:w="150" w:type="dxa"/>
-            </w:tcMar>
-            <w:hideMark/>
-          </w:tcPr>
-          <w:p>
-            <w:r>
-              <w:t>Fora</w:t>
-            </w:r>
-          </w:p>
-        </w:tc>
-      </w:tr>
-      <w:tr>
-        <w:trPr>
-          <w:tblCellSpacing w:w="15" w:type="dxa"/>
-        </w:trPr>
-        <w:tc>
-          <w:tcPr>
-            <w:tcW w:w="0" w:type="auto"/>
-            <w:shd w:val="clear" w:color="auto" w:fill="282C34"/>
-            <w:tcMar>
-              <w:top w:w="90" w:type="dxa"/>
-              <w:left w:w="150" w:type="dxa"/>
-              <w:bottom w:w="90" w:type="dxa"/>
-              <w:right w:w="150" w:type="dxa"/>
-            </w:tcMar>
-            <w:hideMark/>
-          </w:tcPr>
-          <w:p>
-            <w:r>
-              <w:t>Mini-chat do dashboard</w:t>
-            </w:r>
-          </w:p>
-        </w:tc>
-        <w:tc>
-          <w:tcPr>
-            <w:tcW w:w="0" w:type="auto"/>
-            <w:shd w:val="clear" w:color="auto" w:fill="282C34"/>
-            <w:tcMar>
-              <w:top w:w="90" w:type="dxa"/>
-              <w:left w:w="150" w:type="dxa"/>
-              <w:bottom w:w="90" w:type="dxa"/>
-              <w:right w:w="150" w:type="dxa"/>
-            </w:tcMar>
-            <w:hideMark/>
-          </w:tcPr>
-          <w:p>
-            <w:r>
-              <w:t>Não dispara o copiloto</w:t>
-            </w:r>
-          </w:p>
-        </w:tc>
-        <w:tc>
-          <w:tcPr>
-            <w:tcW w:w="0" w:type="auto"/>
-            <w:shd w:val="clear" w:color="auto" w:fill="282C34"/>
-            <w:tcMar>
-              <w:top w:w="90" w:type="dxa"/>
-              <w:left w:w="150" w:type="dxa"/>
-              <w:bottom w:w="90" w:type="dxa"/>
-              <w:right w:w="150" w:type="dxa"/>
-            </w:tcMar>
-            <w:hideMark/>
-          </w:tcPr>
-          <w:p>
-            <w:r>
-              <w:t>Sim, junto com o dashboard (redirect ou mesmo enviarPerguntaDuaxis)</w:t>
-            </w:r>
-          </w:p>
-        </w:tc>
-      </w:tr>
-    </w:tbl>
-    <w:p/>
-    <w:p>
-      <w:r>
-        <w:t>3. Fontes de Dados — página de marketing</w:t>
-      </w:r>
-    </w:p>
-    <w:p>
-      <w:r>
-        <w:t>4. Configurações — fora do MVP</w:t>
-      </w:r>
-    </w:p>
-    <w:p/>
-    <w:p>
-      <w:pPr>
-        <w:rPr>
-          <w:b/>
-          <w:bCs/>
-        </w:rPr>
-      </w:pPr>
-      <w:r>
-        <w:rPr>
-          <w:b/>
-          <w:bCs/>
-        </w:rPr>
         <w:t>Prioridade agora (só MVP)</w:t>
       </w:r>
     </w:p>
@@ -990,7 +25,7 @@
         </w:numPr>
       </w:pPr>
       <w:r>
-        <w:t>Definir os 4 KPIs com os mesmos nomes e fórmulas do chat.</w:t>
+        <w:t>Definir OQUE colocaremos em Recomendações.</w:t>
       </w:r>
     </w:p>
     <w:p>
@@ -1001,7 +36,18 @@
         </w:numPr>
       </w:pPr>
       <w:r>
-        <w:t>Combinar o recorte de filtro (período + módulo). Aba Dia: só se definirmos o intervalo; senão, Mês e Ano.</w:t>
+        <w:t xml:space="preserve">Ao lado tem o campo de “histórico” fazer a conversa ir </w:t>
+      </w:r>
+      <w:proofErr w:type="gramStart"/>
+      <w:r>
+        <w:t>pra</w:t>
+      </w:r>
+      <w:proofErr w:type="gramEnd"/>
+      <w:r>
+        <w:t xml:space="preserve"> l</w:t>
+      </w:r>
+      <w:r>
+        <w:t>á</w:t>
       </w:r>
     </w:p>
     <w:p>
@@ -1012,7 +58,7 @@
         </w:numPr>
       </w:pPr>
       <w:r>
-        <w:t>Endpoint no FastAPI reusando calcular_* / comparar_* / logística.</w:t>
+        <w:t>Bateria estruturada de testes da IA</w:t>
       </w:r>
     </w:p>
     <w:p>
@@ -1023,7 +69,7 @@
         </w:numPr>
       </w:pPr>
       <w:r>
-        <w:t>Testar o JSON contra os CSVs (igual junho/2026 no chat).</w:t>
+        <w:t>Mecanismos melhores de confiabilidade</w:t>
       </w:r>
     </w:p>
     <w:p>
@@ -1034,7 +80,7 @@
         </w:numPr>
       </w:pPr>
       <w:r>
-        <w:t>Ligar index.html (cards + 2–3 gráficos).</w:t>
+        <w:t>Segundo ML (fluxo de caixa do próximo mês)</w:t>
       </w:r>
     </w:p>
     <w:p>
@@ -1045,7 +91,10 @@
         </w:numPr>
       </w:pPr>
       <w:r>
-        <w:t>Filtro global de verdade.</w:t>
+        <w:t>Testes estruturados da IA</w:t>
+      </w:r>
+      <w:r>
+        <w:t>: montar uma bateria de perguntas</w:t>
       </w:r>
     </w:p>
     <w:p>
@@ -1056,7 +105,7 @@
         </w:numPr>
       </w:pPr>
       <w:r>
-        <w:t>Camada de Contexto/conversa</w:t>
+        <w:t>Criar mecanismos melhores de confiabilidade</w:t>
       </w:r>
     </w:p>
     <w:p>
@@ -1066,245 +115,128 @@
           <w:numId w:val="4"/>
         </w:numPr>
       </w:pPr>
-      <w:r>
-        <w:t>Encaminhar o mini-chat do dashboard para o copiloto.</w:t>
+      <w:proofErr w:type="spellStart"/>
+      <w:r>
+        <w:t>Deploy</w:t>
+      </w:r>
+      <w:proofErr w:type="spellEnd"/>
+      <w:r>
+        <w:t xml:space="preserve"> </w:t>
+      </w:r>
+    </w:p>
+    <w:p/>
+    <w:p/>
+    <w:p/>
+    <w:p/>
+    <w:p/>
+    <w:p/>
+    <w:p/>
+    <w:p/>
+    <w:p/>
+    <w:p/>
+    <w:p/>
+    <w:p/>
+    <w:p/>
+    <w:p/>
+    <w:p/>
+    <w:p/>
+    <w:p/>
+    <w:p/>
+    <w:p/>
+    <w:p/>
+    <w:p/>
+    <w:p/>
+    <w:p>
+      <w:r>
+        <w:lastRenderedPageBreak/>
+        <w:t>USUÁRIO</w:t>
       </w:r>
     </w:p>
     <w:p>
-      <w:pPr>
-        <w:numPr>
-          <w:ilvl w:val="0"/>
-          <w:numId w:val="4"/>
-        </w:numPr>
-      </w:pPr>
-      <w:r>
-        <w:t>Definir OQUE colocaremos em Recomendações.</w:t>
+      <w:r>
+        <w:t>"Estou com pouco estoque da jaqueta preta.</w:t>
       </w:r>
     </w:p>
     <w:p>
-      <w:pPr>
-        <w:numPr>
-          <w:ilvl w:val="0"/>
-          <w:numId w:val="4"/>
-        </w:numPr>
-      </w:pPr>
-      <w:r>
-        <w:t>Gerar o relatório de cada pergunta feita se o usuário quiser</w:t>
+      <w:r>
+        <w:t>Quanto devo comprar?"</w:t>
       </w:r>
     </w:p>
     <w:p>
-      <w:pPr>
-        <w:numPr>
-          <w:ilvl w:val="0"/>
-          <w:numId w:val="4"/>
-        </w:numPr>
-      </w:pPr>
-      <w:r>
-        <w:t>Ao lado tem o campo de “histórico” fazer a conversa ir pra l</w:t>
-      </w:r>
-      <w:r>
-        <w:t>á</w:t>
+      <w:r>
+        <w:t xml:space="preserve">        ↓</w:t>
       </w:r>
     </w:p>
     <w:p>
-      <w:pPr>
-        <w:numPr>
-          <w:ilvl w:val="0"/>
-          <w:numId w:val="4"/>
-        </w:numPr>
-      </w:pPr>
-      <w:r>
-        <w:t>Bateria estruturada de testes da IA</w:t>
+      <w:r>
+        <w:t>LLM / IA</w:t>
       </w:r>
     </w:p>
     <w:p>
-      <w:pPr>
-        <w:numPr>
-          <w:ilvl w:val="0"/>
-          <w:numId w:val="4"/>
-        </w:numPr>
-      </w:pPr>
-      <w:r>
-        <w:t>Mecanismos melhores de confiabilidade</w:t>
+      <w:r>
+        <w:t>entende:</w:t>
       </w:r>
     </w:p>
     <w:p>
-      <w:pPr>
-        <w:numPr>
-          <w:ilvl w:val="0"/>
-          <w:numId w:val="4"/>
-        </w:numPr>
-      </w:pPr>
-      <w:r>
-        <w:lastRenderedPageBreak/>
-        <w:t>Segundo ML (fluxo de caixa do próximo mês)</w:t>
-      </w:r>
-    </w:p>
-    <w:p/>
-    <w:p/>
-    <w:p>
-      <w:r>
-        <w:t>Etapa 8 -</w:t>
-      </w:r>
-      <w:r>
-        <w:t xml:space="preserve"> Criar uma camada de contexto/conversa</w:t>
+      <w:r>
+        <w:t xml:space="preserve">- </w:t>
+      </w:r>
+      <w:proofErr w:type="gramStart"/>
+      <w:r>
+        <w:t>intenção</w:t>
+      </w:r>
+      <w:proofErr w:type="gramEnd"/>
+      <w:r>
+        <w:t xml:space="preserve"> = analisar reposição</w:t>
       </w:r>
     </w:p>
     <w:p>
       <w:r>
-        <w:t xml:space="preserve">Etapa 9 - </w:t>
-      </w:r>
-      <w:r>
-        <w:t>Testes estruturados da IA</w:t>
-      </w:r>
-      <w:r>
-        <w:t>: montar uma bateria de perguntas</w:t>
+        <w:t xml:space="preserve">- </w:t>
+      </w:r>
+      <w:proofErr w:type="gramStart"/>
+      <w:r>
+        <w:t>produto</w:t>
+      </w:r>
+      <w:proofErr w:type="gramEnd"/>
+      <w:r>
+        <w:t xml:space="preserve"> = jaqueta preta</w:t>
       </w:r>
     </w:p>
     <w:p>
       <w:r>
-        <w:t xml:space="preserve">Etapa 10 - </w:t>
-      </w:r>
-      <w:r>
-        <w:t>Criar mecanismos melhores de confiabilidade</w:t>
+        <w:t xml:space="preserve">        ↓</w:t>
       </w:r>
     </w:p>
     <w:p>
       <w:r>
-        <w:t xml:space="preserve">Etapa </w:t>
-      </w:r>
-      <w:r>
-        <w:t>11</w:t>
-      </w:r>
-      <w:r>
-        <w:t xml:space="preserve"> — Só então treinar o segundo ML. Minha candidata continua sendo previsão de fluxo de caixa do próximo mês, porque essa pergunta realmente exige previsão futura.</w:t>
+        <w:t>BACKEND</w:t>
       </w:r>
     </w:p>
     <w:p>
       <w:r>
-        <w:t>Etapa 13 – Relatórios</w:t>
+        <w:t>localiza o produto</w:t>
       </w:r>
     </w:p>
     <w:p>
       <w:r>
-        <w:t xml:space="preserve">Etapa 12 – Deploy </w:t>
-      </w:r>
-    </w:p>
-    <w:p/>
-    <w:p/>
-    <w:p/>
-    <w:p/>
-    <w:p/>
-    <w:p/>
-    <w:p/>
-    <w:p/>
-    <w:p>
-      <w:r>
-        <w:rPr>
-          <w:b/>
-          <w:bCs/>
-        </w:rPr>
-        <w:t>Os produtos com maior quantidade recomendada de reposição:</w:t>
-      </w:r>
-      <w:r>
-        <w:t xml:space="preserve"> São os produtos que mais sai</w:t>
-      </w:r>
-    </w:p>
-    <w:p>
-      <w:r>
-        <w:rPr>
-          <w:highlight w:val="yellow"/>
-        </w:rPr>
-        <w:t>Produto com maior risco de ruptura = produto cuja velocidade de saída é alta em relação ao estoque disponível e ao tempo necessário para receber uma nova compra.</w:t>
-      </w:r>
-    </w:p>
-    <w:p>
-      <w:r>
-        <w:rPr>
-          <w:b/>
-          <w:bCs/>
-        </w:rPr>
-        <w:t>Produtos atrasados:</w:t>
-      </w:r>
-      <w:r>
-        <w:t xml:space="preserve"> resposta aparecendo duas vezes, colocar os de maior atraso, quantidade (unidade de medida), o valor total é tudo ou unitário?</w:t>
-      </w:r>
-    </w:p>
-    <w:p>
-      <w:r>
-        <w:t>Considerando a data pesquisada (dia 28/08) temos tantos itens em estoque.</w:t>
-      </w:r>
-    </w:p>
-    <w:p>
-      <w:r>
-        <w:t>Não é para responder coisas que não são relacionados do sistema</w:t>
-      </w:r>
-    </w:p>
-    <w:p/>
-    <w:p/>
-    <w:p/>
-    <w:p/>
-    <w:p/>
-    <w:p/>
-    <w:p/>
-    <w:p>
-      <w:r>
-        <w:t>USUÁRIO</w:t>
-      </w:r>
-    </w:p>
-    <w:p>
-      <w:r>
-        <w:t>"Estou com pouco estoque da jaqueta preta.</w:t>
-      </w:r>
-    </w:p>
-    <w:p>
-      <w:r>
-        <w:t>Quanto devo comprar?"</w:t>
-      </w:r>
-    </w:p>
-    <w:p>
-      <w:r>
-        <w:t xml:space="preserve">        ↓</w:t>
-      </w:r>
-    </w:p>
-    <w:p>
-      <w:r>
-        <w:t>LLM / IA</w:t>
-      </w:r>
-    </w:p>
-    <w:p>
-      <w:r>
-        <w:t>entende:</w:t>
-      </w:r>
-    </w:p>
-    <w:p>
-      <w:r>
-        <w:t>- intenção = analisar reposição</w:t>
-      </w:r>
-    </w:p>
-    <w:p>
-      <w:r>
-        <w:t>- produto = jaqueta preta</w:t>
-      </w:r>
-    </w:p>
-    <w:p>
-      <w:r>
-        <w:t xml:space="preserve">        ↓</w:t>
-      </w:r>
-    </w:p>
-    <w:p>
-      <w:r>
-        <w:t>BACKEND</w:t>
-      </w:r>
-    </w:p>
-    <w:p>
-      <w:r>
-        <w:t>localiza o produto</w:t>
-      </w:r>
-    </w:p>
-    <w:p>
-      <w:r>
-        <w:t>chama analisar_reposicao()</w:t>
+        <w:t xml:space="preserve">chama </w:t>
+      </w:r>
+      <w:proofErr w:type="spellStart"/>
+      <w:r>
+        <w:t>analisar_</w:t>
+      </w:r>
+      <w:proofErr w:type="gramStart"/>
+      <w:r>
+        <w:t>reposicao</w:t>
+      </w:r>
+      <w:proofErr w:type="spellEnd"/>
+      <w:r>
+        <w:t>(</w:t>
+      </w:r>
+      <w:proofErr w:type="gramEnd"/>
+      <w:r>
+        <w:t>)</w:t>
       </w:r>
     </w:p>
     <w:p>
@@ -3935,6 +2867,7 @@
   <w:style w:type="character" w:default="1" w:styleId="Fontepargpadro">
     <w:name w:val="Default Paragraph Font"/>
     <w:uiPriority w:val="1"/>
+    <w:semiHidden/>
     <w:unhideWhenUsed/>
   </w:style>
   <w:style w:type="table" w:default="1" w:styleId="Tabelanormal">

</xml_diff>